<commit_message>
Remove em and en dashes from briefing and source list
</commit_message>
<xml_diff>
--- a/01-briefing/new-ceo-briefing.docx
+++ b/01-briefing/new-ceo-briefing.docx
@@ -102,7 +102,7 @@
         </w:rPr>
         <w:t xml:space="preserve">[</w:t>
       </w:r>
-      <w:hyperlink w:history="1" r:id="rId7chpvrqggdhcxu5ez5j-z">
+      <w:hyperlink w:history="1" r:id="rId6iga5qyjwgyguc23qv-mw">
         <w:r>
           <w:rPr>
             <w:color w:val="8E1B2C"/>
@@ -121,7 +121,7 @@
         </w:rPr>
         <w:t xml:space="preserve"> · </w:t>
       </w:r>
-      <w:hyperlink w:history="1" r:id="rIdblxtnaee67qng25k_xrm3">
+      <w:hyperlink w:history="1" r:id="rIdc7kpeatfbjixdh0jtui00">
         <w:r>
           <w:rPr>
             <w:color w:val="8E1B2C"/>
@@ -140,7 +140,7 @@
         </w:rPr>
         <w:t xml:space="preserve"> · </w:t>
       </w:r>
-      <w:hyperlink w:history="1" r:id="rId6blm7xux9uyi_ssfivr96">
+      <w:hyperlink w:history="1" r:id="rIdopmaqgylwy1qjwfga7xgd">
         <w:r>
           <w:rPr>
             <w:color w:val="8E1B2C"/>
@@ -170,7 +170,7 @@
         </w:rPr>
         <w:t xml:space="preserve">[</w:t>
       </w:r>
-      <w:hyperlink w:history="1" r:id="rIdeg3ntz9x4oyqozs7juycq">
+      <w:hyperlink w:history="1" r:id="rIdnuj-cbibce1ollua-pr3b">
         <w:r>
           <w:rPr>
             <w:color w:val="8E1B2C"/>
@@ -200,7 +200,7 @@
         </w:rPr>
         <w:t xml:space="preserve">[</w:t>
       </w:r>
-      <w:hyperlink w:history="1" r:id="rIdkp-lqdpbk6o1n66cldtkz">
+      <w:hyperlink w:history="1" r:id="rId8ybch_prrqhb4yl44jhob">
         <w:r>
           <w:rPr>
             <w:color w:val="8E1B2C"/>
@@ -219,7 +219,7 @@
         </w:rPr>
         <w:t xml:space="preserve"> · </w:t>
       </w:r>
-      <w:hyperlink w:history="1" r:id="rId0kynr9jowpn6m4cxmqx0y">
+      <w:hyperlink w:history="1" r:id="rIdhp3cqdkgzbf33kvdgveim">
         <w:r>
           <w:rPr>
             <w:color w:val="8E1B2C"/>
@@ -238,7 +238,7 @@
         </w:rPr>
         <w:t xml:space="preserve"> · </w:t>
       </w:r>
-      <w:hyperlink w:history="1" r:id="rId1fftdi6d_a4frhoqmhtor">
+      <w:hyperlink w:history="1" r:id="rId_equjfexggtj0h83_ksuu">
         <w:r>
           <w:rPr>
             <w:color w:val="8E1B2C"/>
@@ -268,7 +268,7 @@
         </w:rPr>
         <w:t xml:space="preserve">[</w:t>
       </w:r>
-      <w:hyperlink w:history="1" r:id="rIdg1pypvaamtsd4oqhtrvzu">
+      <w:hyperlink w:history="1" r:id="rIdwq_tifikotits_7bk0uia">
         <w:r>
           <w:rPr>
             <w:color w:val="8E1B2C"/>
@@ -287,7 +287,7 @@
         </w:rPr>
         <w:t xml:space="preserve"> · </w:t>
       </w:r>
-      <w:hyperlink w:history="1" r:id="rIdl5noca_krrkutvjlarpsy">
+      <w:hyperlink w:history="1" r:id="rIdvsqevjvyirtyx7-gtufqa">
         <w:r>
           <w:rPr>
             <w:color w:val="8E1B2C"/>
@@ -317,7 +317,7 @@
         </w:rPr>
         <w:t xml:space="preserve">[</w:t>
       </w:r>
-      <w:hyperlink w:history="1" r:id="rIdg11lh1i3fdxezvgklorc9">
+      <w:hyperlink w:history="1" r:id="rIdj9obgxldjvl6ge0f5bu6a">
         <w:r>
           <w:rPr>
             <w:color w:val="8E1B2C"/>
@@ -374,7 +374,7 @@
         </w:rPr>
         <w:t xml:space="preserve">[</w:t>
       </w:r>
-      <w:hyperlink w:history="1" r:id="rId0kmmpy2ooxjf0gybqdfvy">
+      <w:hyperlink w:history="1" r:id="rId5tr3mrehwqv6irni9clja">
         <w:r>
           <w:rPr>
             <w:color w:val="8E1B2C"/>
@@ -404,7 +404,7 @@
         </w:rPr>
         <w:t xml:space="preserve">[</w:t>
       </w:r>
-      <w:hyperlink w:history="1" r:id="rIdvqqfiaqigvnq6zogv6t9l">
+      <w:hyperlink w:history="1" r:id="rIdnk2bk0riv2anope6gvds7">
         <w:r>
           <w:rPr>
             <w:color w:val="8E1B2C"/>
@@ -519,7 +519,7 @@
               </w:rPr>
               <w:t xml:space="preserve">[</w:t>
             </w:r>
-            <w:hyperlink w:history="1" r:id="rIdbbyzqrjym1ta7ooutfqvu">
+            <w:hyperlink w:history="1" r:id="rIdf6ascvmj8tbglion1vz7r">
               <w:r>
                 <w:rPr>
                   <w:color w:val="8E1B2C"/>
@@ -538,7 +538,7 @@
               </w:rPr>
               <w:t xml:space="preserve"> · </w:t>
             </w:r>
-            <w:hyperlink w:history="1" r:id="rIdefl5dxsaiv2pddemopbdq">
+            <w:hyperlink w:history="1" r:id="rId9yhbgyrlfo7lih2eo4q8l">
               <w:r>
                 <w:rPr>
                   <w:color w:val="8E1B2C"/>
@@ -635,7 +635,7 @@
               </w:rPr>
               <w:t xml:space="preserve">[</w:t>
             </w:r>
-            <w:hyperlink w:history="1" r:id="rIdgftemrv6wrl6iouqka24a">
+            <w:hyperlink w:history="1" r:id="rIdedfwbbu6emn77yv9rq1n1">
               <w:r>
                 <w:rPr>
                   <w:color w:val="8E1B2C"/>
@@ -732,7 +732,7 @@
               </w:rPr>
               <w:t xml:space="preserve">[</w:t>
             </w:r>
-            <w:hyperlink w:history="1" r:id="rIdtearkhu7cfobgcsfwyqrl">
+            <w:hyperlink w:history="1" r:id="rIdwcjngshpqwvrqbaqgfgip">
               <w:r>
                 <w:rPr>
                   <w:color w:val="8E1B2C"/>
@@ -829,7 +829,7 @@
               </w:rPr>
               <w:t xml:space="preserve">[</w:t>
             </w:r>
-            <w:hyperlink w:history="1" r:id="rIdwexei_an7rew_tgayeci7">
+            <w:hyperlink w:history="1" r:id="rIdqfzjktv7jyimnzpcdktvh">
               <w:r>
                 <w:rPr>
                   <w:color w:val="8E1B2C"/>
@@ -926,7 +926,7 @@
               </w:rPr>
               <w:t xml:space="preserve">[</w:t>
             </w:r>
-            <w:hyperlink w:history="1" r:id="rId9yqqy_khavswrepvwwhi5">
+            <w:hyperlink w:history="1" r:id="rIdyll6ckimfjrwigzng0n18">
               <w:r>
                 <w:rPr>
                   <w:color w:val="8E1B2C"/>
@@ -1023,7 +1023,7 @@
               </w:rPr>
               <w:t xml:space="preserve">[</w:t>
             </w:r>
-            <w:hyperlink w:history="1" r:id="rIdqatqstiktmt_sgyooqoh4">
+            <w:hyperlink w:history="1" r:id="rIdwji2amxayacjksb05nbdq">
               <w:r>
                 <w:rPr>
                   <w:color w:val="8E1B2C"/>
@@ -1120,7 +1120,7 @@
               </w:rPr>
               <w:t xml:space="preserve">[</w:t>
             </w:r>
-            <w:hyperlink w:history="1" r:id="rIdzi-9hdx2tqfsz8szkasnr">
+            <w:hyperlink w:history="1" r:id="rIdtozri4tnm1cl8-osl2qvk">
               <w:r>
                 <w:rPr>
                   <w:color w:val="8E1B2C"/>
@@ -1186,7 +1186,7 @@
         </w:rPr>
         <w:t xml:space="preserve">[</w:t>
       </w:r>
-      <w:hyperlink w:history="1" r:id="rIdccu6xi2jmnth_it0de50a">
+      <w:hyperlink w:history="1" r:id="rIdogtbpv14bjnsprghzm_bg">
         <w:r>
           <w:rPr>
             <w:color w:val="8E1B2C"/>
@@ -1229,7 +1229,7 @@
         </w:rPr>
         <w:t xml:space="preserve">[</w:t>
       </w:r>
-      <w:hyperlink w:history="1" r:id="rIdj5e9dxbrsogoqsatord9t">
+      <w:hyperlink w:history="1" r:id="rIdkkvuxubjfugwxbn5pvsmh">
         <w:r>
           <w:rPr>
             <w:color w:val="8E1B2C"/>
@@ -1259,7 +1259,7 @@
         </w:rPr>
         <w:t xml:space="preserve">[</w:t>
       </w:r>
-      <w:hyperlink w:history="1" r:id="rIdgcw1y5tqgb9kzgdesyno2">
+      <w:hyperlink w:history="1" r:id="rIdb7jb3n4roa3eemzhx6gtw">
         <w:r>
           <w:rPr>
             <w:color w:val="8E1B2C"/>
@@ -1289,7 +1289,7 @@
         </w:rPr>
         <w:t xml:space="preserve">[</w:t>
       </w:r>
-      <w:hyperlink w:history="1" r:id="rId3dcxfzo9eqc8u98vuic7d">
+      <w:hyperlink w:history="1" r:id="rIdjeyezyxmloarh2yjo9pj3">
         <w:r>
           <w:rPr>
             <w:color w:val="8E1B2C"/>
@@ -1332,7 +1332,7 @@
         </w:rPr>
         <w:t xml:space="preserve">[</w:t>
       </w:r>
-      <w:hyperlink w:history="1" r:id="rId65k5cmniu3-xs3ibfzyqp">
+      <w:hyperlink w:history="1" r:id="rIdkqqrz8iyfbsucw51w5knz">
         <w:r>
           <w:rPr>
             <w:color w:val="8E1B2C"/>
@@ -1375,7 +1375,7 @@
         </w:rPr>
         <w:t xml:space="preserve">[</w:t>
       </w:r>
-      <w:hyperlink w:history="1" r:id="rIdutyqdm1nwimryyedywmnt">
+      <w:hyperlink w:history="1" r:id="rId_asqujyisco-nmjcbphlx">
         <w:r>
           <w:rPr>
             <w:color w:val="8E1B2C"/>
@@ -1405,7 +1405,7 @@
         </w:rPr>
         <w:t xml:space="preserve">[</w:t>
       </w:r>
-      <w:hyperlink w:history="1" r:id="rIdradea8u_jh3vj4gvs_veb">
+      <w:hyperlink w:history="1" r:id="rIdyl9enlr_ghorchqkauuc0">
         <w:r>
           <w:rPr>
             <w:color w:val="8E1B2C"/>
@@ -1456,7 +1456,7 @@
         </w:rPr>
         <w:t xml:space="preserve">[</w:t>
       </w:r>
-      <w:hyperlink w:history="1" r:id="rIdcgcxzihn4q74v89led1mu">
+      <w:hyperlink w:history="1" r:id="rIdk0dyzey5q7mioy4ddy3jw">
         <w:r>
           <w:rPr>
             <w:color w:val="8E1B2C"/>
@@ -1475,7 +1475,7 @@
         </w:rPr>
         <w:t xml:space="preserve"> · </w:t>
       </w:r>
-      <w:hyperlink w:history="1" r:id="rId1ke1xtrwhoczcge-lx2zq">
+      <w:hyperlink w:history="1" r:id="rId7gccf8gtey6ugtj1tcfxv">
         <w:r>
           <w:rPr>
             <w:color w:val="8E1B2C"/>
@@ -1505,7 +1505,7 @@
         </w:rPr>
         <w:t xml:space="preserve">[</w:t>
       </w:r>
-      <w:hyperlink w:history="1" r:id="rIdcmb5hi9mpdtcricxwl256">
+      <w:hyperlink w:history="1" r:id="rIdm_godpmqflsclqx_zqwiv">
         <w:r>
           <w:rPr>
             <w:color w:val="8E1B2C"/>
@@ -1535,7 +1535,7 @@
         </w:rPr>
         <w:t xml:space="preserve">[</w:t>
       </w:r>
-      <w:hyperlink w:history="1" r:id="rIdixjrbfefcsvovjkhyblrq">
+      <w:hyperlink w:history="1" r:id="rIdc5kzi0au1l2u9bdn2xgqy">
         <w:r>
           <w:rPr>
             <w:color w:val="8E1B2C"/>
@@ -1554,7 +1554,7 @@
         </w:rPr>
         <w:t xml:space="preserve"> · </w:t>
       </w:r>
-      <w:hyperlink w:history="1" r:id="rIdniqnmtfpqjfjf5na38ejt">
+      <w:hyperlink w:history="1" r:id="rIdwb6ifovoe-xmjhog5a6gr">
         <w:r>
           <w:rPr>
             <w:color w:val="8E1B2C"/>
@@ -1597,7 +1597,7 @@
         </w:rPr>
         <w:t xml:space="preserve">[</w:t>
       </w:r>
-      <w:hyperlink w:history="1" r:id="rIdazdtde8kzf-yv1yigse_j">
+      <w:hyperlink w:history="1" r:id="rId01vohirh0wysgcmu-p3xh">
         <w:r>
           <w:rPr>
             <w:color w:val="8E1B2C"/>
@@ -1648,7 +1648,7 @@
         </w:rPr>
         <w:t xml:space="preserve">[</w:t>
       </w:r>
-      <w:hyperlink w:history="1" r:id="rIdxmst3pweziooni-fynx9e">
+      <w:hyperlink w:history="1" r:id="rIdcnlsmwkvu8ga1qpg5nabx">
         <w:r>
           <w:rPr>
             <w:color w:val="8E1B2C"/>
@@ -1667,7 +1667,7 @@
         </w:rPr>
         <w:t xml:space="preserve"> · </w:t>
       </w:r>
-      <w:hyperlink w:history="1" r:id="rIdx9dnklpqzt1wgkbwv_6d9">
+      <w:hyperlink w:history="1" r:id="rIdeyu4q07snvkxcd9gkucsq">
         <w:r>
           <w:rPr>
             <w:color w:val="8E1B2C"/>
@@ -1686,7 +1686,7 @@
         </w:rPr>
         <w:t xml:space="preserve"> · </w:t>
       </w:r>
-      <w:hyperlink w:history="1" r:id="rId3piepag0rt6bfs4_bwtni">
+      <w:hyperlink w:history="1" r:id="rIdhiljmmdxxrk7h4jqtfpil">
         <w:r>
           <w:rPr>
             <w:color w:val="8E1B2C"/>
@@ -1706,17 +1706,17 @@
         <w:t xml:space="preserve">]</w:t>
       </w:r>
       <w:r>
-        <w:t xml:space="preserve">; his profile lists Oxford University for 2008–2012 </w:t>
-      </w:r>
-      <w:r>
-        <w:rPr>
-          <w:color w:val="8E1B2C"/>
-          <w:sz w:val="15"/>
-          <w:szCs w:val="15"/>
-        </w:rPr>
-        <w:t xml:space="preserve">[</w:t>
-      </w:r>
-      <w:hyperlink w:history="1" r:id="rIdgvsdicegsz5qdngvse23v">
+        <w:t xml:space="preserve">; his profile lists Oxford University for 2008 to 2012 </w:t>
+      </w:r>
+      <w:r>
+        <w:rPr>
+          <w:color w:val="8E1B2C"/>
+          <w:sz w:val="15"/>
+          <w:szCs w:val="15"/>
+        </w:rPr>
+        <w:t xml:space="preserve">[</w:t>
+      </w:r>
+      <w:hyperlink w:history="1" r:id="rIdc91ovz2mpxy_mcttqqgje">
         <w:r>
           <w:rPr>
             <w:color w:val="8E1B2C"/>
@@ -1756,7 +1756,7 @@
         </w:rPr>
         <w:t xml:space="preserve">[</w:t>
       </w:r>
-      <w:hyperlink w:history="1" r:id="rId9r9n9wnpwxr1mbnpowge2">
+      <w:hyperlink w:history="1" r:id="rIdkyalgrpuc9lxm_sgd2s0g">
         <w:r>
           <w:rPr>
             <w:color w:val="8E1B2C"/>
@@ -1799,7 +1799,7 @@
         </w:rPr>
         <w:t xml:space="preserve">[</w:t>
       </w:r>
-      <w:hyperlink w:history="1" r:id="rId5t3atiedwjpo5sjejglou">
+      <w:hyperlink w:history="1" r:id="rIdcbhhwzrhgq9zfcrzqx2v8">
         <w:r>
           <w:rPr>
             <w:color w:val="8E1B2C"/>
@@ -1818,7 +1818,7 @@
         </w:rPr>
         <w:t xml:space="preserve"> · </w:t>
       </w:r>
-      <w:hyperlink w:history="1" r:id="rId-61qoatveolr5-6tvwxbr">
+      <w:hyperlink w:history="1" r:id="rIdozxwmfoqdujm9lsop2wmi">
         <w:r>
           <w:rPr>
             <w:color w:val="8E1B2C"/>
@@ -1861,7 +1861,7 @@
         </w:rPr>
         <w:t xml:space="preserve">[</w:t>
       </w:r>
-      <w:hyperlink w:history="1" r:id="rId_vdvrjaljxempvao2xinh">
+      <w:hyperlink w:history="1" r:id="rIdxaag_w2wkp0g0ouk-6c6y">
         <w:r>
           <w:rPr>
             <w:color w:val="8E1B2C"/>
@@ -1891,7 +1891,7 @@
         </w:rPr>
         <w:t xml:space="preserve">[</w:t>
       </w:r>
-      <w:hyperlink w:history="1" r:id="rIdyyob8loevaxtkhlplah3v">
+      <w:hyperlink w:history="1" r:id="rIdwayju9txllpddg4mjx55-">
         <w:r>
           <w:rPr>
             <w:color w:val="8E1B2C"/>
@@ -1921,7 +1921,7 @@
         </w:rPr>
         <w:t xml:space="preserve">[</w:t>
       </w:r>
-      <w:hyperlink w:history="1" r:id="rId0nw4ixhqbi1mz5818wrcs">
+      <w:hyperlink w:history="1" r:id="rIdnbclblmsqwsvwnagflb26">
         <w:r>
           <w:rPr>
             <w:color w:val="8E1B2C"/>
@@ -1951,7 +1951,7 @@
         </w:rPr>
         <w:t xml:space="preserve">[</w:t>
       </w:r>
-      <w:hyperlink w:history="1" r:id="rIdvi_oy-_n_8lppeajvuiw3">
+      <w:hyperlink w:history="1" r:id="rIdr5leebyvnpcnec6vxwig9">
         <w:r>
           <w:rPr>
             <w:color w:val="8E1B2C"/>
@@ -2010,7 +2010,7 @@
         </w:rPr>
         <w:t xml:space="preserve">[</w:t>
       </w:r>
-      <w:hyperlink w:history="1" r:id="rIdpldcsv3v8fnns3onyt1ja">
+      <w:hyperlink w:history="1" r:id="rId4cxzaf-5ooqxazceslaba">
         <w:r>
           <w:rPr>
             <w:color w:val="8E1B2C"/>
@@ -2040,7 +2040,7 @@
         </w:rPr>
         <w:t xml:space="preserve">[</w:t>
       </w:r>
-      <w:hyperlink w:history="1" r:id="rIdmibwz2evh7ygmmou49e94">
+      <w:hyperlink w:history="1" r:id="rIdaokhbjbzefqlzgpcvu5j7">
         <w:r>
           <w:rPr>
             <w:color w:val="8E1B2C"/>
@@ -2070,7 +2070,7 @@
         </w:rPr>
         <w:t xml:space="preserve">[</w:t>
       </w:r>
-      <w:hyperlink w:history="1" r:id="rIdj1-ku3pwxctprrhfwjksi">
+      <w:hyperlink w:history="1" r:id="rIdc5jmxgxni595tmlevo6-x">
         <w:r>
           <w:rPr>
             <w:color w:val="8E1B2C"/>
@@ -2113,7 +2113,7 @@
         </w:rPr>
         <w:t xml:space="preserve">[</w:t>
       </w:r>
-      <w:hyperlink w:history="1" r:id="rId1ucwatgfehnusx81wxl2p">
+      <w:hyperlink w:history="1" r:id="rId07werjf1b_ovidujwcueo">
         <w:r>
           <w:rPr>
             <w:color w:val="8E1B2C"/>
@@ -2143,7 +2143,7 @@
         </w:rPr>
         <w:t xml:space="preserve">[</w:t>
       </w:r>
-      <w:hyperlink w:history="1" r:id="rIdiz7poanhdihdtptw7linf">
+      <w:hyperlink w:history="1" r:id="rIdcqlc6jmmc0vlryhkywccu">
         <w:r>
           <w:rPr>
             <w:color w:val="8E1B2C"/>
@@ -2186,7 +2186,7 @@
         </w:rPr>
         <w:t xml:space="preserve">[</w:t>
       </w:r>
-      <w:hyperlink w:history="1" r:id="rIdif8_wrvomyqyb6jmuzydn">
+      <w:hyperlink w:history="1" r:id="rIdh_ydatwoqh5daemkbgnon">
         <w:r>
           <w:rPr>
             <w:color w:val="8E1B2C"/>
@@ -2216,7 +2216,7 @@
         </w:rPr>
         <w:t xml:space="preserve">[</w:t>
       </w:r>
-      <w:hyperlink w:history="1" r:id="rIds2wgwxylzpyrfopp5cqlg">
+      <w:hyperlink w:history="1" r:id="rIdy_fql04omd4cfhi6wdkyo">
         <w:r>
           <w:rPr>
             <w:color w:val="8E1B2C"/>
@@ -2235,7 +2235,7 @@
         </w:rPr>
         <w:t xml:space="preserve"> · </w:t>
       </w:r>
-      <w:hyperlink w:history="1" r:id="rIde3c0wlxhnwiwmrvxhjxia">
+      <w:hyperlink w:history="1" r:id="rIdqd9orahcucluuzyyxop50">
         <w:r>
           <w:rPr>
             <w:color w:val="8E1B2C"/>
@@ -2283,7 +2283,7 @@
         </w:rPr>
         <w:t xml:space="preserve">[</w:t>
       </w:r>
-      <w:hyperlink w:history="1" r:id="rId8y6fmem9jrzk56x8lqv2m">
+      <w:hyperlink w:history="1" r:id="rIdpkgp7o41xql3mkthmia6g">
         <w:r>
           <w:rPr>
             <w:color w:val="8E1B2C"/>
@@ -2313,7 +2313,7 @@
         </w:rPr>
         <w:t xml:space="preserve">[</w:t>
       </w:r>
-      <w:hyperlink w:history="1" r:id="rIdvfwol4xw7qcrcnesvdbfs">
+      <w:hyperlink w:history="1" r:id="rIdm3dhrcwm47k5d6hndfmrx">
         <w:r>
           <w:rPr>
             <w:color w:val="8E1B2C"/>
@@ -2356,7 +2356,7 @@
         </w:rPr>
         <w:t xml:space="preserve">[</w:t>
       </w:r>
-      <w:hyperlink w:history="1" r:id="rIdy1seqsamltqon8ztlxrwa">
+      <w:hyperlink w:history="1" r:id="rIdxebgaghofd22m5sfpnexy">
         <w:r>
           <w:rPr>
             <w:color w:val="8E1B2C"/>
@@ -2386,7 +2386,7 @@
         </w:rPr>
         <w:t xml:space="preserve">[</w:t>
       </w:r>
-      <w:hyperlink w:history="1" r:id="rIdlgsrpphzw6yq6oacnzzlf">
+      <w:hyperlink w:history="1" r:id="rIdl3rrlmtkf4xvtlpb0rcmm">
         <w:r>
           <w:rPr>
             <w:color w:val="8E1B2C"/>
@@ -2416,7 +2416,7 @@
         </w:rPr>
         <w:t xml:space="preserve">[</w:t>
       </w:r>
-      <w:hyperlink w:history="1" r:id="rIdzjdql0uh7mtt9ih_jy5fc">
+      <w:hyperlink w:history="1" r:id="rId0zir-u9exawasae5taijn">
         <w:r>
           <w:rPr>
             <w:color w:val="8E1B2C"/>
@@ -2467,7 +2467,7 @@
         </w:rPr>
         <w:t xml:space="preserve">[</w:t>
       </w:r>
-      <w:hyperlink w:history="1" r:id="rIda1j89glaqznq_n_am4l06">
+      <w:hyperlink w:history="1" r:id="rIdmyrdq5tgfn_mcg3jhravo">
         <w:r>
           <w:rPr>
             <w:color w:val="8E1B2C"/>
@@ -2497,7 +2497,7 @@
         </w:rPr>
         <w:t xml:space="preserve">[</w:t>
       </w:r>
-      <w:hyperlink w:history="1" r:id="rIdgm9rt1gtzhkl-emiyneej">
+      <w:hyperlink w:history="1" r:id="rIdywszpwe2japwf_b2kx-1k">
         <w:r>
           <w:rPr>
             <w:color w:val="8E1B2C"/>
@@ -2516,7 +2516,7 @@
         </w:rPr>
         <w:t xml:space="preserve"> · </w:t>
       </w:r>
-      <w:hyperlink w:history="1" r:id="rId9zovh41kpqz5pigjkomuz">
+      <w:hyperlink w:history="1" r:id="rIdtd34w1di3w0h8enlcny60">
         <w:r>
           <w:rPr>
             <w:color w:val="8E1B2C"/>
@@ -2559,7 +2559,7 @@
         </w:rPr>
         <w:t xml:space="preserve">[</w:t>
       </w:r>
-      <w:hyperlink w:history="1" r:id="rIdibt2lokk5wuy7dlqnfijq">
+      <w:hyperlink w:history="1" r:id="rIdvql5rhdgljchbs2r80emr">
         <w:r>
           <w:rPr>
             <w:color w:val="8E1B2C"/>
@@ -2589,7 +2589,7 @@
         </w:rPr>
         <w:t xml:space="preserve">[</w:t>
       </w:r>
-      <w:hyperlink w:history="1" r:id="rIdlmrwoyafqbuduqcvo53u_">
+      <w:hyperlink w:history="1" r:id="rIdf_vubos7zdea4qm1ja_tb">
         <w:r>
           <w:rPr>
             <w:color w:val="8E1B2C"/>
@@ -2632,7 +2632,7 @@
         </w:rPr>
         <w:t xml:space="preserve">[</w:t>
       </w:r>
-      <w:hyperlink w:history="1" r:id="rId09xtw169rg7keh_qhzms9">
+      <w:hyperlink w:history="1" r:id="rIdvqkri0tsvwftes3ssdwq7">
         <w:r>
           <w:rPr>
             <w:color w:val="8E1B2C"/>
@@ -2662,7 +2662,7 @@
         </w:rPr>
         <w:t xml:space="preserve">[</w:t>
       </w:r>
-      <w:hyperlink w:history="1" r:id="rId5y_t51atezd2e7mw6jsna">
+      <w:hyperlink w:history="1" r:id="rId33tfvbaij6weokg3vf7q2">
         <w:r>
           <w:rPr>
             <w:color w:val="8E1B2C"/>
@@ -2705,7 +2705,7 @@
         </w:rPr>
         <w:t xml:space="preserve">[</w:t>
       </w:r>
-      <w:hyperlink w:history="1" r:id="rId9sauojgvttkp5d-blygqf">
+      <w:hyperlink w:history="1" r:id="rId5egd1_2muhgt2ig-3x7b2">
         <w:r>
           <w:rPr>
             <w:color w:val="8E1B2C"/>
@@ -2735,7 +2735,7 @@
         </w:rPr>
         <w:t xml:space="preserve">[</w:t>
       </w:r>
-      <w:hyperlink w:history="1" r:id="rIdsu3qugmwrabap1txyhtks">
+      <w:hyperlink w:history="1" r:id="rIdnfhjakzefeeciy7shlj5k">
         <w:r>
           <w:rPr>
             <w:color w:val="8E1B2C"/>
@@ -2811,7 +2811,7 @@
         </w:rPr>
         <w:t xml:space="preserve">[</w:t>
       </w:r>
-      <w:hyperlink w:history="1" r:id="rIdhw9dj6qhxhxudt_k0tixr">
+      <w:hyperlink w:history="1" r:id="rIdet3i3zzanrdqd7kssa2zg">
         <w:r>
           <w:rPr>
             <w:color w:val="8E1B2C"/>
@@ -2841,7 +2841,7 @@
         </w:rPr>
         <w:t xml:space="preserve">[</w:t>
       </w:r>
-      <w:hyperlink w:history="1" r:id="rIddkt9akwxdpp3-t0lmjdur">
+      <w:hyperlink w:history="1" r:id="rIddtxpccybgfib8txrnp-eh">
         <w:r>
           <w:rPr>
             <w:color w:val="8E1B2C"/>
@@ -2871,7 +2871,7 @@
         </w:rPr>
         <w:t xml:space="preserve">[</w:t>
       </w:r>
-      <w:hyperlink w:history="1" r:id="rIdnu7rsus_n4jpuc0zpqyr5">
+      <w:hyperlink w:history="1" r:id="rIdyaczv04vcddxc6p93hfru">
         <w:r>
           <w:rPr>
             <w:color w:val="8E1B2C"/>
@@ -2901,7 +2901,7 @@
         </w:rPr>
         <w:t xml:space="preserve">[</w:t>
       </w:r>
-      <w:hyperlink w:history="1" r:id="rIdf8amrawpgxdrvsxwklpcm">
+      <w:hyperlink w:history="1" r:id="rIdy9yq8jnpst1f78la2j9a1">
         <w:r>
           <w:rPr>
             <w:color w:val="8E1B2C"/>
@@ -2981,7 +2981,7 @@
         </w:rPr>
         <w:t xml:space="preserve">[</w:t>
       </w:r>
-      <w:hyperlink w:history="1" r:id="rIdwdmanhgrya3gcx0_gdscc">
+      <w:hyperlink w:history="1" r:id="rIdhsvb0ofwwmimlj-qmi5cl">
         <w:r>
           <w:rPr>
             <w:color w:val="8E1B2C"/>
@@ -3011,7 +3011,7 @@
         </w:rPr>
         <w:t xml:space="preserve">[</w:t>
       </w:r>
-      <w:hyperlink w:history="1" r:id="rIdmhvsc1-elwsupaqrtidhf">
+      <w:hyperlink w:history="1" r:id="rIdzx8elz5-xtetdv_u2nejy">
         <w:r>
           <w:rPr>
             <w:color w:val="8E1B2C"/>
@@ -3041,7 +3041,7 @@
         </w:rPr>
         <w:t xml:space="preserve">[</w:t>
       </w:r>
-      <w:hyperlink w:history="1" r:id="rIdkvyx68drqjufl-hru70bh">
+      <w:hyperlink w:history="1" r:id="rIdk-jmqsxpqb73nrurzns1o">
         <w:r>
           <w:rPr>
             <w:color w:val="8E1B2C"/>
@@ -3121,7 +3121,7 @@
         </w:rPr>
         <w:t xml:space="preserve">[</w:t>
       </w:r>
-      <w:hyperlink w:history="1" r:id="rIdlwa9kyhp2nipviu3gj4uw">
+      <w:hyperlink w:history="1" r:id="rId6vcrrl71oneom3iwfepok">
         <w:r>
           <w:rPr>
             <w:color w:val="8E1B2C"/>
@@ -3151,7 +3151,7 @@
         </w:rPr>
         <w:t xml:space="preserve">[</w:t>
       </w:r>
-      <w:hyperlink w:history="1" r:id="rIddg7xbey_lztdwjxa4zf62">
+      <w:hyperlink w:history="1" r:id="rIdz4bnv7bikgc5yv7fbb-sf">
         <w:r>
           <w:rPr>
             <w:color w:val="8E1B2C"/>
@@ -3181,7 +3181,7 @@
         </w:rPr>
         <w:t xml:space="preserve">[</w:t>
       </w:r>
-      <w:hyperlink w:history="1" r:id="rId9sbfwr2jgjlhr_6vizbip">
+      <w:hyperlink w:history="1" r:id="rIdjwzfnxxyamz14giuq3fns">
         <w:r>
           <w:rPr>
             <w:color w:val="8E1B2C"/>
@@ -3261,7 +3261,7 @@
         </w:rPr>
         <w:t xml:space="preserve">[</w:t>
       </w:r>
-      <w:hyperlink w:history="1" r:id="rIdeebqk3_vdpjdy8e6l7ccj">
+      <w:hyperlink w:history="1" r:id="rId1vd63pgz9rezjvyrbrgny">
         <w:r>
           <w:rPr>
             <w:color w:val="8E1B2C"/>
@@ -3280,7 +3280,7 @@
         </w:rPr>
         <w:t xml:space="preserve"> · </w:t>
       </w:r>
-      <w:hyperlink w:history="1" r:id="rId-k174oyr5ejmufy9olu1m">
+      <w:hyperlink w:history="1" r:id="rIdl22n5_izyjjiprduli9ym">
         <w:r>
           <w:rPr>
             <w:color w:val="8E1B2C"/>
@@ -3310,7 +3310,7 @@
         </w:rPr>
         <w:t xml:space="preserve">[</w:t>
       </w:r>
-      <w:hyperlink w:history="1" r:id="rIdfg881iokdzqdddxcmwtl-">
+      <w:hyperlink w:history="1" r:id="rIdzgujmdmd5djmu7uhl6k-g">
         <w:r>
           <w:rPr>
             <w:color w:val="8E1B2C"/>
@@ -3390,7 +3390,7 @@
         </w:rPr>
         <w:t xml:space="preserve">[</w:t>
       </w:r>
-      <w:hyperlink w:history="1" r:id="rIdzro2yp7u0eqf4pfrhe3mu">
+      <w:hyperlink w:history="1" r:id="rIdeyymxatelychvqbrofrrt">
         <w:r>
           <w:rPr>
             <w:color w:val="8E1B2C"/>
@@ -3420,7 +3420,7 @@
         </w:rPr>
         <w:t xml:space="preserve">[</w:t>
       </w:r>
-      <w:hyperlink w:history="1" r:id="rIdqweqptxecsocmaa5yuw0u">
+      <w:hyperlink w:history="1" r:id="rId5jeohdm4cbotmz-9li-_h">
         <w:r>
           <w:rPr>
             <w:color w:val="8E1B2C"/>
@@ -3477,7 +3477,7 @@
         </w:rPr>
         <w:t xml:space="preserve">[</w:t>
       </w:r>
-      <w:hyperlink w:history="1" r:id="rIdxomfancjrwohevmc44ays">
+      <w:hyperlink w:history="1" r:id="rIdxyme-ze20cg_kkorvau_b">
         <w:r>
           <w:rPr>
             <w:color w:val="8E1B2C"/>

</xml_diff>

<commit_message>
Apply DAO brand kit to briefing and source list PDF and Word files
</commit_message>
<xml_diff>
--- a/01-briefing/new-ceo-briefing.docx
+++ b/01-briefing/new-ceo-briefing.docx
@@ -2,361 +2,483 @@
 <file path=word/document.xml><?xml version="1.0" encoding="utf-8"?>
 <w:document xmlns:wpc="http://schemas.microsoft.com/office/word/2010/wordprocessingCanvas" xmlns:mc="http://schemas.openxmlformats.org/markup-compatibility/2006" xmlns:o="urn:schemas-microsoft-com:office:office" xmlns:r="http://schemas.openxmlformats.org/officeDocument/2006/relationships" xmlns:m="http://schemas.openxmlformats.org/officeDocument/2006/math" xmlns:v="urn:schemas-microsoft-com:vml" xmlns:wp14="http://schemas.microsoft.com/office/word/2010/wordprocessingDrawing" xmlns:wp="http://schemas.openxmlformats.org/drawingml/2006/wordprocessingDrawing" xmlns:w10="urn:schemas-microsoft-com:office:word" xmlns:w="http://schemas.openxmlformats.org/wordprocessingml/2006/main" xmlns:w14="http://schemas.microsoft.com/office/word/2010/wordml" xmlns:w15="http://schemas.microsoft.com/office/word/2012/wordml" xmlns:wpg="http://schemas.microsoft.com/office/word/2010/wordprocessingGroup" xmlns:wpi="http://schemas.microsoft.com/office/word/2010/wordprocessingInk" xmlns:wne="http://schemas.microsoft.com/office/word/2006/wordml" xmlns:wps="http://schemas.microsoft.com/office/word/2010/wordprocessingShape" xmlns:cx="http://schemas.microsoft.com/office/drawing/2014/chartex" xmlns:cx1="http://schemas.microsoft.com/office/drawing/2015/9/8/chartex" xmlns:cx2="http://schemas.microsoft.com/office/drawing/2015/10/21/chartex" xmlns:cx3="http://schemas.microsoft.com/office/drawing/2016/5/9/chartex" xmlns:cx4="http://schemas.microsoft.com/office/drawing/2016/5/10/chartex" xmlns:cx5="http://schemas.microsoft.com/office/drawing/2016/5/11/chartex" xmlns:cx6="http://schemas.microsoft.com/office/drawing/2016/5/12/chartex" xmlns:cx7="http://schemas.microsoft.com/office/drawing/2016/5/13/chartex" xmlns:cx8="http://schemas.microsoft.com/office/drawing/2016/5/14/chartex" xmlns:aink="http://schemas.microsoft.com/office/drawing/2016/ink" xmlns:am3d="http://schemas.microsoft.com/office/drawing/2017/model3d" xmlns:w16cex="http://schemas.microsoft.com/office/word/2018/wordml/cex" xmlns:w16cid="http://schemas.microsoft.com/office/word/2016/wordml/cid" xmlns:w16="http://schemas.microsoft.com/office/word/2018/wordml" xmlns:w16sdtdh="http://schemas.microsoft.com/office/word/2020/wordml/sdtdatahash" xmlns:w16se="http://schemas.microsoft.com/office/word/2015/wordml/symex" mc:Ignorable="w14 w15 wp14">
   <w:body>
-    <w:p>
-      <w:pPr>
-        <w:spacing w:after="110"/>
+    <w:tbl>
+      <w:tblPr>
+        <w:tblW w:type="dxa" w:w="9752"/>
+        <w:tblBorders>
+          <w:top w:val="single" w:color="auto" w:sz="4"/>
+          <w:left w:val="single" w:color="auto" w:sz="4"/>
+          <w:bottom w:val="single" w:color="auto" w:sz="4"/>
+          <w:right w:val="single" w:color="auto" w:sz="4"/>
+          <w:insideH w:val="single" w:color="auto" w:sz="4"/>
+          <w:insideV w:val="single" w:color="auto" w:sz="4"/>
+        </w:tblBorders>
+      </w:tblPr>
+      <w:tblGrid>
+        <w:gridCol w:w="7552"/>
+        <w:gridCol w:w="2200"/>
+      </w:tblGrid>
+      <w:tr>
+        <w:tc>
+          <w:tcPr>
+            <w:tcW w:type="dxa" w:w="7552"/>
+            <w:tcBorders>
+              <w:top w:val="none" w:color="auto" w:sz="0"/>
+              <w:left w:val="none" w:color="auto" w:sz="0"/>
+              <w:bottom w:val="none" w:color="auto" w:sz="0"/>
+              <w:right w:val="none" w:color="auto" w:sz="0"/>
+            </w:tcBorders>
+            <w:shd w:fill="1D3140" w:color="auto" w:val="clear"/>
+            <w:tcMar>
+              <w:top w:type="dxa" w:w="300"/>
+              <w:left w:type="dxa" w:w="360"/>
+              <w:bottom w:type="dxa" w:w="300"/>
+              <w:right w:type="dxa" w:w="120"/>
+            </w:tcMar>
+            <w:vAlign w:val="center"/>
+          </w:tcPr>
+          <w:p>
+            <w:pPr>
+              <w:spacing w:after="80"/>
+            </w:pPr>
+            <w:r>
+              <w:rPr>
+                <w:b/>
+                <w:bCs/>
+                <w:color w:val="FFB3AE"/>
+                <w:spacing w:val="30"/>
+                <w:sz w:val="15"/>
+                <w:szCs w:val="15"/>
+              </w:rPr>
+              <w:t xml:space="preserve">REDBELLY DAO · NEW CEO BRIEFING</w:t>
+            </w:r>
+          </w:p>
+          <w:p>
+            <w:pPr>
+              <w:spacing w:after="60" w:line="240" w:lineRule="auto"/>
+            </w:pPr>
+            <w:r>
+              <w:rPr>
+                <w:b/>
+                <w:bCs/>
+                <w:color w:val="F1F5F8"/>
+                <w:spacing w:val="-8"/>
+                <w:sz w:val="40"/>
+                <w:szCs w:val="40"/>
+              </w:rPr>
+              <w:t xml:space="preserve">Christian Westerlind Wigstrom, Redbelly’s incoming CEO</w:t>
+            </w:r>
+          </w:p>
+          <w:p>
+            <w:pPr>
+              <w:spacing w:after="80"/>
+            </w:pPr>
+            <w:r>
+              <w:rPr>
+                <w:color w:val="C2CED6"/>
+                <w:sz w:val="20"/>
+                <w:szCs w:val="20"/>
+              </w:rPr>
+              <w:t xml:space="preserve">Who he is, what Redbelly announced, and what his payments track record could mean for Tokeniser</w:t>
+            </w:r>
+          </w:p>
+          <w:p>
+            <w:pPr>
+              <w:spacing w:after="0"/>
+            </w:pPr>
+            <w:r>
+              <w:rPr>
+                <w:rFonts w:ascii="JetBrains Mono" w:cs="JetBrains Mono" w:eastAsia="JetBrains Mono" w:hAnsi="JetBrains Mono"/>
+                <w:color w:val="C2CED6"/>
+                <w:sz w:val="15"/>
+                <w:szCs w:val="15"/>
+              </w:rPr>
+              <w:t xml:space="preserve">29 October 2026</w:t>
+            </w:r>
+            <w:r>
+              <w:rPr>
+                <w:color w:val="C2CED6"/>
+                <w:sz w:val="15"/>
+                <w:szCs w:val="15"/>
+              </w:rPr>
+              <w:t xml:space="preserve">  ·  Sources accessed </w:t>
+            </w:r>
+            <w:r>
+              <w:rPr>
+                <w:rFonts w:ascii="JetBrains Mono" w:cs="JetBrains Mono" w:eastAsia="JetBrains Mono" w:hAnsi="JetBrains Mono"/>
+                <w:color w:val="C2CED6"/>
+                <w:sz w:val="15"/>
+                <w:szCs w:val="15"/>
+              </w:rPr>
+              <w:t xml:space="preserve">29 October 2026</w:t>
+            </w:r>
+          </w:p>
+        </w:tc>
+        <w:tc>
+          <w:tcPr>
+            <w:tcW w:type="dxa" w:w="2200"/>
+            <w:tcBorders>
+              <w:top w:val="none" w:color="auto" w:sz="0"/>
+              <w:left w:val="none" w:color="auto" w:sz="0"/>
+              <w:bottom w:val="none" w:color="auto" w:sz="0"/>
+              <w:right w:val="none" w:color="auto" w:sz="0"/>
+            </w:tcBorders>
+            <w:shd w:fill="1D3140" w:color="auto" w:val="clear"/>
+            <w:tcMar>
+              <w:top w:type="dxa" w:w="240"/>
+              <w:left w:type="dxa" w:w="120"/>
+              <w:bottom w:type="dxa" w:w="240"/>
+              <w:right w:type="dxa" w:w="300"/>
+            </w:tcMar>
+            <w:vAlign w:val="center"/>
+          </w:tcPr>
+          <w:p>
+            <w:pPr>
+              <w:spacing w:after="0" w:line="240" w:lineRule="auto"/>
+              <w:jc w:val="right"/>
+            </w:pPr>
+            <w:r>
+              <w:drawing>
+                <wp:inline distT="0" distB="0" distL="0" distR="0">
+                  <wp:extent cx="1123950" cy="800100"/>
+                  <wp:effectExtent t="0" r="0" b="0" l="0"/>
+                  <wp:docPr id="1" name="Redbelly DAO logo" descr="Redbelly DAO logo" title="Redbelly DAO"/>
+                  <wp:cNvGraphicFramePr>
+                    <a:graphicFrameLocks xmlns:a="http://schemas.openxmlformats.org/drawingml/2006/main" noChangeAspect="1"/>
+                  </wp:cNvGraphicFramePr>
+                  <a:graphic xmlns:a="http://schemas.openxmlformats.org/drawingml/2006/main">
+                    <a:graphicData uri="http://schemas.openxmlformats.org/drawingml/2006/picture">
+                      <pic:pic xmlns:pic="http://schemas.openxmlformats.org/drawingml/2006/picture">
+                        <pic:nvPicPr>
+                          <pic:cNvPr id="0" name="" descr=""/>
+                          <pic:cNvPicPr>
+                            <a:picLocks noChangeAspect="1" noChangeArrowheads="1"/>
+                          </pic:cNvPicPr>
+                        </pic:nvPicPr>
+                        <pic:blipFill>
+                          <a:blip r:embed="rId11" cstate="none"/>
+                          <a:srcRect/>
+                          <a:stretch>
+                            <a:fillRect/>
+                          </a:stretch>
+                        </pic:blipFill>
+                        <pic:spPr bwMode="auto">
+                          <a:xfrm>
+                            <a:off x="0" y="0"/>
+                            <a:ext cx="1123950" cy="800100"/>
+                          </a:xfrm>
+                          <a:prstGeom prst="rect">
+                            <a:avLst/>
+                          </a:prstGeom>
+                        </pic:spPr>
+                      </pic:pic>
+                    </a:graphicData>
+                  </a:graphic>
+                </wp:inline>
+              </w:drawing>
+            </w:r>
+          </w:p>
+        </w:tc>
+      </w:tr>
+    </w:tbl>
+    <w:p>
+      <w:pPr>
+        <w:pBdr>
+          <w:left w:val="single" w:color="D3DBE1" w:sz="12" w:space="8"/>
+        </w:pBdr>
+        <w:shd w:fill="EDF1F4" w:color="auto" w:val="clear"/>
+        <w:spacing w:after="60" w:before="160"/>
+        <w:ind w:left="170" w:right="113"/>
+      </w:pPr>
+      <w:r>
+        <w:rPr>
+          <w:i/>
+          <w:iCs/>
+          <w:color w:val="394853"/>
+          <w:sz w:val="15"/>
+          <w:szCs w:val="15"/>
+        </w:rPr>
+        <w:t xml:space="preserve">How to read this briefing: every factual statement carries a bracketed source link. Boxes marked ANALYSIS contain interpretation, not established fact. A claim-by-claim source list accompanies this document.</w:t>
+      </w:r>
+    </w:p>
+    <w:p>
+      <w:pPr>
+        <w:pStyle w:val="Heading1"/>
+      </w:pPr>
+      <w:r>
+        <w:t xml:space="preserve">1. Executive summary</w:t>
+      </w:r>
+    </w:p>
+    <w:p>
+      <w:pPr>
+        <w:jc w:val="left"/>
+      </w:pPr>
+      <w:r>
+        <w:t xml:space="preserve">Redbelly Network announced on 16 September 2026 that Christian Westerlind Wigstrom will become its Chief Executive Officer, starting November 2026 </w:t>
+      </w:r>
+      <w:r>
+        <w:rPr>
+          <w:color w:val="B3272A"/>
+          <w:sz w:val="13"/>
+          <w:szCs w:val="13"/>
+        </w:rPr>
+        <w:t xml:space="preserve">[</w:t>
+      </w:r>
+      <w:hyperlink w:history="1" r:id="rIdigrsr_bzxwerikrdmx4uh">
+        <w:r>
+          <w:rPr>
+            <w:color w:val="B3272A"/>
+            <w:sz w:val="13"/>
+            <w:szCs w:val="13"/>
+            <w:u w:val="single"/>
+          </w:rPr>
+          <w:t xml:space="preserve">Redbelly</w:t>
+        </w:r>
+      </w:hyperlink>
+      <w:r>
+        <w:rPr>
+          <w:color w:val="B3272A"/>
+          <w:sz w:val="13"/>
+          <w:szCs w:val="13"/>
+        </w:rPr>
+        <w:t xml:space="preserve"> · </w:t>
+      </w:r>
+      <w:hyperlink w:history="1" r:id="rIdkmvnubejfxr3upida_ewf">
+        <w:r>
+          <w:rPr>
+            <w:color w:val="B3272A"/>
+            <w:sz w:val="13"/>
+            <w:szCs w:val="13"/>
+            <w:u w:val="single"/>
+          </w:rPr>
+          <w:t xml:space="preserve">Medianet</w:t>
+        </w:r>
+      </w:hyperlink>
+      <w:r>
+        <w:rPr>
+          <w:color w:val="B3272A"/>
+          <w:sz w:val="13"/>
+          <w:szCs w:val="13"/>
+        </w:rPr>
+        <w:t xml:space="preserve"> · </w:t>
+      </w:r>
+      <w:hyperlink w:history="1" r:id="rIdwahhltgn7tbxmum-i5skp">
+        <w:r>
+          <w:rPr>
+            <w:color w:val="B3272A"/>
+            <w:sz w:val="13"/>
+            <w:szCs w:val="13"/>
+            <w:u w:val="single"/>
+          </w:rPr>
+          <w:t xml:space="preserve">SMB Tech</w:t>
+        </w:r>
+      </w:hyperlink>
+      <w:r>
+        <w:rPr>
+          <w:color w:val="B3272A"/>
+          <w:sz w:val="13"/>
+          <w:szCs w:val="13"/>
+        </w:rPr>
+        <w:t xml:space="preserve">]</w:t>
+      </w:r>
+      <w:r>
+        <w:t xml:space="preserve">; Banking Day gives the start date as Monday 2 November 2026 </w:t>
+      </w:r>
+      <w:r>
+        <w:rPr>
+          <w:color w:val="B3272A"/>
+          <w:sz w:val="13"/>
+          <w:szCs w:val="13"/>
+        </w:rPr>
+        <w:t xml:space="preserve">[</w:t>
+      </w:r>
+      <w:hyperlink w:history="1" r:id="rId97ucjcvw2vkakdigid0lq">
+        <w:r>
+          <w:rPr>
+            <w:color w:val="B3272A"/>
+            <w:sz w:val="13"/>
+            <w:szCs w:val="13"/>
+            <w:u w:val="single"/>
+          </w:rPr>
+          <w:t xml:space="preserve">Banking Day</w:t>
+        </w:r>
+      </w:hyperlink>
+      <w:r>
+        <w:rPr>
+          <w:color w:val="B3272A"/>
+          <w:sz w:val="13"/>
+          <w:szCs w:val="13"/>
+        </w:rPr>
+        <w:t xml:space="preserve">]</w:t>
+      </w:r>
+      <w:r>
+        <w:t xml:space="preserve">. He co-founded the payments company Monoova and was its CEO for almost ten years, until 2026 </w:t>
+      </w:r>
+      <w:r>
+        <w:rPr>
+          <w:color w:val="B3272A"/>
+          <w:sz w:val="13"/>
+          <w:szCs w:val="13"/>
+        </w:rPr>
+        <w:t xml:space="preserve">[</w:t>
+      </w:r>
+      <w:hyperlink w:history="1" r:id="rIdt5wvkobxe9-lbjnhkvtgn">
+        <w:r>
+          <w:rPr>
+            <w:color w:val="B3272A"/>
+            <w:sz w:val="13"/>
+            <w:szCs w:val="13"/>
+            <w:u w:val="single"/>
+          </w:rPr>
+          <w:t xml:space="preserve">Redbelly</w:t>
+        </w:r>
+      </w:hyperlink>
+      <w:r>
+        <w:rPr>
+          <w:color w:val="B3272A"/>
+          <w:sz w:val="13"/>
+          <w:szCs w:val="13"/>
+        </w:rPr>
+        <w:t xml:space="preserve"> · </w:t>
+      </w:r>
+      <w:hyperlink w:history="1" r:id="rIdx5y-nzbgj1z3cctvq-a7z">
+        <w:r>
+          <w:rPr>
+            <w:color w:val="B3272A"/>
+            <w:sz w:val="13"/>
+            <w:szCs w:val="13"/>
+            <w:u w:val="single"/>
+          </w:rPr>
+          <w:t xml:space="preserve">Banking Day</w:t>
+        </w:r>
+      </w:hyperlink>
+      <w:r>
+        <w:rPr>
+          <w:color w:val="B3272A"/>
+          <w:sz w:val="13"/>
+          <w:szCs w:val="13"/>
+        </w:rPr>
+        <w:t xml:space="preserve"> · </w:t>
+      </w:r>
+      <w:hyperlink w:history="1" r:id="rIdrtceoycvqyztukrzqjl1o">
+        <w:r>
+          <w:rPr>
+            <w:color w:val="B3272A"/>
+            <w:sz w:val="13"/>
+            <w:szCs w:val="13"/>
+            <w:u w:val="single"/>
+          </w:rPr>
+          <w:t xml:space="preserve">LinkedIn</w:t>
+        </w:r>
+      </w:hyperlink>
+      <w:r>
+        <w:rPr>
+          <w:color w:val="B3272A"/>
+          <w:sz w:val="13"/>
+          <w:szCs w:val="13"/>
+        </w:rPr>
+        <w:t xml:space="preserve">]</w:t>
+      </w:r>
+      <w:r>
+        <w:t xml:space="preserve">. Redbelly says he joins “to lead the company’s push into regulated tokenisation” </w:t>
+      </w:r>
+      <w:r>
+        <w:rPr>
+          <w:color w:val="B3272A"/>
+          <w:sz w:val="13"/>
+          <w:szCs w:val="13"/>
+        </w:rPr>
+        <w:t xml:space="preserve">[</w:t>
+      </w:r>
+      <w:hyperlink w:history="1" r:id="rIdea_-d4n3ipg2pmryi2y11">
+        <w:r>
+          <w:rPr>
+            <w:color w:val="B3272A"/>
+            <w:sz w:val="13"/>
+            <w:szCs w:val="13"/>
+            <w:u w:val="single"/>
+          </w:rPr>
+          <w:t xml:space="preserve">Redbelly</w:t>
+        </w:r>
+      </w:hyperlink>
+      <w:r>
+        <w:rPr>
+          <w:color w:val="B3272A"/>
+          <w:sz w:val="13"/>
+          <w:szCs w:val="13"/>
+        </w:rPr>
+        <w:t xml:space="preserve"> · </w:t>
+      </w:r>
+      <w:hyperlink w:history="1" r:id="rId_bmbxoy2nbbvje5asmlqf">
+        <w:r>
+          <w:rPr>
+            <w:color w:val="B3272A"/>
+            <w:sz w:val="13"/>
+            <w:szCs w:val="13"/>
+            <w:u w:val="single"/>
+          </w:rPr>
+          <w:t xml:space="preserve">SMB Tech</w:t>
+        </w:r>
+      </w:hyperlink>
+      <w:r>
+        <w:rPr>
+          <w:color w:val="B3272A"/>
+          <w:sz w:val="13"/>
+          <w:szCs w:val="13"/>
+        </w:rPr>
+        <w:t xml:space="preserve">]</w:t>
+      </w:r>
+      <w:r>
+        <w:t xml:space="preserve">, a strategy delivered through Tokeniser, which “brings fund and equity administration on-chain for regulated markets” </w:t>
+      </w:r>
+      <w:r>
+        <w:rPr>
+          <w:color w:val="B3272A"/>
+          <w:sz w:val="13"/>
+          <w:szCs w:val="13"/>
+        </w:rPr>
+        <w:t xml:space="preserve">[</w:t>
+      </w:r>
+      <w:hyperlink w:history="1" r:id="rId9xrpep04364ugpeuujeab">
+        <w:r>
+          <w:rPr>
+            <w:color w:val="B3272A"/>
+            <w:sz w:val="13"/>
+            <w:szCs w:val="13"/>
+            <w:u w:val="single"/>
+          </w:rPr>
+          <w:t xml:space="preserve">Redbelly</w:t>
+        </w:r>
+      </w:hyperlink>
+      <w:r>
+        <w:rPr>
+          <w:color w:val="B3272A"/>
+          <w:sz w:val="13"/>
+          <w:szCs w:val="13"/>
+        </w:rPr>
+        <w:t xml:space="preserve">]</w:t>
+      </w:r>
+      <w:r>
+        <w:t xml:space="preserve">.</w:t>
+      </w:r>
+    </w:p>
+    <w:p>
+      <w:pPr>
+        <w:pBdr>
+          <w:left w:val="single" w:color="EF5350" w:sz="24" w:space="8"/>
+        </w:pBdr>
+        <w:shd w:fill="EDF1F4" w:color="auto" w:val="clear"/>
+        <w:spacing w:after="120" w:before="40"/>
+        <w:ind w:left="170" w:right="113"/>
       </w:pPr>
       <w:r>
         <w:rPr>
           <w:b/>
           <w:bCs/>
-          <w:color w:val="8E1B2C"/>
-          <w:spacing w:val="20"/>
-          <w:sz w:val="16"/>
-          <w:szCs w:val="16"/>
-        </w:rPr>
-        <w:t xml:space="preserve">REDBELLY DAO · NEW CEO BRIEFING</w:t>
-      </w:r>
-    </w:p>
-    <w:p>
-      <w:pPr>
-        <w:spacing w:after="50"/>
-      </w:pPr>
-      <w:r>
-        <w:rPr>
-          <w:b/>
-          <w:bCs/>
-          <w:color w:val="1F2328"/>
-          <w:sz w:val="38"/>
-          <w:szCs w:val="38"/>
-        </w:rPr>
-        <w:t xml:space="preserve">Christian Westerlind Wigstrom, Redbelly’s incoming CEO</w:t>
-      </w:r>
-    </w:p>
-    <w:p>
-      <w:pPr>
-        <w:spacing w:after="60"/>
-      </w:pPr>
-      <w:r>
-        <w:rPr>
-          <w:color w:val="5B6470"/>
-          <w:sz w:val="23"/>
-          <w:szCs w:val="23"/>
-        </w:rPr>
-        <w:t xml:space="preserve">Who he is, what Redbelly announced, and what his payments track record could mean for Tokeniser</w:t>
-      </w:r>
-    </w:p>
-    <w:p>
-      <w:pPr>
-        <w:spacing w:after="100"/>
-      </w:pPr>
-      <w:r>
-        <w:rPr>
-          <w:color w:val="5B6470"/>
-          <w:sz w:val="17"/>
-          <w:szCs w:val="17"/>
-        </w:rPr>
-        <w:t xml:space="preserve">29 October 2026 · Sources accessed 29 October 2026</w:t>
-      </w:r>
-    </w:p>
-    <w:p>
-      <w:pPr>
-        <w:pBdr>
-          <w:left w:val="single" w:color="D5D9DE" w:sz="12" w:space="8"/>
-        </w:pBdr>
-        <w:shd w:fill="F6F7F9" w:color="auto" w:val="clear"/>
-        <w:spacing w:after="60"/>
-        <w:ind w:left="170" w:right="113"/>
-      </w:pPr>
-      <w:r>
-        <w:rPr>
-          <w:i/>
-          <w:iCs/>
-          <w:color w:val="5B6470"/>
-          <w:sz w:val="17"/>
-          <w:szCs w:val="17"/>
-        </w:rPr>
-        <w:t xml:space="preserve">How to read this briefing: every factual statement carries a bracketed source link. Boxes marked ANALYSIS contain interpretation, not established fact. A claim-by-claim source list accompanies this document.</w:t>
-      </w:r>
-    </w:p>
-    <w:p>
-      <w:pPr>
-        <w:pStyle w:val="Heading1"/>
-      </w:pPr>
-      <w:r>
-        <w:t xml:space="preserve">1. Executive summary</w:t>
-      </w:r>
-    </w:p>
-    <w:p>
-      <w:pPr>
-        <w:jc w:val="left"/>
-      </w:pPr>
-      <w:r>
-        <w:t xml:space="preserve">Redbelly Network announced on 16 September 2026 that Christian Westerlind Wigstrom will become its Chief Executive Officer, starting November 2026 </w:t>
-      </w:r>
-      <w:r>
-        <w:rPr>
-          <w:color w:val="8E1B2C"/>
-          <w:sz w:val="15"/>
-          <w:szCs w:val="15"/>
-        </w:rPr>
-        <w:t xml:space="preserve">[</w:t>
-      </w:r>
-      <w:hyperlink w:history="1" r:id="rId6iga5qyjwgyguc23qv-mw">
-        <w:r>
-          <w:rPr>
-            <w:color w:val="8E1B2C"/>
-            <w:sz w:val="15"/>
-            <w:szCs w:val="15"/>
-            <w:u w:val="single"/>
-          </w:rPr>
-          <w:t xml:space="preserve">Redbelly</w:t>
-        </w:r>
-      </w:hyperlink>
-      <w:r>
-        <w:rPr>
-          <w:color w:val="8E1B2C"/>
-          <w:sz w:val="15"/>
-          <w:szCs w:val="15"/>
-        </w:rPr>
-        <w:t xml:space="preserve"> · </w:t>
-      </w:r>
-      <w:hyperlink w:history="1" r:id="rIdc7kpeatfbjixdh0jtui00">
-        <w:r>
-          <w:rPr>
-            <w:color w:val="8E1B2C"/>
-            <w:sz w:val="15"/>
-            <w:szCs w:val="15"/>
-            <w:u w:val="single"/>
-          </w:rPr>
-          <w:t xml:space="preserve">Medianet</w:t>
-        </w:r>
-      </w:hyperlink>
-      <w:r>
-        <w:rPr>
-          <w:color w:val="8E1B2C"/>
-          <w:sz w:val="15"/>
-          <w:szCs w:val="15"/>
-        </w:rPr>
-        <w:t xml:space="preserve"> · </w:t>
-      </w:r>
-      <w:hyperlink w:history="1" r:id="rIdopmaqgylwy1qjwfga7xgd">
-        <w:r>
-          <w:rPr>
-            <w:color w:val="8E1B2C"/>
-            <w:sz w:val="15"/>
-            <w:szCs w:val="15"/>
-            <w:u w:val="single"/>
-          </w:rPr>
-          <w:t xml:space="preserve">SMB Tech</w:t>
-        </w:r>
-      </w:hyperlink>
-      <w:r>
-        <w:rPr>
-          <w:color w:val="8E1B2C"/>
-          <w:sz w:val="15"/>
-          <w:szCs w:val="15"/>
-        </w:rPr>
-        <w:t xml:space="preserve">]</w:t>
-      </w:r>
-      <w:r>
-        <w:t xml:space="preserve">; Banking Day gives the start date as Monday 2 November 2026 </w:t>
-      </w:r>
-      <w:r>
-        <w:rPr>
-          <w:color w:val="8E1B2C"/>
-          <w:sz w:val="15"/>
-          <w:szCs w:val="15"/>
-        </w:rPr>
-        <w:t xml:space="preserve">[</w:t>
-      </w:r>
-      <w:hyperlink w:history="1" r:id="rIdnuj-cbibce1ollua-pr3b">
-        <w:r>
-          <w:rPr>
-            <w:color w:val="8E1B2C"/>
-            <w:sz w:val="15"/>
-            <w:szCs w:val="15"/>
-            <w:u w:val="single"/>
-          </w:rPr>
-          <w:t xml:space="preserve">Banking Day</w:t>
-        </w:r>
-      </w:hyperlink>
-      <w:r>
-        <w:rPr>
-          <w:color w:val="8E1B2C"/>
-          <w:sz w:val="15"/>
-          <w:szCs w:val="15"/>
-        </w:rPr>
-        <w:t xml:space="preserve">]</w:t>
-      </w:r>
-      <w:r>
-        <w:t xml:space="preserve">. He co-founded the payments company Monoova and was its CEO for almost ten years, until 2026 </w:t>
-      </w:r>
-      <w:r>
-        <w:rPr>
-          <w:color w:val="8E1B2C"/>
-          <w:sz w:val="15"/>
-          <w:szCs w:val="15"/>
-        </w:rPr>
-        <w:t xml:space="preserve">[</w:t>
-      </w:r>
-      <w:hyperlink w:history="1" r:id="rId8ybch_prrqhb4yl44jhob">
-        <w:r>
-          <w:rPr>
-            <w:color w:val="8E1B2C"/>
-            <w:sz w:val="15"/>
-            <w:szCs w:val="15"/>
-            <w:u w:val="single"/>
-          </w:rPr>
-          <w:t xml:space="preserve">Redbelly</w:t>
-        </w:r>
-      </w:hyperlink>
-      <w:r>
-        <w:rPr>
-          <w:color w:val="8E1B2C"/>
-          <w:sz w:val="15"/>
-          <w:szCs w:val="15"/>
-        </w:rPr>
-        <w:t xml:space="preserve"> · </w:t>
-      </w:r>
-      <w:hyperlink w:history="1" r:id="rIdhp3cqdkgzbf33kvdgveim">
-        <w:r>
-          <w:rPr>
-            <w:color w:val="8E1B2C"/>
-            <w:sz w:val="15"/>
-            <w:szCs w:val="15"/>
-            <w:u w:val="single"/>
-          </w:rPr>
-          <w:t xml:space="preserve">Banking Day</w:t>
-        </w:r>
-      </w:hyperlink>
-      <w:r>
-        <w:rPr>
-          <w:color w:val="8E1B2C"/>
-          <w:sz w:val="15"/>
-          <w:szCs w:val="15"/>
-        </w:rPr>
-        <w:t xml:space="preserve"> · </w:t>
-      </w:r>
-      <w:hyperlink w:history="1" r:id="rId_equjfexggtj0h83_ksuu">
-        <w:r>
-          <w:rPr>
-            <w:color w:val="8E1B2C"/>
-            <w:sz w:val="15"/>
-            <w:szCs w:val="15"/>
-            <w:u w:val="single"/>
-          </w:rPr>
-          <w:t xml:space="preserve">LinkedIn</w:t>
-        </w:r>
-      </w:hyperlink>
-      <w:r>
-        <w:rPr>
-          <w:color w:val="8E1B2C"/>
-          <w:sz w:val="15"/>
-          <w:szCs w:val="15"/>
-        </w:rPr>
-        <w:t xml:space="preserve">]</w:t>
-      </w:r>
-      <w:r>
-        <w:t xml:space="preserve">. Redbelly says he joins “to lead the company’s push into regulated tokenisation” </w:t>
-      </w:r>
-      <w:r>
-        <w:rPr>
-          <w:color w:val="8E1B2C"/>
-          <w:sz w:val="15"/>
-          <w:szCs w:val="15"/>
-        </w:rPr>
-        <w:t xml:space="preserve">[</w:t>
-      </w:r>
-      <w:hyperlink w:history="1" r:id="rIdwq_tifikotits_7bk0uia">
-        <w:r>
-          <w:rPr>
-            <w:color w:val="8E1B2C"/>
-            <w:sz w:val="15"/>
-            <w:szCs w:val="15"/>
-            <w:u w:val="single"/>
-          </w:rPr>
-          <w:t xml:space="preserve">Redbelly</w:t>
-        </w:r>
-      </w:hyperlink>
-      <w:r>
-        <w:rPr>
-          <w:color w:val="8E1B2C"/>
-          <w:sz w:val="15"/>
-          <w:szCs w:val="15"/>
-        </w:rPr>
-        <w:t xml:space="preserve"> · </w:t>
-      </w:r>
-      <w:hyperlink w:history="1" r:id="rIdvsqevjvyirtyx7-gtufqa">
-        <w:r>
-          <w:rPr>
-            <w:color w:val="8E1B2C"/>
-            <w:sz w:val="15"/>
-            <w:szCs w:val="15"/>
-            <w:u w:val="single"/>
-          </w:rPr>
-          <w:t xml:space="preserve">SMB Tech</w:t>
-        </w:r>
-      </w:hyperlink>
-      <w:r>
-        <w:rPr>
-          <w:color w:val="8E1B2C"/>
-          <w:sz w:val="15"/>
-          <w:szCs w:val="15"/>
-        </w:rPr>
-        <w:t xml:space="preserve">]</w:t>
-      </w:r>
-      <w:r>
-        <w:t xml:space="preserve">, a strategy delivered through Tokeniser, which “brings fund and equity administration on-chain for regulated markets” </w:t>
-      </w:r>
-      <w:r>
-        <w:rPr>
-          <w:color w:val="8E1B2C"/>
-          <w:sz w:val="15"/>
-          <w:szCs w:val="15"/>
-        </w:rPr>
-        <w:t xml:space="preserve">[</w:t>
-      </w:r>
-      <w:hyperlink w:history="1" r:id="rIdj9obgxldjvl6ge0f5bu6a">
-        <w:r>
-          <w:rPr>
-            <w:color w:val="8E1B2C"/>
-            <w:sz w:val="15"/>
-            <w:szCs w:val="15"/>
-            <w:u w:val="single"/>
-          </w:rPr>
-          <w:t xml:space="preserve">Redbelly</w:t>
-        </w:r>
-      </w:hyperlink>
-      <w:r>
-        <w:rPr>
-          <w:color w:val="8E1B2C"/>
-          <w:sz w:val="15"/>
-          <w:szCs w:val="15"/>
-        </w:rPr>
-        <w:t xml:space="preserve">]</w:t>
-      </w:r>
-      <w:r>
-        <w:t xml:space="preserve">.</w:t>
-      </w:r>
-    </w:p>
-    <w:p>
-      <w:pPr>
-        <w:pBdr>
-          <w:left w:val="single" w:color="B7791F" w:sz="18" w:space="8"/>
-        </w:pBdr>
-        <w:shd w:fill="FBF5E6" w:color="auto" w:val="clear"/>
-        <w:spacing w:after="120" w:before="40"/>
-        <w:ind w:left="170" w:right="113"/>
-      </w:pPr>
-      <w:r>
-        <w:rPr>
-          <w:b/>
-          <w:bCs/>
-          <w:color w:val="7A4E0E"/>
-          <w:spacing w:val="10"/>
-          <w:sz w:val="16"/>
-          <w:szCs w:val="16"/>
+          <w:color w:val="B3272A"/>
+          <w:spacing w:val="15"/>
+          <w:sz w:val="14"/>
+          <w:szCs w:val="14"/>
         </w:rPr>
         <w:t xml:space="preserve">ANALYSIS · IN BRIEF</w:t>
       </w:r>
@@ -368,18 +490,18 @@
       </w:r>
       <w:r>
         <w:rPr>
-          <w:color w:val="8E1B2C"/>
-          <w:sz w:val="15"/>
-          <w:szCs w:val="15"/>
-        </w:rPr>
-        <w:t xml:space="preserve">[</w:t>
-      </w:r>
-      <w:hyperlink w:history="1" r:id="rId5tr3mrehwqv6irni9clja">
-        <w:r>
-          <w:rPr>
-            <w:color w:val="8E1B2C"/>
-            <w:sz w:val="15"/>
-            <w:szCs w:val="15"/>
+          <w:color w:val="B3272A"/>
+          <w:sz w:val="13"/>
+          <w:szCs w:val="13"/>
+        </w:rPr>
+        <w:t xml:space="preserve">[</w:t>
+      </w:r>
+      <w:hyperlink w:history="1" r:id="rIdgnz4xbdn6twqprdabth4z">
+        <w:r>
+          <w:rPr>
+            <w:color w:val="B3272A"/>
+            <w:sz w:val="13"/>
+            <w:szCs w:val="13"/>
             <w:u w:val="single"/>
           </w:rPr>
           <w:t xml:space="preserve">Monoova</w:t>
@@ -387,9 +509,9 @@
       </w:hyperlink>
       <w:r>
         <w:rPr>
-          <w:color w:val="8E1B2C"/>
-          <w:sz w:val="15"/>
-          <w:szCs w:val="15"/>
+          <w:color w:val="B3272A"/>
+          <w:sz w:val="13"/>
+          <w:szCs w:val="13"/>
         </w:rPr>
         <w:t xml:space="preserve">]</w:t>
       </w:r>
@@ -398,18 +520,18 @@
       </w:r>
       <w:r>
         <w:rPr>
-          <w:color w:val="8E1B2C"/>
-          <w:sz w:val="15"/>
-          <w:szCs w:val="15"/>
-        </w:rPr>
-        <w:t xml:space="preserve">[</w:t>
-      </w:r>
-      <w:hyperlink w:history="1" r:id="rIdnk2bk0riv2anope6gvds7">
-        <w:r>
-          <w:rPr>
-            <w:color w:val="8E1B2C"/>
-            <w:sz w:val="15"/>
-            <w:szCs w:val="15"/>
+          <w:color w:val="B3272A"/>
+          <w:sz w:val="13"/>
+          <w:szCs w:val="13"/>
+        </w:rPr>
+        <w:t xml:space="preserve">[</w:t>
+      </w:r>
+      <w:hyperlink w:history="1" r:id="rIdz_pmyystkgamn_-6smi_w">
+        <w:r>
+          <w:rPr>
+            <w:color w:val="B3272A"/>
+            <w:sz w:val="13"/>
+            <w:szCs w:val="13"/>
             <w:u w:val="single"/>
           </w:rPr>
           <w:t xml:space="preserve">Tokeniser/settlement</w:t>
@@ -417,9 +539,9 @@
       </w:hyperlink>
       <w:r>
         <w:rPr>
-          <w:color w:val="8E1B2C"/>
-          <w:sz w:val="15"/>
-          <w:szCs w:val="15"/>
+          <w:color w:val="B3272A"/>
+          <w:sz w:val="13"/>
+          <w:szCs w:val="13"/>
         </w:rPr>
         <w:t xml:space="preserve">]</w:t>
       </w:r>
@@ -456,12 +578,12 @@
           <w:tcPr>
             <w:tcW w:type="dxa" w:w="1500"/>
             <w:tcBorders>
-              <w:top w:val="single" w:color="D5D9DE" w:sz="4"/>
-              <w:left w:val="single" w:color="D5D9DE" w:sz="4"/>
-              <w:bottom w:val="single" w:color="D5D9DE" w:sz="4"/>
-              <w:right w:val="single" w:color="D5D9DE" w:sz="4"/>
+              <w:top w:val="single" w:color="D3DBE1" w:sz="4"/>
+              <w:left w:val="single" w:color="D3DBE1" w:sz="4"/>
+              <w:bottom w:val="single" w:color="D3DBE1" w:sz="4"/>
+              <w:right w:val="single" w:color="D3DBE1" w:sz="4"/>
             </w:tcBorders>
-            <w:shd w:fill="F2F3F5" w:color="auto" w:val="clear"/>
+            <w:shd w:fill="EDF1F4" w:color="auto" w:val="clear"/>
             <w:tcMar>
               <w:top w:type="dxa" w:w="50"/>
               <w:left w:type="dxa" w:w="90"/>
@@ -477,8 +599,8 @@
               <w:rPr>
                 <w:b/>
                 <w:bCs/>
-                <w:sz w:val="18"/>
-                <w:szCs w:val="18"/>
+                <w:sz w:val="16"/>
+                <w:szCs w:val="16"/>
               </w:rPr>
               <w:t xml:space="preserve">NPP</w:t>
             </w:r>
@@ -488,10 +610,10 @@
           <w:tcPr>
             <w:tcW w:type="dxa" w:w="8252"/>
             <w:tcBorders>
-              <w:top w:val="single" w:color="D5D9DE" w:sz="4"/>
-              <w:left w:val="single" w:color="D5D9DE" w:sz="4"/>
-              <w:bottom w:val="single" w:color="D5D9DE" w:sz="4"/>
-              <w:right w:val="single" w:color="D5D9DE" w:sz="4"/>
+              <w:top w:val="single" w:color="D3DBE1" w:sz="4"/>
+              <w:left w:val="single" w:color="D3DBE1" w:sz="4"/>
+              <w:bottom w:val="single" w:color="D3DBE1" w:sz="4"/>
+              <w:right w:val="single" w:color="D3DBE1" w:sz="4"/>
             </w:tcBorders>
             <w:tcMar>
               <w:top w:type="dxa" w:w="50"/>
@@ -506,25 +628,25 @@
             </w:pPr>
             <w:r>
               <w:rPr>
-                <w:sz w:val="18"/>
-                <w:szCs w:val="18"/>
+                <w:sz w:val="16"/>
+                <w:szCs w:val="16"/>
               </w:rPr>
               <w:t xml:space="preserve">New Payments Platform: the infrastructure for real-time payments in Australia, including PayID and PayTo payments </w:t>
             </w:r>
             <w:r>
               <w:rPr>
-                <w:color w:val="8E1B2C"/>
-                <w:sz w:val="15"/>
-                <w:szCs w:val="15"/>
+                <w:color w:val="B3272A"/>
+                <w:sz w:val="13"/>
+                <w:szCs w:val="13"/>
               </w:rPr>
               <w:t xml:space="preserve">[</w:t>
             </w:r>
-            <w:hyperlink w:history="1" r:id="rIdf6ascvmj8tbglion1vz7r">
+            <w:hyperlink w:history="1" r:id="rIdkcfyreoyw0x8wwuhwek-u">
               <w:r>
                 <w:rPr>
-                  <w:color w:val="8E1B2C"/>
-                  <w:sz w:val="15"/>
-                  <w:szCs w:val="15"/>
+                  <w:color w:val="B3272A"/>
+                  <w:sz w:val="13"/>
+                  <w:szCs w:val="13"/>
                   <w:u w:val="single"/>
                 </w:rPr>
                 <w:t xml:space="preserve">Monoova</w:t>
@@ -532,18 +654,18 @@
             </w:hyperlink>
             <w:r>
               <w:rPr>
-                <w:color w:val="8E1B2C"/>
-                <w:sz w:val="15"/>
-                <w:szCs w:val="15"/>
+                <w:color w:val="B3272A"/>
+                <w:sz w:val="13"/>
+                <w:szCs w:val="13"/>
               </w:rPr>
               <w:t xml:space="preserve"> · </w:t>
             </w:r>
-            <w:hyperlink w:history="1" r:id="rId9yhbgyrlfo7lih2eo4q8l">
+            <w:hyperlink w:history="1" r:id="rIdc2t3ylt4ug4tlgokr71cn">
               <w:r>
                 <w:rPr>
-                  <w:color w:val="8E1B2C"/>
-                  <w:sz w:val="15"/>
-                  <w:szCs w:val="15"/>
+                  <w:color w:val="B3272A"/>
+                  <w:sz w:val="13"/>
+                  <w:szCs w:val="13"/>
                   <w:u w:val="single"/>
                 </w:rPr>
                 <w:t xml:space="preserve">AusPayPlus</w:t>
@@ -551,16 +673,16 @@
             </w:hyperlink>
             <w:r>
               <w:rPr>
-                <w:color w:val="8E1B2C"/>
-                <w:sz w:val="15"/>
-                <w:szCs w:val="15"/>
+                <w:color w:val="B3272A"/>
+                <w:sz w:val="13"/>
+                <w:szCs w:val="13"/>
               </w:rPr>
               <w:t xml:space="preserve">]</w:t>
             </w:r>
             <w:r>
               <w:rPr>
-                <w:sz w:val="18"/>
-                <w:szCs w:val="18"/>
+                <w:sz w:val="16"/>
+                <w:szCs w:val="16"/>
               </w:rPr>
               <w:t xml:space="preserve">.</w:t>
             </w:r>
@@ -572,12 +694,12 @@
           <w:tcPr>
             <w:tcW w:type="dxa" w:w="1500"/>
             <w:tcBorders>
-              <w:top w:val="single" w:color="D5D9DE" w:sz="4"/>
-              <w:left w:val="single" w:color="D5D9DE" w:sz="4"/>
-              <w:bottom w:val="single" w:color="D5D9DE" w:sz="4"/>
-              <w:right w:val="single" w:color="D5D9DE" w:sz="4"/>
+              <w:top w:val="single" w:color="D3DBE1" w:sz="4"/>
+              <w:left w:val="single" w:color="D3DBE1" w:sz="4"/>
+              <w:bottom w:val="single" w:color="D3DBE1" w:sz="4"/>
+              <w:right w:val="single" w:color="D3DBE1" w:sz="4"/>
             </w:tcBorders>
-            <w:shd w:fill="F2F3F5" w:color="auto" w:val="clear"/>
+            <w:shd w:fill="EDF1F4" w:color="auto" w:val="clear"/>
             <w:tcMar>
               <w:top w:type="dxa" w:w="50"/>
               <w:left w:type="dxa" w:w="90"/>
@@ -593,8 +715,8 @@
               <w:rPr>
                 <w:b/>
                 <w:bCs/>
-                <w:sz w:val="18"/>
-                <w:szCs w:val="18"/>
+                <w:sz w:val="16"/>
+                <w:szCs w:val="16"/>
               </w:rPr>
               <w:t xml:space="preserve">PayID</w:t>
             </w:r>
@@ -604,10 +726,10 @@
           <w:tcPr>
             <w:tcW w:type="dxa" w:w="8252"/>
             <w:tcBorders>
-              <w:top w:val="single" w:color="D5D9DE" w:sz="4"/>
-              <w:left w:val="single" w:color="D5D9DE" w:sz="4"/>
-              <w:bottom w:val="single" w:color="D5D9DE" w:sz="4"/>
-              <w:right w:val="single" w:color="D5D9DE" w:sz="4"/>
+              <w:top w:val="single" w:color="D3DBE1" w:sz="4"/>
+              <w:left w:val="single" w:color="D3DBE1" w:sz="4"/>
+              <w:bottom w:val="single" w:color="D3DBE1" w:sz="4"/>
+              <w:right w:val="single" w:color="D3DBE1" w:sz="4"/>
             </w:tcBorders>
             <w:tcMar>
               <w:top w:type="dxa" w:w="50"/>
@@ -622,25 +744,25 @@
             </w:pPr>
             <w:r>
               <w:rPr>
-                <w:sz w:val="18"/>
-                <w:szCs w:val="18"/>
+                <w:sz w:val="16"/>
+                <w:szCs w:val="16"/>
               </w:rPr>
               <w:t xml:space="preserve">An identifier such as an email address or phone number that replaces BSB and account numbers when paying </w:t>
             </w:r>
             <w:r>
               <w:rPr>
-                <w:color w:val="8E1B2C"/>
-                <w:sz w:val="15"/>
-                <w:szCs w:val="15"/>
+                <w:color w:val="B3272A"/>
+                <w:sz w:val="13"/>
+                <w:szCs w:val="13"/>
               </w:rPr>
               <w:t xml:space="preserve">[</w:t>
             </w:r>
-            <w:hyperlink w:history="1" r:id="rIdedfwbbu6emn77yv9rq1n1">
+            <w:hyperlink w:history="1" r:id="rId3dnrguoxxcydarxhv49wm">
               <w:r>
                 <w:rPr>
-                  <w:color w:val="8E1B2C"/>
-                  <w:sz w:val="15"/>
-                  <w:szCs w:val="15"/>
+                  <w:color w:val="B3272A"/>
+                  <w:sz w:val="13"/>
+                  <w:szCs w:val="13"/>
                   <w:u w:val="single"/>
                 </w:rPr>
                 <w:t xml:space="preserve">Monoova</w:t>
@@ -648,16 +770,16 @@
             </w:hyperlink>
             <w:r>
               <w:rPr>
-                <w:color w:val="8E1B2C"/>
-                <w:sz w:val="15"/>
-                <w:szCs w:val="15"/>
+                <w:color w:val="B3272A"/>
+                <w:sz w:val="13"/>
+                <w:szCs w:val="13"/>
               </w:rPr>
               <w:t xml:space="preserve">]</w:t>
             </w:r>
             <w:r>
               <w:rPr>
-                <w:sz w:val="18"/>
-                <w:szCs w:val="18"/>
+                <w:sz w:val="16"/>
+                <w:szCs w:val="16"/>
               </w:rPr>
               <w:t xml:space="preserve">.</w:t>
             </w:r>
@@ -669,12 +791,12 @@
           <w:tcPr>
             <w:tcW w:type="dxa" w:w="1500"/>
             <w:tcBorders>
-              <w:top w:val="single" w:color="D5D9DE" w:sz="4"/>
-              <w:left w:val="single" w:color="D5D9DE" w:sz="4"/>
-              <w:bottom w:val="single" w:color="D5D9DE" w:sz="4"/>
-              <w:right w:val="single" w:color="D5D9DE" w:sz="4"/>
+              <w:top w:val="single" w:color="D3DBE1" w:sz="4"/>
+              <w:left w:val="single" w:color="D3DBE1" w:sz="4"/>
+              <w:bottom w:val="single" w:color="D3DBE1" w:sz="4"/>
+              <w:right w:val="single" w:color="D3DBE1" w:sz="4"/>
             </w:tcBorders>
-            <w:shd w:fill="F2F3F5" w:color="auto" w:val="clear"/>
+            <w:shd w:fill="EDF1F4" w:color="auto" w:val="clear"/>
             <w:tcMar>
               <w:top w:type="dxa" w:w="50"/>
               <w:left w:type="dxa" w:w="90"/>
@@ -690,8 +812,8 @@
               <w:rPr>
                 <w:b/>
                 <w:bCs/>
-                <w:sz w:val="18"/>
-                <w:szCs w:val="18"/>
+                <w:sz w:val="16"/>
+                <w:szCs w:val="16"/>
               </w:rPr>
               <w:t xml:space="preserve">PayTo</w:t>
             </w:r>
@@ -701,10 +823,10 @@
           <w:tcPr>
             <w:tcW w:type="dxa" w:w="8252"/>
             <w:tcBorders>
-              <w:top w:val="single" w:color="D5D9DE" w:sz="4"/>
-              <w:left w:val="single" w:color="D5D9DE" w:sz="4"/>
-              <w:bottom w:val="single" w:color="D5D9DE" w:sz="4"/>
-              <w:right w:val="single" w:color="D5D9DE" w:sz="4"/>
+              <w:top w:val="single" w:color="D3DBE1" w:sz="4"/>
+              <w:left w:val="single" w:color="D3DBE1" w:sz="4"/>
+              <w:bottom w:val="single" w:color="D3DBE1" w:sz="4"/>
+              <w:right w:val="single" w:color="D3DBE1" w:sz="4"/>
             </w:tcBorders>
             <w:tcMar>
               <w:top w:type="dxa" w:w="50"/>
@@ -719,25 +841,25 @@
             </w:pPr>
             <w:r>
               <w:rPr>
-                <w:sz w:val="18"/>
-                <w:szCs w:val="18"/>
+                <w:sz w:val="16"/>
+                <w:szCs w:val="16"/>
               </w:rPr>
               <w:t xml:space="preserve">Works “like a modern, real-time, direct debit”: the customer approves a digital agreement in their mobile or online banking, then the business can request payments that transfer instantly </w:t>
             </w:r>
             <w:r>
               <w:rPr>
-                <w:color w:val="8E1B2C"/>
-                <w:sz w:val="15"/>
-                <w:szCs w:val="15"/>
+                <w:color w:val="B3272A"/>
+                <w:sz w:val="13"/>
+                <w:szCs w:val="13"/>
               </w:rPr>
               <w:t xml:space="preserve">[</w:t>
             </w:r>
-            <w:hyperlink w:history="1" r:id="rIdwcjngshpqwvrqbaqgfgip">
+            <w:hyperlink w:history="1" r:id="rIdv-drzpktpllkbdmxq3yby">
               <w:r>
                 <w:rPr>
-                  <w:color w:val="8E1B2C"/>
-                  <w:sz w:val="15"/>
-                  <w:szCs w:val="15"/>
+                  <w:color w:val="B3272A"/>
+                  <w:sz w:val="13"/>
+                  <w:szCs w:val="13"/>
                   <w:u w:val="single"/>
                 </w:rPr>
                 <w:t xml:space="preserve">Monoova</w:t>
@@ -745,16 +867,16 @@
             </w:hyperlink>
             <w:r>
               <w:rPr>
-                <w:color w:val="8E1B2C"/>
-                <w:sz w:val="15"/>
-                <w:szCs w:val="15"/>
+                <w:color w:val="B3272A"/>
+                <w:sz w:val="13"/>
+                <w:szCs w:val="13"/>
               </w:rPr>
               <w:t xml:space="preserve">]</w:t>
             </w:r>
             <w:r>
               <w:rPr>
-                <w:sz w:val="18"/>
-                <w:szCs w:val="18"/>
+                <w:sz w:val="16"/>
+                <w:szCs w:val="16"/>
               </w:rPr>
               <w:t xml:space="preserve">.</w:t>
             </w:r>
@@ -766,12 +888,12 @@
           <w:tcPr>
             <w:tcW w:type="dxa" w:w="1500"/>
             <w:tcBorders>
-              <w:top w:val="single" w:color="D5D9DE" w:sz="4"/>
-              <w:left w:val="single" w:color="D5D9DE" w:sz="4"/>
-              <w:bottom w:val="single" w:color="D5D9DE" w:sz="4"/>
-              <w:right w:val="single" w:color="D5D9DE" w:sz="4"/>
+              <w:top w:val="single" w:color="D3DBE1" w:sz="4"/>
+              <w:left w:val="single" w:color="D3DBE1" w:sz="4"/>
+              <w:bottom w:val="single" w:color="D3DBE1" w:sz="4"/>
+              <w:right w:val="single" w:color="D3DBE1" w:sz="4"/>
             </w:tcBorders>
-            <w:shd w:fill="F2F3F5" w:color="auto" w:val="clear"/>
+            <w:shd w:fill="EDF1F4" w:color="auto" w:val="clear"/>
             <w:tcMar>
               <w:top w:type="dxa" w:w="50"/>
               <w:left w:type="dxa" w:w="90"/>
@@ -787,8 +909,8 @@
               <w:rPr>
                 <w:b/>
                 <w:bCs/>
-                <w:sz w:val="18"/>
-                <w:szCs w:val="18"/>
+                <w:sz w:val="16"/>
+                <w:szCs w:val="16"/>
               </w:rPr>
               <w:t xml:space="preserve">API</w:t>
             </w:r>
@@ -798,10 +920,10 @@
           <w:tcPr>
             <w:tcW w:type="dxa" w:w="8252"/>
             <w:tcBorders>
-              <w:top w:val="single" w:color="D5D9DE" w:sz="4"/>
-              <w:left w:val="single" w:color="D5D9DE" w:sz="4"/>
-              <w:bottom w:val="single" w:color="D5D9DE" w:sz="4"/>
-              <w:right w:val="single" w:color="D5D9DE" w:sz="4"/>
+              <w:top w:val="single" w:color="D3DBE1" w:sz="4"/>
+              <w:left w:val="single" w:color="D3DBE1" w:sz="4"/>
+              <w:bottom w:val="single" w:color="D3DBE1" w:sz="4"/>
+              <w:right w:val="single" w:color="D3DBE1" w:sz="4"/>
             </w:tcBorders>
             <w:tcMar>
               <w:top w:type="dxa" w:w="50"/>
@@ -816,25 +938,25 @@
             </w:pPr>
             <w:r>
               <w:rPr>
-                <w:sz w:val="18"/>
-                <w:szCs w:val="18"/>
+                <w:sz w:val="16"/>
+                <w:szCs w:val="16"/>
               </w:rPr>
               <w:t xml:space="preserve">A direct connection between software systems; in payments, “a single API integration connects real-time payments directly to an organisation’s software system” </w:t>
             </w:r>
             <w:r>
               <w:rPr>
-                <w:color w:val="8E1B2C"/>
-                <w:sz w:val="15"/>
-                <w:szCs w:val="15"/>
+                <w:color w:val="B3272A"/>
+                <w:sz w:val="13"/>
+                <w:szCs w:val="13"/>
               </w:rPr>
               <w:t xml:space="preserve">[</w:t>
             </w:r>
-            <w:hyperlink w:history="1" r:id="rIdqfzjktv7jyimnzpcdktvh">
+            <w:hyperlink w:history="1" r:id="rIdfbbl-an0l9qt2utzafwrw">
               <w:r>
                 <w:rPr>
-                  <w:color w:val="8E1B2C"/>
-                  <w:sz w:val="15"/>
-                  <w:szCs w:val="15"/>
+                  <w:color w:val="B3272A"/>
+                  <w:sz w:val="13"/>
+                  <w:szCs w:val="13"/>
                   <w:u w:val="single"/>
                 </w:rPr>
                 <w:t xml:space="preserve">AusPayPlus</w:t>
@@ -842,16 +964,16 @@
             </w:hyperlink>
             <w:r>
               <w:rPr>
-                <w:color w:val="8E1B2C"/>
-                <w:sz w:val="15"/>
-                <w:szCs w:val="15"/>
+                <w:color w:val="B3272A"/>
+                <w:sz w:val="13"/>
+                <w:szCs w:val="13"/>
               </w:rPr>
               <w:t xml:space="preserve">]</w:t>
             </w:r>
             <w:r>
               <w:rPr>
-                <w:sz w:val="18"/>
-                <w:szCs w:val="18"/>
+                <w:sz w:val="16"/>
+                <w:szCs w:val="16"/>
               </w:rPr>
               <w:t xml:space="preserve">.</w:t>
             </w:r>
@@ -863,12 +985,12 @@
           <w:tcPr>
             <w:tcW w:type="dxa" w:w="1500"/>
             <w:tcBorders>
-              <w:top w:val="single" w:color="D5D9DE" w:sz="4"/>
-              <w:left w:val="single" w:color="D5D9DE" w:sz="4"/>
-              <w:bottom w:val="single" w:color="D5D9DE" w:sz="4"/>
-              <w:right w:val="single" w:color="D5D9DE" w:sz="4"/>
+              <w:top w:val="single" w:color="D3DBE1" w:sz="4"/>
+              <w:left w:val="single" w:color="D3DBE1" w:sz="4"/>
+              <w:bottom w:val="single" w:color="D3DBE1" w:sz="4"/>
+              <w:right w:val="single" w:color="D3DBE1" w:sz="4"/>
             </w:tcBorders>
-            <w:shd w:fill="F2F3F5" w:color="auto" w:val="clear"/>
+            <w:shd w:fill="EDF1F4" w:color="auto" w:val="clear"/>
             <w:tcMar>
               <w:top w:type="dxa" w:w="50"/>
               <w:left w:type="dxa" w:w="90"/>
@@ -884,8 +1006,8 @@
               <w:rPr>
                 <w:b/>
                 <w:bCs/>
-                <w:sz w:val="18"/>
-                <w:szCs w:val="18"/>
+                <w:sz w:val="16"/>
+                <w:szCs w:val="16"/>
               </w:rPr>
               <w:t xml:space="preserve">Reconciliation</w:t>
             </w:r>
@@ -895,10 +1017,10 @@
           <w:tcPr>
             <w:tcW w:type="dxa" w:w="8252"/>
             <w:tcBorders>
-              <w:top w:val="single" w:color="D5D9DE" w:sz="4"/>
-              <w:left w:val="single" w:color="D5D9DE" w:sz="4"/>
-              <w:bottom w:val="single" w:color="D5D9DE" w:sz="4"/>
-              <w:right w:val="single" w:color="D5D9DE" w:sz="4"/>
+              <w:top w:val="single" w:color="D3DBE1" w:sz="4"/>
+              <w:left w:val="single" w:color="D3DBE1" w:sz="4"/>
+              <w:bottom w:val="single" w:color="D3DBE1" w:sz="4"/>
+              <w:right w:val="single" w:color="D3DBE1" w:sz="4"/>
             </w:tcBorders>
             <w:tcMar>
               <w:top w:type="dxa" w:w="50"/>
@@ -913,25 +1035,25 @@
             </w:pPr>
             <w:r>
               <w:rPr>
-                <w:sz w:val="18"/>
-                <w:szCs w:val="18"/>
+                <w:sz w:val="16"/>
+                <w:szCs w:val="16"/>
               </w:rPr>
               <w:t xml:space="preserve">Matching each incoming payment to the customer who made it; done manually, it relies on payment references </w:t>
             </w:r>
             <w:r>
               <w:rPr>
-                <w:color w:val="8E1B2C"/>
-                <w:sz w:val="15"/>
-                <w:szCs w:val="15"/>
+                <w:color w:val="B3272A"/>
+                <w:sz w:val="13"/>
+                <w:szCs w:val="13"/>
               </w:rPr>
               <w:t xml:space="preserve">[</w:t>
             </w:r>
-            <w:hyperlink w:history="1" r:id="rIdyll6ckimfjrwigzng0n18">
+            <w:hyperlink w:history="1" r:id="rIdesguxx6xl1ve4cxsywadp">
               <w:r>
                 <w:rPr>
-                  <w:color w:val="8E1B2C"/>
-                  <w:sz w:val="15"/>
-                  <w:szCs w:val="15"/>
+                  <w:color w:val="B3272A"/>
+                  <w:sz w:val="13"/>
+                  <w:szCs w:val="13"/>
                   <w:u w:val="single"/>
                 </w:rPr>
                 <w:t xml:space="preserve">AusPayPlus</w:t>
@@ -939,16 +1061,16 @@
             </w:hyperlink>
             <w:r>
               <w:rPr>
-                <w:color w:val="8E1B2C"/>
-                <w:sz w:val="15"/>
-                <w:szCs w:val="15"/>
+                <w:color w:val="B3272A"/>
+                <w:sz w:val="13"/>
+                <w:szCs w:val="13"/>
               </w:rPr>
               <w:t xml:space="preserve">]</w:t>
             </w:r>
             <w:r>
               <w:rPr>
-                <w:sz w:val="18"/>
-                <w:szCs w:val="18"/>
+                <w:sz w:val="16"/>
+                <w:szCs w:val="16"/>
               </w:rPr>
               <w:t xml:space="preserve">.</w:t>
             </w:r>
@@ -960,12 +1082,12 @@
           <w:tcPr>
             <w:tcW w:type="dxa" w:w="1500"/>
             <w:tcBorders>
-              <w:top w:val="single" w:color="D5D9DE" w:sz="4"/>
-              <w:left w:val="single" w:color="D5D9DE" w:sz="4"/>
-              <w:bottom w:val="single" w:color="D5D9DE" w:sz="4"/>
-              <w:right w:val="single" w:color="D5D9DE" w:sz="4"/>
+              <w:top w:val="single" w:color="D3DBE1" w:sz="4"/>
+              <w:left w:val="single" w:color="D3DBE1" w:sz="4"/>
+              <w:bottom w:val="single" w:color="D3DBE1" w:sz="4"/>
+              <w:right w:val="single" w:color="D3DBE1" w:sz="4"/>
             </w:tcBorders>
-            <w:shd w:fill="F2F3F5" w:color="auto" w:val="clear"/>
+            <w:shd w:fill="EDF1F4" w:color="auto" w:val="clear"/>
             <w:tcMar>
               <w:top w:type="dxa" w:w="50"/>
               <w:left w:type="dxa" w:w="90"/>
@@ -981,8 +1103,8 @@
               <w:rPr>
                 <w:b/>
                 <w:bCs/>
-                <w:sz w:val="18"/>
-                <w:szCs w:val="18"/>
+                <w:sz w:val="16"/>
+                <w:szCs w:val="16"/>
               </w:rPr>
               <w:t xml:space="preserve">Tokenisation</w:t>
             </w:r>
@@ -992,10 +1114,10 @@
           <w:tcPr>
             <w:tcW w:type="dxa" w:w="8252"/>
             <w:tcBorders>
-              <w:top w:val="single" w:color="D5D9DE" w:sz="4"/>
-              <w:left w:val="single" w:color="D5D9DE" w:sz="4"/>
-              <w:bottom w:val="single" w:color="D5D9DE" w:sz="4"/>
-              <w:right w:val="single" w:color="D5D9DE" w:sz="4"/>
+              <w:top w:val="single" w:color="D3DBE1" w:sz="4"/>
+              <w:left w:val="single" w:color="D3DBE1" w:sz="4"/>
+              <w:bottom w:val="single" w:color="D3DBE1" w:sz="4"/>
+              <w:right w:val="single" w:color="D3DBE1" w:sz="4"/>
             </w:tcBorders>
             <w:tcMar>
               <w:top w:type="dxa" w:w="50"/>
@@ -1010,25 +1132,25 @@
             </w:pPr>
             <w:r>
               <w:rPr>
-                <w:sz w:val="18"/>
-                <w:szCs w:val="18"/>
+                <w:sz w:val="16"/>
+                <w:szCs w:val="16"/>
               </w:rPr>
               <w:t xml:space="preserve">Recording “ownership of financial products and services as digital tokens”, with the rules of the asset programmed in </w:t>
             </w:r>
             <w:r>
               <w:rPr>
-                <w:color w:val="8E1B2C"/>
-                <w:sz w:val="15"/>
-                <w:szCs w:val="15"/>
+                <w:color w:val="B3272A"/>
+                <w:sz w:val="13"/>
+                <w:szCs w:val="13"/>
               </w:rPr>
               <w:t xml:space="preserve">[</w:t>
             </w:r>
-            <w:hyperlink w:history="1" r:id="rIdwji2amxayacjksb05nbdq">
+            <w:hyperlink w:history="1" r:id="rIdcxjg3argcvg5zndh56iqs">
               <w:r>
                 <w:rPr>
-                  <w:color w:val="8E1B2C"/>
-                  <w:sz w:val="15"/>
-                  <w:szCs w:val="15"/>
+                  <w:color w:val="B3272A"/>
+                  <w:sz w:val="13"/>
+                  <w:szCs w:val="13"/>
                   <w:u w:val="single"/>
                 </w:rPr>
                 <w:t xml:space="preserve">Tokeniser</w:t>
@@ -1036,16 +1158,16 @@
             </w:hyperlink>
             <w:r>
               <w:rPr>
-                <w:color w:val="8E1B2C"/>
-                <w:sz w:val="15"/>
-                <w:szCs w:val="15"/>
+                <w:color w:val="B3272A"/>
+                <w:sz w:val="13"/>
+                <w:szCs w:val="13"/>
               </w:rPr>
               <w:t xml:space="preserve">]</w:t>
             </w:r>
             <w:r>
               <w:rPr>
-                <w:sz w:val="18"/>
-                <w:szCs w:val="18"/>
+                <w:sz w:val="16"/>
+                <w:szCs w:val="16"/>
               </w:rPr>
               <w:t xml:space="preserve">.</w:t>
             </w:r>
@@ -1057,12 +1179,12 @@
           <w:tcPr>
             <w:tcW w:type="dxa" w:w="1500"/>
             <w:tcBorders>
-              <w:top w:val="single" w:color="D5D9DE" w:sz="4"/>
-              <w:left w:val="single" w:color="D5D9DE" w:sz="4"/>
-              <w:bottom w:val="single" w:color="D5D9DE" w:sz="4"/>
-              <w:right w:val="single" w:color="D5D9DE" w:sz="4"/>
+              <w:top w:val="single" w:color="D3DBE1" w:sz="4"/>
+              <w:left w:val="single" w:color="D3DBE1" w:sz="4"/>
+              <w:bottom w:val="single" w:color="D3DBE1" w:sz="4"/>
+              <w:right w:val="single" w:color="D3DBE1" w:sz="4"/>
             </w:tcBorders>
-            <w:shd w:fill="F2F3F5" w:color="auto" w:val="clear"/>
+            <w:shd w:fill="EDF1F4" w:color="auto" w:val="clear"/>
             <w:tcMar>
               <w:top w:type="dxa" w:w="50"/>
               <w:left w:type="dxa" w:w="90"/>
@@ -1078,8 +1200,8 @@
               <w:rPr>
                 <w:b/>
                 <w:bCs/>
-                <w:sz w:val="18"/>
-                <w:szCs w:val="18"/>
+                <w:sz w:val="16"/>
+                <w:szCs w:val="16"/>
               </w:rPr>
               <w:t xml:space="preserve">T+2 / T+0</w:t>
             </w:r>
@@ -1089,10 +1211,10 @@
           <w:tcPr>
             <w:tcW w:type="dxa" w:w="8252"/>
             <w:tcBorders>
-              <w:top w:val="single" w:color="D5D9DE" w:sz="4"/>
-              <w:left w:val="single" w:color="D5D9DE" w:sz="4"/>
-              <w:bottom w:val="single" w:color="D5D9DE" w:sz="4"/>
-              <w:right w:val="single" w:color="D5D9DE" w:sz="4"/>
+              <w:top w:val="single" w:color="D3DBE1" w:sz="4"/>
+              <w:left w:val="single" w:color="D3DBE1" w:sz="4"/>
+              <w:bottom w:val="single" w:color="D3DBE1" w:sz="4"/>
+              <w:right w:val="single" w:color="D3DBE1" w:sz="4"/>
             </w:tcBorders>
             <w:tcMar>
               <w:top w:type="dxa" w:w="50"/>
@@ -1107,25 +1229,25 @@
             </w:pPr>
             <w:r>
               <w:rPr>
-                <w:sz w:val="18"/>
-                <w:szCs w:val="18"/>
+                <w:sz w:val="16"/>
+                <w:szCs w:val="16"/>
               </w:rPr>
               <w:t xml:space="preserve">Settlement two business days after a trade, as in listed funds, versus settlement at the point of trade </w:t>
             </w:r>
             <w:r>
               <w:rPr>
-                <w:color w:val="8E1B2C"/>
-                <w:sz w:val="15"/>
-                <w:szCs w:val="15"/>
+                <w:color w:val="B3272A"/>
+                <w:sz w:val="13"/>
+                <w:szCs w:val="13"/>
               </w:rPr>
               <w:t xml:space="preserve">[</w:t>
             </w:r>
-            <w:hyperlink w:history="1" r:id="rIdtozri4tnm1cl8-osl2qvk">
+            <w:hyperlink w:history="1" r:id="rIdkdnsxamprwisxrlbmttml">
               <w:r>
                 <w:rPr>
-                  <w:color w:val="8E1B2C"/>
-                  <w:sz w:val="15"/>
-                  <w:szCs w:val="15"/>
+                  <w:color w:val="B3272A"/>
+                  <w:sz w:val="13"/>
+                  <w:szCs w:val="13"/>
                   <w:u w:val="single"/>
                 </w:rPr>
                 <w:t xml:space="preserve">Tokeniser/settlement</w:t>
@@ -1133,16 +1255,16 @@
             </w:hyperlink>
             <w:r>
               <w:rPr>
-                <w:color w:val="8E1B2C"/>
-                <w:sz w:val="15"/>
-                <w:szCs w:val="15"/>
+                <w:color w:val="B3272A"/>
+                <w:sz w:val="13"/>
+                <w:szCs w:val="13"/>
               </w:rPr>
               <w:t xml:space="preserve">]</w:t>
             </w:r>
             <w:r>
               <w:rPr>
-                <w:sz w:val="18"/>
-                <w:szCs w:val="18"/>
+                <w:sz w:val="16"/>
+                <w:szCs w:val="16"/>
               </w:rPr>
               <w:t xml:space="preserve">.</w:t>
             </w:r>
@@ -1180,18 +1302,18 @@
       </w:r>
       <w:r>
         <w:rPr>
-          <w:color w:val="8E1B2C"/>
-          <w:sz w:val="15"/>
-          <w:szCs w:val="15"/>
-        </w:rPr>
-        <w:t xml:space="preserve">[</w:t>
-      </w:r>
-      <w:hyperlink w:history="1" r:id="rIdogtbpv14bjnsprghzm_bg">
-        <w:r>
-          <w:rPr>
-            <w:color w:val="8E1B2C"/>
-            <w:sz w:val="15"/>
-            <w:szCs w:val="15"/>
+          <w:color w:val="B3272A"/>
+          <w:sz w:val="13"/>
+          <w:szCs w:val="13"/>
+        </w:rPr>
+        <w:t xml:space="preserve">[</w:t>
+      </w:r>
+      <w:hyperlink w:history="1" r:id="rIdlkop83gohwgwwqxaclmzj">
+        <w:r>
+          <w:rPr>
+            <w:color w:val="B3272A"/>
+            <w:sz w:val="13"/>
+            <w:szCs w:val="13"/>
             <w:u w:val="single"/>
           </w:rPr>
           <w:t xml:space="preserve">Monoova</w:t>
@@ -1199,9 +1321,9 @@
       </w:hyperlink>
       <w:r>
         <w:rPr>
-          <w:color w:val="8E1B2C"/>
-          <w:sz w:val="15"/>
-          <w:szCs w:val="15"/>
+          <w:color w:val="B3272A"/>
+          <w:sz w:val="13"/>
+          <w:szCs w:val="13"/>
         </w:rPr>
         <w:t xml:space="preserve">]</w:t>
       </w:r>
@@ -1223,18 +1345,18 @@
       </w:r>
       <w:r>
         <w:rPr>
-          <w:color w:val="8E1B2C"/>
-          <w:sz w:val="15"/>
-          <w:szCs w:val="15"/>
-        </w:rPr>
-        <w:t xml:space="preserve">[</w:t>
-      </w:r>
-      <w:hyperlink w:history="1" r:id="rIdkkvuxubjfugwxbn5pvsmh">
-        <w:r>
-          <w:rPr>
-            <w:color w:val="8E1B2C"/>
-            <w:sz w:val="15"/>
-            <w:szCs w:val="15"/>
+          <w:color w:val="B3272A"/>
+          <w:sz w:val="13"/>
+          <w:szCs w:val="13"/>
+        </w:rPr>
+        <w:t xml:space="preserve">[</w:t>
+      </w:r>
+      <w:hyperlink w:history="1" r:id="rIdgwuvll_bby7b4m9i7yi34">
+        <w:r>
+          <w:rPr>
+            <w:color w:val="B3272A"/>
+            <w:sz w:val="13"/>
+            <w:szCs w:val="13"/>
             <w:u w:val="single"/>
           </w:rPr>
           <w:t xml:space="preserve">Redbelly</w:t>
@@ -1242,9 +1364,9 @@
       </w:hyperlink>
       <w:r>
         <w:rPr>
-          <w:color w:val="8E1B2C"/>
-          <w:sz w:val="15"/>
-          <w:szCs w:val="15"/>
+          <w:color w:val="B3272A"/>
+          <w:sz w:val="13"/>
+          <w:szCs w:val="13"/>
         </w:rPr>
         <w:t xml:space="preserve">]</w:t>
       </w:r>
@@ -1253,18 +1375,18 @@
       </w:r>
       <w:r>
         <w:rPr>
-          <w:color w:val="8E1B2C"/>
-          <w:sz w:val="15"/>
-          <w:szCs w:val="15"/>
-        </w:rPr>
-        <w:t xml:space="preserve">[</w:t>
-      </w:r>
-      <w:hyperlink w:history="1" r:id="rIdb7jb3n4roa3eemzhx6gtw">
-        <w:r>
-          <w:rPr>
-            <w:color w:val="8E1B2C"/>
-            <w:sz w:val="15"/>
-            <w:szCs w:val="15"/>
+          <w:color w:val="B3272A"/>
+          <w:sz w:val="13"/>
+          <w:szCs w:val="13"/>
+        </w:rPr>
+        <w:t xml:space="preserve">[</w:t>
+      </w:r>
+      <w:hyperlink w:history="1" r:id="rId9hcsuymuxiic5i5ywcfme">
+        <w:r>
+          <w:rPr>
+            <w:color w:val="B3272A"/>
+            <w:sz w:val="13"/>
+            <w:szCs w:val="13"/>
             <w:u w:val="single"/>
           </w:rPr>
           <w:t xml:space="preserve">Redbelly</w:t>
@@ -1272,9 +1394,9 @@
       </w:hyperlink>
       <w:r>
         <w:rPr>
-          <w:color w:val="8E1B2C"/>
-          <w:sz w:val="15"/>
-          <w:szCs w:val="15"/>
+          <w:color w:val="B3272A"/>
+          <w:sz w:val="13"/>
+          <w:szCs w:val="13"/>
         </w:rPr>
         <w:t xml:space="preserve">]</w:t>
       </w:r>
@@ -1283,18 +1405,18 @@
       </w:r>
       <w:r>
         <w:rPr>
-          <w:color w:val="8E1B2C"/>
-          <w:sz w:val="15"/>
-          <w:szCs w:val="15"/>
-        </w:rPr>
-        <w:t xml:space="preserve">[</w:t>
-      </w:r>
-      <w:hyperlink w:history="1" r:id="rIdjeyezyxmloarh2yjo9pj3">
-        <w:r>
-          <w:rPr>
-            <w:color w:val="8E1B2C"/>
-            <w:sz w:val="15"/>
-            <w:szCs w:val="15"/>
+          <w:color w:val="B3272A"/>
+          <w:sz w:val="13"/>
+          <w:szCs w:val="13"/>
+        </w:rPr>
+        <w:t xml:space="preserve">[</w:t>
+      </w:r>
+      <w:hyperlink w:history="1" r:id="rIdkpo5yygpmpdjnp9u_5so8">
+        <w:r>
+          <w:rPr>
+            <w:color w:val="B3272A"/>
+            <w:sz w:val="13"/>
+            <w:szCs w:val="13"/>
             <w:u w:val="single"/>
           </w:rPr>
           <w:t xml:space="preserve">Redbelly</w:t>
@@ -1302,9 +1424,9 @@
       </w:hyperlink>
       <w:r>
         <w:rPr>
-          <w:color w:val="8E1B2C"/>
-          <w:sz w:val="15"/>
-          <w:szCs w:val="15"/>
+          <w:color w:val="B3272A"/>
+          <w:sz w:val="13"/>
+          <w:szCs w:val="13"/>
         </w:rPr>
         <w:t xml:space="preserve">]</w:t>
       </w:r>
@@ -1326,18 +1448,18 @@
       </w:r>
       <w:r>
         <w:rPr>
-          <w:color w:val="8E1B2C"/>
-          <w:sz w:val="15"/>
-          <w:szCs w:val="15"/>
-        </w:rPr>
-        <w:t xml:space="preserve">[</w:t>
-      </w:r>
-      <w:hyperlink w:history="1" r:id="rIdkqqrz8iyfbsucw51w5knz">
-        <w:r>
-          <w:rPr>
-            <w:color w:val="8E1B2C"/>
-            <w:sz w:val="15"/>
-            <w:szCs w:val="15"/>
+          <w:color w:val="B3272A"/>
+          <w:sz w:val="13"/>
+          <w:szCs w:val="13"/>
+        </w:rPr>
+        <w:t xml:space="preserve">[</w:t>
+      </w:r>
+      <w:hyperlink w:history="1" r:id="rIdhqcwjj9deurdbunopdyu_">
+        <w:r>
+          <w:rPr>
+            <w:color w:val="B3272A"/>
+            <w:sz w:val="13"/>
+            <w:szCs w:val="13"/>
             <w:u w:val="single"/>
           </w:rPr>
           <w:t xml:space="preserve">Talking Business</w:t>
@@ -1345,9 +1467,9 @@
       </w:hyperlink>
       <w:r>
         <w:rPr>
-          <w:color w:val="8E1B2C"/>
-          <w:sz w:val="15"/>
-          <w:szCs w:val="15"/>
+          <w:color w:val="B3272A"/>
+          <w:sz w:val="13"/>
+          <w:szCs w:val="13"/>
         </w:rPr>
         <w:t xml:space="preserve">]</w:t>
       </w:r>
@@ -1369,18 +1491,18 @@
       </w:r>
       <w:r>
         <w:rPr>
-          <w:color w:val="8E1B2C"/>
-          <w:sz w:val="15"/>
-          <w:szCs w:val="15"/>
-        </w:rPr>
-        <w:t xml:space="preserve">[</w:t>
-      </w:r>
-      <w:hyperlink w:history="1" r:id="rId_asqujyisco-nmjcbphlx">
-        <w:r>
-          <w:rPr>
-            <w:color w:val="8E1B2C"/>
-            <w:sz w:val="15"/>
-            <w:szCs w:val="15"/>
+          <w:color w:val="B3272A"/>
+          <w:sz w:val="13"/>
+          <w:szCs w:val="13"/>
+        </w:rPr>
+        <w:t xml:space="preserve">[</w:t>
+      </w:r>
+      <w:hyperlink w:history="1" r:id="rIdrdndz2snlkeay_wjzufhw">
+        <w:r>
+          <w:rPr>
+            <w:color w:val="B3272A"/>
+            <w:sz w:val="13"/>
+            <w:szCs w:val="13"/>
             <w:u w:val="single"/>
           </w:rPr>
           <w:t xml:space="preserve">AusPayPlus</w:t>
@@ -1388,9 +1510,9 @@
       </w:hyperlink>
       <w:r>
         <w:rPr>
-          <w:color w:val="8E1B2C"/>
-          <w:sz w:val="15"/>
-          <w:szCs w:val="15"/>
+          <w:color w:val="B3272A"/>
+          <w:sz w:val="13"/>
+          <w:szCs w:val="13"/>
         </w:rPr>
         <w:t xml:space="preserve">]</w:t>
       </w:r>
@@ -1399,18 +1521,18 @@
       </w:r>
       <w:r>
         <w:rPr>
-          <w:color w:val="8E1B2C"/>
-          <w:sz w:val="15"/>
-          <w:szCs w:val="15"/>
-        </w:rPr>
-        <w:t xml:space="preserve">[</w:t>
-      </w:r>
-      <w:hyperlink w:history="1" r:id="rIdyl9enlr_ghorchqkauuc0">
-        <w:r>
-          <w:rPr>
-            <w:color w:val="8E1B2C"/>
-            <w:sz w:val="15"/>
-            <w:szCs w:val="15"/>
+          <w:color w:val="B3272A"/>
+          <w:sz w:val="13"/>
+          <w:szCs w:val="13"/>
+        </w:rPr>
+        <w:t xml:space="preserve">[</w:t>
+      </w:r>
+      <w:hyperlink w:history="1" r:id="rId0j5gxwzmix6srwt0w1otd">
+        <w:r>
+          <w:rPr>
+            <w:color w:val="B3272A"/>
+            <w:sz w:val="13"/>
+            <w:szCs w:val="13"/>
             <w:u w:val="single"/>
           </w:rPr>
           <w:t xml:space="preserve">AusPayPlus</w:t>
@@ -1418,9 +1540,9 @@
       </w:hyperlink>
       <w:r>
         <w:rPr>
-          <w:color w:val="8E1B2C"/>
-          <w:sz w:val="15"/>
-          <w:szCs w:val="15"/>
+          <w:color w:val="B3272A"/>
+          <w:sz w:val="13"/>
+          <w:szCs w:val="13"/>
         </w:rPr>
         <w:t xml:space="preserve">]</w:t>
       </w:r>
@@ -1450,18 +1572,18 @@
       </w:r>
       <w:r>
         <w:rPr>
-          <w:color w:val="8E1B2C"/>
-          <w:sz w:val="15"/>
-          <w:szCs w:val="15"/>
-        </w:rPr>
-        <w:t xml:space="preserve">[</w:t>
-      </w:r>
-      <w:hyperlink w:history="1" r:id="rIdk0dyzey5q7mioy4ddy3jw">
-        <w:r>
-          <w:rPr>
-            <w:color w:val="8E1B2C"/>
-            <w:sz w:val="15"/>
-            <w:szCs w:val="15"/>
+          <w:color w:val="B3272A"/>
+          <w:sz w:val="13"/>
+          <w:szCs w:val="13"/>
+        </w:rPr>
+        <w:t xml:space="preserve">[</w:t>
+      </w:r>
+      <w:hyperlink w:history="1" r:id="rId--jpjgwo1dfoa7gggnfg-">
+        <w:r>
+          <w:rPr>
+            <w:color w:val="B3272A"/>
+            <w:sz w:val="13"/>
+            <w:szCs w:val="13"/>
             <w:u w:val="single"/>
           </w:rPr>
           <w:t xml:space="preserve">Redbelly</w:t>
@@ -1469,18 +1591,18 @@
       </w:hyperlink>
       <w:r>
         <w:rPr>
-          <w:color w:val="8E1B2C"/>
-          <w:sz w:val="15"/>
-          <w:szCs w:val="15"/>
+          <w:color w:val="B3272A"/>
+          <w:sz w:val="13"/>
+          <w:szCs w:val="13"/>
         </w:rPr>
         <w:t xml:space="preserve"> · </w:t>
       </w:r>
-      <w:hyperlink w:history="1" r:id="rId7gccf8gtey6ugtj1tcfxv">
-        <w:r>
-          <w:rPr>
-            <w:color w:val="8E1B2C"/>
-            <w:sz w:val="15"/>
-            <w:szCs w:val="15"/>
+      <w:hyperlink w:history="1" r:id="rIdubvklkn-4d6xsdsvn3hfv">
+        <w:r>
+          <w:rPr>
+            <w:color w:val="B3272A"/>
+            <w:sz w:val="13"/>
+            <w:szCs w:val="13"/>
             <w:u w:val="single"/>
           </w:rPr>
           <w:t xml:space="preserve">SMB Tech</w:t>
@@ -1488,9 +1610,9 @@
       </w:hyperlink>
       <w:r>
         <w:rPr>
-          <w:color w:val="8E1B2C"/>
-          <w:sz w:val="15"/>
-          <w:szCs w:val="15"/>
+          <w:color w:val="B3272A"/>
+          <w:sz w:val="13"/>
+          <w:szCs w:val="13"/>
         </w:rPr>
         <w:t xml:space="preserve">]</w:t>
       </w:r>
@@ -1499,18 +1621,18 @@
       </w:r>
       <w:r>
         <w:rPr>
-          <w:color w:val="8E1B2C"/>
-          <w:sz w:val="15"/>
-          <w:szCs w:val="15"/>
-        </w:rPr>
-        <w:t xml:space="preserve">[</w:t>
-      </w:r>
-      <w:hyperlink w:history="1" r:id="rIdm_godpmqflsclqx_zqwiv">
-        <w:r>
-          <w:rPr>
-            <w:color w:val="8E1B2C"/>
-            <w:sz w:val="15"/>
-            <w:szCs w:val="15"/>
+          <w:color w:val="B3272A"/>
+          <w:sz w:val="13"/>
+          <w:szCs w:val="13"/>
+        </w:rPr>
+        <w:t xml:space="preserve">[</w:t>
+      </w:r>
+      <w:hyperlink w:history="1" r:id="rIdju2tmqbceav11l_3l46dw">
+        <w:r>
+          <w:rPr>
+            <w:color w:val="B3272A"/>
+            <w:sz w:val="13"/>
+            <w:szCs w:val="13"/>
             <w:u w:val="single"/>
           </w:rPr>
           <w:t xml:space="preserve">LinkedIn</w:t>
@@ -1518,9 +1640,9 @@
       </w:hyperlink>
       <w:r>
         <w:rPr>
-          <w:color w:val="8E1B2C"/>
-          <w:sz w:val="15"/>
-          <w:szCs w:val="15"/>
+          <w:color w:val="B3272A"/>
+          <w:sz w:val="13"/>
+          <w:szCs w:val="13"/>
         </w:rPr>
         <w:t xml:space="preserve">]</w:t>
       </w:r>
@@ -1529,18 +1651,18 @@
       </w:r>
       <w:r>
         <w:rPr>
-          <w:color w:val="8E1B2C"/>
-          <w:sz w:val="15"/>
-          <w:szCs w:val="15"/>
-        </w:rPr>
-        <w:t xml:space="preserve">[</w:t>
-      </w:r>
-      <w:hyperlink w:history="1" r:id="rIdc5kzi0au1l2u9bdn2xgqy">
-        <w:r>
-          <w:rPr>
-            <w:color w:val="8E1B2C"/>
-            <w:sz w:val="15"/>
-            <w:szCs w:val="15"/>
+          <w:color w:val="B3272A"/>
+          <w:sz w:val="13"/>
+          <w:szCs w:val="13"/>
+        </w:rPr>
+        <w:t xml:space="preserve">[</w:t>
+      </w:r>
+      <w:hyperlink w:history="1" r:id="rIde5lxidbxbweyb_usyzjhz">
+        <w:r>
+          <w:rPr>
+            <w:color w:val="B3272A"/>
+            <w:sz w:val="13"/>
+            <w:szCs w:val="13"/>
             <w:u w:val="single"/>
           </w:rPr>
           <w:t xml:space="preserve">Banking Day</w:t>
@@ -1548,18 +1670,18 @@
       </w:hyperlink>
       <w:r>
         <w:rPr>
-          <w:color w:val="8E1B2C"/>
-          <w:sz w:val="15"/>
-          <w:szCs w:val="15"/>
+          <w:color w:val="B3272A"/>
+          <w:sz w:val="13"/>
+          <w:szCs w:val="13"/>
         </w:rPr>
         <w:t xml:space="preserve"> · </w:t>
       </w:r>
-      <w:hyperlink w:history="1" r:id="rIdwb6ifovoe-xmjhog5a6gr">
-        <w:r>
-          <w:rPr>
-            <w:color w:val="8E1B2C"/>
-            <w:sz w:val="15"/>
-            <w:szCs w:val="15"/>
+      <w:hyperlink w:history="1" r:id="rIdwz0anjbj_nlf2is1vlasj">
+        <w:r>
+          <w:rPr>
+            <w:color w:val="B3272A"/>
+            <w:sz w:val="13"/>
+            <w:szCs w:val="13"/>
             <w:u w:val="single"/>
           </w:rPr>
           <w:t xml:space="preserve">LinkedIn</w:t>
@@ -1567,9 +1689,9 @@
       </w:hyperlink>
       <w:r>
         <w:rPr>
-          <w:color w:val="8E1B2C"/>
-          <w:sz w:val="15"/>
-          <w:szCs w:val="15"/>
+          <w:color w:val="B3272A"/>
+          <w:sz w:val="13"/>
+          <w:szCs w:val="13"/>
         </w:rPr>
         <w:t xml:space="preserve">]</w:t>
       </w:r>
@@ -1591,18 +1713,18 @@
       </w:r>
       <w:r>
         <w:rPr>
-          <w:color w:val="8E1B2C"/>
-          <w:sz w:val="15"/>
-          <w:szCs w:val="15"/>
-        </w:rPr>
-        <w:t xml:space="preserve">[</w:t>
-      </w:r>
-      <w:hyperlink w:history="1" r:id="rId01vohirh0wysgcmu-p3xh">
-        <w:r>
-          <w:rPr>
-            <w:color w:val="8E1B2C"/>
-            <w:sz w:val="15"/>
-            <w:szCs w:val="15"/>
+          <w:color w:val="B3272A"/>
+          <w:sz w:val="13"/>
+          <w:szCs w:val="13"/>
+        </w:rPr>
+        <w:t xml:space="preserve">[</w:t>
+      </w:r>
+      <w:hyperlink w:history="1" r:id="rIdxyd25sk_xlaxyix94jc0f">
+        <w:r>
+          <w:rPr>
+            <w:color w:val="B3272A"/>
+            <w:sz w:val="13"/>
+            <w:szCs w:val="13"/>
             <w:u w:val="single"/>
           </w:rPr>
           <w:t xml:space="preserve">AusPayNet</w:t>
@@ -1610,9 +1732,9 @@
       </w:hyperlink>
       <w:r>
         <w:rPr>
-          <w:color w:val="8E1B2C"/>
-          <w:sz w:val="15"/>
-          <w:szCs w:val="15"/>
+          <w:color w:val="B3272A"/>
+          <w:sz w:val="13"/>
+          <w:szCs w:val="13"/>
         </w:rPr>
         <w:t xml:space="preserve">]</w:t>
       </w:r>
@@ -1642,18 +1764,18 @@
       </w:r>
       <w:r>
         <w:rPr>
-          <w:color w:val="8E1B2C"/>
-          <w:sz w:val="15"/>
-          <w:szCs w:val="15"/>
-        </w:rPr>
-        <w:t xml:space="preserve">[</w:t>
-      </w:r>
-      <w:hyperlink w:history="1" r:id="rIdcnlsmwkvu8ga1qpg5nabx">
-        <w:r>
-          <w:rPr>
-            <w:color w:val="8E1B2C"/>
-            <w:sz w:val="15"/>
-            <w:szCs w:val="15"/>
+          <w:color w:val="B3272A"/>
+          <w:sz w:val="13"/>
+          <w:szCs w:val="13"/>
+        </w:rPr>
+        <w:t xml:space="preserve">[</w:t>
+      </w:r>
+      <w:hyperlink w:history="1" r:id="rIdh-n8eplkdrvdhwk4kxluv">
+        <w:r>
+          <w:rPr>
+            <w:color w:val="B3272A"/>
+            <w:sz w:val="13"/>
+            <w:szCs w:val="13"/>
             <w:u w:val="single"/>
           </w:rPr>
           <w:t xml:space="preserve">Business Conversation</w:t>
@@ -1661,18 +1783,18 @@
       </w:hyperlink>
       <w:r>
         <w:rPr>
-          <w:color w:val="8E1B2C"/>
-          <w:sz w:val="15"/>
-          <w:szCs w:val="15"/>
+          <w:color w:val="B3272A"/>
+          <w:sz w:val="13"/>
+          <w:szCs w:val="13"/>
         </w:rPr>
         <w:t xml:space="preserve"> · </w:t>
       </w:r>
-      <w:hyperlink w:history="1" r:id="rIdeyu4q07snvkxcd9gkucsq">
-        <w:r>
-          <w:rPr>
-            <w:color w:val="8E1B2C"/>
-            <w:sz w:val="15"/>
-            <w:szCs w:val="15"/>
+      <w:hyperlink w:history="1" r:id="rIduvsndmplkec6y3qnmspk1">
+        <w:r>
+          <w:rPr>
+            <w:color w:val="B3272A"/>
+            <w:sz w:val="13"/>
+            <w:szCs w:val="13"/>
             <w:u w:val="single"/>
           </w:rPr>
           <w:t xml:space="preserve">Talking Business</w:t>
@@ -1680,18 +1802,18 @@
       </w:hyperlink>
       <w:r>
         <w:rPr>
-          <w:color w:val="8E1B2C"/>
-          <w:sz w:val="15"/>
-          <w:szCs w:val="15"/>
+          <w:color w:val="B3272A"/>
+          <w:sz w:val="13"/>
+          <w:szCs w:val="13"/>
         </w:rPr>
         <w:t xml:space="preserve"> · </w:t>
       </w:r>
-      <w:hyperlink w:history="1" r:id="rIdhiljmmdxxrk7h4jqtfpil">
-        <w:r>
-          <w:rPr>
-            <w:color w:val="8E1B2C"/>
-            <w:sz w:val="15"/>
-            <w:szCs w:val="15"/>
+      <w:hyperlink w:history="1" r:id="rIdepijhtrwfdbp40cjpobe0">
+        <w:r>
+          <w:rPr>
+            <w:color w:val="B3272A"/>
+            <w:sz w:val="13"/>
+            <w:szCs w:val="13"/>
             <w:u w:val="single"/>
           </w:rPr>
           <w:t xml:space="preserve">Prospect</w:t>
@@ -1699,9 +1821,9 @@
       </w:hyperlink>
       <w:r>
         <w:rPr>
-          <w:color w:val="8E1B2C"/>
-          <w:sz w:val="15"/>
-          <w:szCs w:val="15"/>
+          <w:color w:val="B3272A"/>
+          <w:sz w:val="13"/>
+          <w:szCs w:val="13"/>
         </w:rPr>
         <w:t xml:space="preserve">]</w:t>
       </w:r>
@@ -1710,18 +1832,18 @@
       </w:r>
       <w:r>
         <w:rPr>
-          <w:color w:val="8E1B2C"/>
-          <w:sz w:val="15"/>
-          <w:szCs w:val="15"/>
-        </w:rPr>
-        <w:t xml:space="preserve">[</w:t>
-      </w:r>
-      <w:hyperlink w:history="1" r:id="rIdc91ovz2mpxy_mcttqqgje">
-        <w:r>
-          <w:rPr>
-            <w:color w:val="8E1B2C"/>
-            <w:sz w:val="15"/>
-            <w:szCs w:val="15"/>
+          <w:color w:val="B3272A"/>
+          <w:sz w:val="13"/>
+          <w:szCs w:val="13"/>
+        </w:rPr>
+        <w:t xml:space="preserve">[</w:t>
+      </w:r>
+      <w:hyperlink w:history="1" r:id="rId9daqlgr7inonrw6crugpm">
+        <w:r>
+          <w:rPr>
+            <w:color w:val="B3272A"/>
+            <w:sz w:val="13"/>
+            <w:szCs w:val="13"/>
             <w:u w:val="single"/>
           </w:rPr>
           <w:t xml:space="preserve">LinkedIn</w:t>
@@ -1729,9 +1851,9 @@
       </w:hyperlink>
       <w:r>
         <w:rPr>
-          <w:color w:val="8E1B2C"/>
-          <w:sz w:val="15"/>
-          <w:szCs w:val="15"/>
+          <w:color w:val="B3272A"/>
+          <w:sz w:val="13"/>
+          <w:szCs w:val="13"/>
         </w:rPr>
         <w:t xml:space="preserve">]</w:t>
       </w:r>
@@ -1750,18 +1872,18 @@
       </w:r>
       <w:r>
         <w:rPr>
-          <w:color w:val="8E1B2C"/>
-          <w:sz w:val="15"/>
-          <w:szCs w:val="15"/>
-        </w:rPr>
-        <w:t xml:space="preserve">[</w:t>
-      </w:r>
-      <w:hyperlink w:history="1" r:id="rIdkyalgrpuc9lxm_sgd2s0g">
-        <w:r>
-          <w:rPr>
-            <w:color w:val="8E1B2C"/>
-            <w:sz w:val="15"/>
-            <w:szCs w:val="15"/>
+          <w:color w:val="B3272A"/>
+          <w:sz w:val="13"/>
+          <w:szCs w:val="13"/>
+        </w:rPr>
+        <w:t xml:space="preserve">[</w:t>
+      </w:r>
+      <w:hyperlink w:history="1" r:id="rId7osr2cprbjxzq9rlt9mt7">
+        <w:r>
+          <w:rPr>
+            <w:color w:val="B3272A"/>
+            <w:sz w:val="13"/>
+            <w:szCs w:val="13"/>
             <w:u w:val="single"/>
           </w:rPr>
           <w:t xml:space="preserve">INET</w:t>
@@ -1769,9 +1891,9 @@
       </w:hyperlink>
       <w:r>
         <w:rPr>
-          <w:color w:val="8E1B2C"/>
-          <w:sz w:val="15"/>
-          <w:szCs w:val="15"/>
+          <w:color w:val="B3272A"/>
+          <w:sz w:val="13"/>
+          <w:szCs w:val="13"/>
         </w:rPr>
         <w:t xml:space="preserve">]</w:t>
       </w:r>
@@ -1793,18 +1915,18 @@
       </w:r>
       <w:r>
         <w:rPr>
-          <w:color w:val="8E1B2C"/>
-          <w:sz w:val="15"/>
-          <w:szCs w:val="15"/>
-        </w:rPr>
-        <w:t xml:space="preserve">[</w:t>
-      </w:r>
-      <w:hyperlink w:history="1" r:id="rIdcbhhwzrhgq9zfcrzqx2v8">
-        <w:r>
-          <w:rPr>
-            <w:color w:val="8E1B2C"/>
-            <w:sz w:val="15"/>
-            <w:szCs w:val="15"/>
+          <w:color w:val="B3272A"/>
+          <w:sz w:val="13"/>
+          <w:szCs w:val="13"/>
+        </w:rPr>
+        <w:t xml:space="preserve">[</w:t>
+      </w:r>
+      <w:hyperlink w:history="1" r:id="rIdleytreyv5ifaohsbck5y_">
+        <w:r>
+          <w:rPr>
+            <w:color w:val="B3272A"/>
+            <w:sz w:val="13"/>
+            <w:szCs w:val="13"/>
             <w:u w:val="single"/>
           </w:rPr>
           <w:t xml:space="preserve">Business Conversation</w:t>
@@ -1812,18 +1934,18 @@
       </w:hyperlink>
       <w:r>
         <w:rPr>
-          <w:color w:val="8E1B2C"/>
-          <w:sz w:val="15"/>
-          <w:szCs w:val="15"/>
+          <w:color w:val="B3272A"/>
+          <w:sz w:val="13"/>
+          <w:szCs w:val="13"/>
         </w:rPr>
         <w:t xml:space="preserve"> · </w:t>
       </w:r>
-      <w:hyperlink w:history="1" r:id="rIdozxwmfoqdujm9lsop2wmi">
-        <w:r>
-          <w:rPr>
-            <w:color w:val="8E1B2C"/>
-            <w:sz w:val="15"/>
-            <w:szCs w:val="15"/>
+      <w:hyperlink w:history="1" r:id="rIdfxlhv9dasyzy66bukijaj">
+        <w:r>
+          <w:rPr>
+            <w:color w:val="B3272A"/>
+            <w:sz w:val="13"/>
+            <w:szCs w:val="13"/>
             <w:u w:val="single"/>
           </w:rPr>
           <w:t xml:space="preserve">Talking Business</w:t>
@@ -1831,9 +1953,9 @@
       </w:hyperlink>
       <w:r>
         <w:rPr>
-          <w:color w:val="8E1B2C"/>
-          <w:sz w:val="15"/>
-          <w:szCs w:val="15"/>
+          <w:color w:val="B3272A"/>
+          <w:sz w:val="13"/>
+          <w:szCs w:val="13"/>
         </w:rPr>
         <w:t xml:space="preserve">]</w:t>
       </w:r>
@@ -1855,18 +1977,18 @@
       </w:r>
       <w:r>
         <w:rPr>
-          <w:color w:val="8E1B2C"/>
-          <w:sz w:val="15"/>
-          <w:szCs w:val="15"/>
-        </w:rPr>
-        <w:t xml:space="preserve">[</w:t>
-      </w:r>
-      <w:hyperlink w:history="1" r:id="rIdxaag_w2wkp0g0ouk-6c6y">
-        <w:r>
-          <w:rPr>
-            <w:color w:val="8E1B2C"/>
-            <w:sz w:val="15"/>
-            <w:szCs w:val="15"/>
+          <w:color w:val="B3272A"/>
+          <w:sz w:val="13"/>
+          <w:szCs w:val="13"/>
+        </w:rPr>
+        <w:t xml:space="preserve">[</w:t>
+      </w:r>
+      <w:hyperlink w:history="1" r:id="rIdjvpwneqnxczqw3q4cp7a6">
+        <w:r>
+          <w:rPr>
+            <w:color w:val="B3272A"/>
+            <w:sz w:val="13"/>
+            <w:szCs w:val="13"/>
             <w:u w:val="single"/>
           </w:rPr>
           <w:t xml:space="preserve">Business Conversation</w:t>
@@ -1874,9 +1996,9 @@
       </w:hyperlink>
       <w:r>
         <w:rPr>
-          <w:color w:val="8E1B2C"/>
-          <w:sz w:val="15"/>
-          <w:szCs w:val="15"/>
+          <w:color w:val="B3272A"/>
+          <w:sz w:val="13"/>
+          <w:szCs w:val="13"/>
         </w:rPr>
         <w:t xml:space="preserve">]</w:t>
       </w:r>
@@ -1885,18 +2007,18 @@
       </w:r>
       <w:r>
         <w:rPr>
-          <w:color w:val="8E1B2C"/>
-          <w:sz w:val="15"/>
-          <w:szCs w:val="15"/>
-        </w:rPr>
-        <w:t xml:space="preserve">[</w:t>
-      </w:r>
-      <w:hyperlink w:history="1" r:id="rIdwayju9txllpddg4mjx55-">
-        <w:r>
-          <w:rPr>
-            <w:color w:val="8E1B2C"/>
-            <w:sz w:val="15"/>
-            <w:szCs w:val="15"/>
+          <w:color w:val="B3272A"/>
+          <w:sz w:val="13"/>
+          <w:szCs w:val="13"/>
+        </w:rPr>
+        <w:t xml:space="preserve">[</w:t>
+      </w:r>
+      <w:hyperlink w:history="1" r:id="rIdvdfdqaelib9sjh7a41v56">
+        <w:r>
+          <w:rPr>
+            <w:color w:val="B3272A"/>
+            <w:sz w:val="13"/>
+            <w:szCs w:val="13"/>
             <w:u w:val="single"/>
           </w:rPr>
           <w:t xml:space="preserve">Talking Business</w:t>
@@ -1904,9 +2026,9 @@
       </w:hyperlink>
       <w:r>
         <w:rPr>
-          <w:color w:val="8E1B2C"/>
-          <w:sz w:val="15"/>
-          <w:szCs w:val="15"/>
+          <w:color w:val="B3272A"/>
+          <w:sz w:val="13"/>
+          <w:szCs w:val="13"/>
         </w:rPr>
         <w:t xml:space="preserve">]</w:t>
       </w:r>
@@ -1915,18 +2037,18 @@
       </w:r>
       <w:r>
         <w:rPr>
-          <w:color w:val="8E1B2C"/>
-          <w:sz w:val="15"/>
-          <w:szCs w:val="15"/>
-        </w:rPr>
-        <w:t xml:space="preserve">[</w:t>
-      </w:r>
-      <w:hyperlink w:history="1" r:id="rIdnbclblmsqwsvwnagflb26">
-        <w:r>
-          <w:rPr>
-            <w:color w:val="8E1B2C"/>
-            <w:sz w:val="15"/>
-            <w:szCs w:val="15"/>
+          <w:color w:val="B3272A"/>
+          <w:sz w:val="13"/>
+          <w:szCs w:val="13"/>
+        </w:rPr>
+        <w:t xml:space="preserve">[</w:t>
+      </w:r>
+      <w:hyperlink w:history="1" r:id="rIdwe0ghu4bz1kcc6wsia3hz">
+        <w:r>
+          <w:rPr>
+            <w:color w:val="B3272A"/>
+            <w:sz w:val="13"/>
+            <w:szCs w:val="13"/>
             <w:u w:val="single"/>
           </w:rPr>
           <w:t xml:space="preserve">Prospect</w:t>
@@ -1934,9 +2056,9 @@
       </w:hyperlink>
       <w:r>
         <w:rPr>
-          <w:color w:val="8E1B2C"/>
-          <w:sz w:val="15"/>
-          <w:szCs w:val="15"/>
+          <w:color w:val="B3272A"/>
+          <w:sz w:val="13"/>
+          <w:szCs w:val="13"/>
         </w:rPr>
         <w:t xml:space="preserve">]</w:t>
       </w:r>
@@ -1945,18 +2067,18 @@
       </w:r>
       <w:r>
         <w:rPr>
-          <w:color w:val="8E1B2C"/>
-          <w:sz w:val="15"/>
-          <w:szCs w:val="15"/>
-        </w:rPr>
-        <w:t xml:space="preserve">[</w:t>
-      </w:r>
-      <w:hyperlink w:history="1" r:id="rIdr5leebyvnpcnec6vxwig9">
-        <w:r>
-          <w:rPr>
-            <w:color w:val="8E1B2C"/>
-            <w:sz w:val="15"/>
-            <w:szCs w:val="15"/>
+          <w:color w:val="B3272A"/>
+          <w:sz w:val="13"/>
+          <w:szCs w:val="13"/>
+        </w:rPr>
+        <w:t xml:space="preserve">[</w:t>
+      </w:r>
+      <w:hyperlink w:history="1" r:id="rId1aqpzeu2senhy8kqvs7pm">
+        <w:r>
+          <w:rPr>
+            <w:color w:val="B3272A"/>
+            <w:sz w:val="13"/>
+            <w:szCs w:val="13"/>
             <w:u w:val="single"/>
           </w:rPr>
           <w:t xml:space="preserve">Talking Business</w:t>
@@ -1964,9 +2086,9 @@
       </w:hyperlink>
       <w:r>
         <w:rPr>
-          <w:color w:val="8E1B2C"/>
-          <w:sz w:val="15"/>
-          <w:szCs w:val="15"/>
+          <w:color w:val="B3272A"/>
+          <w:sz w:val="13"/>
+          <w:szCs w:val="13"/>
         </w:rPr>
         <w:t xml:space="preserve">]</w:t>
       </w:r>
@@ -2004,18 +2126,18 @@
       </w:r>
       <w:r>
         <w:rPr>
-          <w:color w:val="8E1B2C"/>
-          <w:sz w:val="15"/>
-          <w:szCs w:val="15"/>
-        </w:rPr>
-        <w:t xml:space="preserve">[</w:t>
-      </w:r>
-      <w:hyperlink w:history="1" r:id="rId4cxzaf-5ooqxazceslaba">
-        <w:r>
-          <w:rPr>
-            <w:color w:val="8E1B2C"/>
-            <w:sz w:val="15"/>
-            <w:szCs w:val="15"/>
+          <w:color w:val="B3272A"/>
+          <w:sz w:val="13"/>
+          <w:szCs w:val="13"/>
+        </w:rPr>
+        <w:t xml:space="preserve">[</w:t>
+      </w:r>
+      <w:hyperlink w:history="1" r:id="rIdqjxskoeauw_udb2bkcf5q">
+        <w:r>
+          <w:rPr>
+            <w:color w:val="B3272A"/>
+            <w:sz w:val="13"/>
+            <w:szCs w:val="13"/>
             <w:u w:val="single"/>
           </w:rPr>
           <w:t xml:space="preserve">Redbelly</w:t>
@@ -2023,9 +2145,9 @@
       </w:hyperlink>
       <w:r>
         <w:rPr>
-          <w:color w:val="8E1B2C"/>
-          <w:sz w:val="15"/>
-          <w:szCs w:val="15"/>
+          <w:color w:val="B3272A"/>
+          <w:sz w:val="13"/>
+          <w:szCs w:val="13"/>
         </w:rPr>
         <w:t xml:space="preserve">]</w:t>
       </w:r>
@@ -2034,18 +2156,18 @@
       </w:r>
       <w:r>
         <w:rPr>
-          <w:color w:val="8E1B2C"/>
-          <w:sz w:val="15"/>
-          <w:szCs w:val="15"/>
-        </w:rPr>
-        <w:t xml:space="preserve">[</w:t>
-      </w:r>
-      <w:hyperlink w:history="1" r:id="rIdaokhbjbzefqlzgpcvu5j7">
-        <w:r>
-          <w:rPr>
-            <w:color w:val="8E1B2C"/>
-            <w:sz w:val="15"/>
-            <w:szCs w:val="15"/>
+          <w:color w:val="B3272A"/>
+          <w:sz w:val="13"/>
+          <w:szCs w:val="13"/>
+        </w:rPr>
+        <w:t xml:space="preserve">[</w:t>
+      </w:r>
+      <w:hyperlink w:history="1" r:id="rIdfe-ztp7ylz6maddsm-i5b">
+        <w:r>
+          <w:rPr>
+            <w:color w:val="B3272A"/>
+            <w:sz w:val="13"/>
+            <w:szCs w:val="13"/>
             <w:u w:val="single"/>
           </w:rPr>
           <w:t xml:space="preserve">Redbelly</w:t>
@@ -2053,9 +2175,9 @@
       </w:hyperlink>
       <w:r>
         <w:rPr>
-          <w:color w:val="8E1B2C"/>
-          <w:sz w:val="15"/>
-          <w:szCs w:val="15"/>
+          <w:color w:val="B3272A"/>
+          <w:sz w:val="13"/>
+          <w:szCs w:val="13"/>
         </w:rPr>
         <w:t xml:space="preserve">]</w:t>
       </w:r>
@@ -2064,18 +2186,18 @@
       </w:r>
       <w:r>
         <w:rPr>
-          <w:color w:val="8E1B2C"/>
-          <w:sz w:val="15"/>
-          <w:szCs w:val="15"/>
-        </w:rPr>
-        <w:t xml:space="preserve">[</w:t>
-      </w:r>
-      <w:hyperlink w:history="1" r:id="rIdc5jmxgxni595tmlevo6-x">
-        <w:r>
-          <w:rPr>
-            <w:color w:val="8E1B2C"/>
-            <w:sz w:val="15"/>
-            <w:szCs w:val="15"/>
+          <w:color w:val="B3272A"/>
+          <w:sz w:val="13"/>
+          <w:szCs w:val="13"/>
+        </w:rPr>
+        <w:t xml:space="preserve">[</w:t>
+      </w:r>
+      <w:hyperlink w:history="1" r:id="rIdeinpt8qvrao_vxvpe53lj">
+        <w:r>
+          <w:rPr>
+            <w:color w:val="B3272A"/>
+            <w:sz w:val="13"/>
+            <w:szCs w:val="13"/>
             <w:u w:val="single"/>
           </w:rPr>
           <w:t xml:space="preserve">Redbelly</w:t>
@@ -2083,9 +2205,9 @@
       </w:hyperlink>
       <w:r>
         <w:rPr>
-          <w:color w:val="8E1B2C"/>
-          <w:sz w:val="15"/>
-          <w:szCs w:val="15"/>
+          <w:color w:val="B3272A"/>
+          <w:sz w:val="13"/>
+          <w:szCs w:val="13"/>
         </w:rPr>
         <w:t xml:space="preserve">]</w:t>
       </w:r>
@@ -2107,18 +2229,18 @@
       </w:r>
       <w:r>
         <w:rPr>
-          <w:color w:val="8E1B2C"/>
-          <w:sz w:val="15"/>
-          <w:szCs w:val="15"/>
-        </w:rPr>
-        <w:t xml:space="preserve">[</w:t>
-      </w:r>
-      <w:hyperlink w:history="1" r:id="rId07werjf1b_ovidujwcueo">
-        <w:r>
-          <w:rPr>
-            <w:color w:val="8E1B2C"/>
-            <w:sz w:val="15"/>
-            <w:szCs w:val="15"/>
+          <w:color w:val="B3272A"/>
+          <w:sz w:val="13"/>
+          <w:szCs w:val="13"/>
+        </w:rPr>
+        <w:t xml:space="preserve">[</w:t>
+      </w:r>
+      <w:hyperlink w:history="1" r:id="rIdjlbyooafz6qpwrgb3wd3o">
+        <w:r>
+          <w:rPr>
+            <w:color w:val="B3272A"/>
+            <w:sz w:val="13"/>
+            <w:szCs w:val="13"/>
             <w:u w:val="single"/>
           </w:rPr>
           <w:t xml:space="preserve">Redbelly</w:t>
@@ -2126,9 +2248,9 @@
       </w:hyperlink>
       <w:r>
         <w:rPr>
-          <w:color w:val="8E1B2C"/>
-          <w:sz w:val="15"/>
-          <w:szCs w:val="15"/>
+          <w:color w:val="B3272A"/>
+          <w:sz w:val="13"/>
+          <w:szCs w:val="13"/>
         </w:rPr>
         <w:t xml:space="preserve">]</w:t>
       </w:r>
@@ -2137,18 +2259,18 @@
       </w:r>
       <w:r>
         <w:rPr>
-          <w:color w:val="8E1B2C"/>
-          <w:sz w:val="15"/>
-          <w:szCs w:val="15"/>
-        </w:rPr>
-        <w:t xml:space="preserve">[</w:t>
-      </w:r>
-      <w:hyperlink w:history="1" r:id="rIdcqlc6jmmc0vlryhkywccu">
-        <w:r>
-          <w:rPr>
-            <w:color w:val="8E1B2C"/>
-            <w:sz w:val="15"/>
-            <w:szCs w:val="15"/>
+          <w:color w:val="B3272A"/>
+          <w:sz w:val="13"/>
+          <w:szCs w:val="13"/>
+        </w:rPr>
+        <w:t xml:space="preserve">[</w:t>
+      </w:r>
+      <w:hyperlink w:history="1" r:id="rIdwk4wa2razf1kb8qttioww">
+        <w:r>
+          <w:rPr>
+            <w:color w:val="B3272A"/>
+            <w:sz w:val="13"/>
+            <w:szCs w:val="13"/>
             <w:u w:val="single"/>
           </w:rPr>
           <w:t xml:space="preserve">Redbelly</w:t>
@@ -2156,9 +2278,9 @@
       </w:hyperlink>
       <w:r>
         <w:rPr>
-          <w:color w:val="8E1B2C"/>
-          <w:sz w:val="15"/>
-          <w:szCs w:val="15"/>
+          <w:color w:val="B3272A"/>
+          <w:sz w:val="13"/>
+          <w:szCs w:val="13"/>
         </w:rPr>
         <w:t xml:space="preserve">]</w:t>
       </w:r>
@@ -2180,18 +2302,18 @@
       </w:r>
       <w:r>
         <w:rPr>
-          <w:color w:val="8E1B2C"/>
-          <w:sz w:val="15"/>
-          <w:szCs w:val="15"/>
-        </w:rPr>
-        <w:t xml:space="preserve">[</w:t>
-      </w:r>
-      <w:hyperlink w:history="1" r:id="rIdh_ydatwoqh5daemkbgnon">
-        <w:r>
-          <w:rPr>
-            <w:color w:val="8E1B2C"/>
-            <w:sz w:val="15"/>
-            <w:szCs w:val="15"/>
+          <w:color w:val="B3272A"/>
+          <w:sz w:val="13"/>
+          <w:szCs w:val="13"/>
+        </w:rPr>
+        <w:t xml:space="preserve">[</w:t>
+      </w:r>
+      <w:hyperlink w:history="1" r:id="rIdswpvus3yrms_rfu79hynu">
+        <w:r>
+          <w:rPr>
+            <w:color w:val="B3272A"/>
+            <w:sz w:val="13"/>
+            <w:szCs w:val="13"/>
             <w:u w:val="single"/>
           </w:rPr>
           <w:t xml:space="preserve">Redbelly</w:t>
@@ -2199,9 +2321,9 @@
       </w:hyperlink>
       <w:r>
         <w:rPr>
-          <w:color w:val="8E1B2C"/>
-          <w:sz w:val="15"/>
-          <w:szCs w:val="15"/>
+          <w:color w:val="B3272A"/>
+          <w:sz w:val="13"/>
+          <w:szCs w:val="13"/>
         </w:rPr>
         <w:t xml:space="preserve">]</w:t>
       </w:r>
@@ -2210,18 +2332,18 @@
       </w:r>
       <w:r>
         <w:rPr>
-          <w:color w:val="8E1B2C"/>
-          <w:sz w:val="15"/>
-          <w:szCs w:val="15"/>
-        </w:rPr>
-        <w:t xml:space="preserve">[</w:t>
-      </w:r>
-      <w:hyperlink w:history="1" r:id="rIdy_fql04omd4cfhi6wdkyo">
-        <w:r>
-          <w:rPr>
-            <w:color w:val="8E1B2C"/>
-            <w:sz w:val="15"/>
-            <w:szCs w:val="15"/>
+          <w:color w:val="B3272A"/>
+          <w:sz w:val="13"/>
+          <w:szCs w:val="13"/>
+        </w:rPr>
+        <w:t xml:space="preserve">[</w:t>
+      </w:r>
+      <w:hyperlink w:history="1" r:id="rIdgfpw8vh9e1xd5haob_ldl">
+        <w:r>
+          <w:rPr>
+            <w:color w:val="B3272A"/>
+            <w:sz w:val="13"/>
+            <w:szCs w:val="13"/>
             <w:u w:val="single"/>
           </w:rPr>
           <w:t xml:space="preserve">Redbelly</w:t>
@@ -2229,18 +2351,18 @@
       </w:hyperlink>
       <w:r>
         <w:rPr>
-          <w:color w:val="8E1B2C"/>
-          <w:sz w:val="15"/>
-          <w:szCs w:val="15"/>
+          <w:color w:val="B3272A"/>
+          <w:sz w:val="13"/>
+          <w:szCs w:val="13"/>
         </w:rPr>
         <w:t xml:space="preserve"> · </w:t>
       </w:r>
-      <w:hyperlink w:history="1" r:id="rIdqd9orahcucluuzyyxop50">
-        <w:r>
-          <w:rPr>
-            <w:color w:val="8E1B2C"/>
-            <w:sz w:val="15"/>
-            <w:szCs w:val="15"/>
+      <w:hyperlink w:history="1" r:id="rIdf93jxfcwmj48oa5cbdnur">
+        <w:r>
+          <w:rPr>
+            <w:color w:val="B3272A"/>
+            <w:sz w:val="13"/>
+            <w:szCs w:val="13"/>
             <w:u w:val="single"/>
           </w:rPr>
           <w:t xml:space="preserve">Medianet</w:t>
@@ -2248,9 +2370,9 @@
       </w:hyperlink>
       <w:r>
         <w:rPr>
-          <w:color w:val="8E1B2C"/>
-          <w:sz w:val="15"/>
-          <w:szCs w:val="15"/>
+          <w:color w:val="B3272A"/>
+          <w:sz w:val="13"/>
+          <w:szCs w:val="13"/>
         </w:rPr>
         <w:t xml:space="preserve">]</w:t>
       </w:r>
@@ -2277,18 +2399,18 @@
       </w:r>
       <w:r>
         <w:rPr>
-          <w:color w:val="8E1B2C"/>
-          <w:sz w:val="15"/>
-          <w:szCs w:val="15"/>
-        </w:rPr>
-        <w:t xml:space="preserve">[</w:t>
-      </w:r>
-      <w:hyperlink w:history="1" r:id="rIdpkgp7o41xql3mkthmia6g">
-        <w:r>
-          <w:rPr>
-            <w:color w:val="8E1B2C"/>
-            <w:sz w:val="15"/>
-            <w:szCs w:val="15"/>
+          <w:color w:val="B3272A"/>
+          <w:sz w:val="13"/>
+          <w:szCs w:val="13"/>
+        </w:rPr>
+        <w:t xml:space="preserve">[</w:t>
+      </w:r>
+      <w:hyperlink w:history="1" r:id="rIdhr8ykeh1ewg3nnwueyqti">
+        <w:r>
+          <w:rPr>
+            <w:color w:val="B3272A"/>
+            <w:sz w:val="13"/>
+            <w:szCs w:val="13"/>
             <w:u w:val="single"/>
           </w:rPr>
           <w:t xml:space="preserve">Redbelly</w:t>
@@ -2296,9 +2418,9 @@
       </w:hyperlink>
       <w:r>
         <w:rPr>
-          <w:color w:val="8E1B2C"/>
-          <w:sz w:val="15"/>
-          <w:szCs w:val="15"/>
+          <w:color w:val="B3272A"/>
+          <w:sz w:val="13"/>
+          <w:szCs w:val="13"/>
         </w:rPr>
         <w:t xml:space="preserve">]</w:t>
       </w:r>
@@ -2307,18 +2429,18 @@
       </w:r>
       <w:r>
         <w:rPr>
-          <w:color w:val="8E1B2C"/>
-          <w:sz w:val="15"/>
-          <w:szCs w:val="15"/>
-        </w:rPr>
-        <w:t xml:space="preserve">[</w:t>
-      </w:r>
-      <w:hyperlink w:history="1" r:id="rIdm3dhrcwm47k5d6hndfmrx">
-        <w:r>
-          <w:rPr>
-            <w:color w:val="8E1B2C"/>
-            <w:sz w:val="15"/>
-            <w:szCs w:val="15"/>
+          <w:color w:val="B3272A"/>
+          <w:sz w:val="13"/>
+          <w:szCs w:val="13"/>
+        </w:rPr>
+        <w:t xml:space="preserve">[</w:t>
+      </w:r>
+      <w:hyperlink w:history="1" r:id="rId3-qly-22gcfsyfimdqcqv">
+        <w:r>
+          <w:rPr>
+            <w:color w:val="B3272A"/>
+            <w:sz w:val="13"/>
+            <w:szCs w:val="13"/>
             <w:u w:val="single"/>
           </w:rPr>
           <w:t xml:space="preserve">Tokeniser/why-tokenise</w:t>
@@ -2326,9 +2448,9 @@
       </w:hyperlink>
       <w:r>
         <w:rPr>
-          <w:color w:val="8E1B2C"/>
-          <w:sz w:val="15"/>
-          <w:szCs w:val="15"/>
+          <w:color w:val="B3272A"/>
+          <w:sz w:val="13"/>
+          <w:szCs w:val="13"/>
         </w:rPr>
         <w:t xml:space="preserve">]</w:t>
       </w:r>
@@ -2350,18 +2472,18 @@
       </w:r>
       <w:r>
         <w:rPr>
-          <w:color w:val="8E1B2C"/>
-          <w:sz w:val="15"/>
-          <w:szCs w:val="15"/>
-        </w:rPr>
-        <w:t xml:space="preserve">[</w:t>
-      </w:r>
-      <w:hyperlink w:history="1" r:id="rIdxebgaghofd22m5sfpnexy">
-        <w:r>
-          <w:rPr>
-            <w:color w:val="8E1B2C"/>
-            <w:sz w:val="15"/>
-            <w:szCs w:val="15"/>
+          <w:color w:val="B3272A"/>
+          <w:sz w:val="13"/>
+          <w:szCs w:val="13"/>
+        </w:rPr>
+        <w:t xml:space="preserve">[</w:t>
+      </w:r>
+      <w:hyperlink w:history="1" r:id="rId_xcmcyyxot_23gayxxgvf">
+        <w:r>
+          <w:rPr>
+            <w:color w:val="B3272A"/>
+            <w:sz w:val="13"/>
+            <w:szCs w:val="13"/>
             <w:u w:val="single"/>
           </w:rPr>
           <w:t xml:space="preserve">Redbelly</w:t>
@@ -2369,9 +2491,9 @@
       </w:hyperlink>
       <w:r>
         <w:rPr>
-          <w:color w:val="8E1B2C"/>
-          <w:sz w:val="15"/>
-          <w:szCs w:val="15"/>
+          <w:color w:val="B3272A"/>
+          <w:sz w:val="13"/>
+          <w:szCs w:val="13"/>
         </w:rPr>
         <w:t xml:space="preserve">]</w:t>
       </w:r>
@@ -2380,18 +2502,18 @@
       </w:r>
       <w:r>
         <w:rPr>
-          <w:color w:val="8E1B2C"/>
-          <w:sz w:val="15"/>
-          <w:szCs w:val="15"/>
-        </w:rPr>
-        <w:t xml:space="preserve">[</w:t>
-      </w:r>
-      <w:hyperlink w:history="1" r:id="rIdl3rrlmtkf4xvtlpb0rcmm">
-        <w:r>
-          <w:rPr>
-            <w:color w:val="8E1B2C"/>
-            <w:sz w:val="15"/>
-            <w:szCs w:val="15"/>
+          <w:color w:val="B3272A"/>
+          <w:sz w:val="13"/>
+          <w:szCs w:val="13"/>
+        </w:rPr>
+        <w:t xml:space="preserve">[</w:t>
+      </w:r>
+      <w:hyperlink w:history="1" r:id="rIdx7afic2wnhwkw15aycwtu">
+        <w:r>
+          <w:rPr>
+            <w:color w:val="B3272A"/>
+            <w:sz w:val="13"/>
+            <w:szCs w:val="13"/>
             <w:u w:val="single"/>
           </w:rPr>
           <w:t xml:space="preserve">Redbelly</w:t>
@@ -2399,9 +2521,9 @@
       </w:hyperlink>
       <w:r>
         <w:rPr>
-          <w:color w:val="8E1B2C"/>
-          <w:sz w:val="15"/>
-          <w:szCs w:val="15"/>
+          <w:color w:val="B3272A"/>
+          <w:sz w:val="13"/>
+          <w:szCs w:val="13"/>
         </w:rPr>
         <w:t xml:space="preserve">]</w:t>
       </w:r>
@@ -2410,18 +2532,18 @@
       </w:r>
       <w:r>
         <w:rPr>
-          <w:color w:val="8E1B2C"/>
-          <w:sz w:val="15"/>
-          <w:szCs w:val="15"/>
-        </w:rPr>
-        <w:t xml:space="preserve">[</w:t>
-      </w:r>
-      <w:hyperlink w:history="1" r:id="rId0zir-u9exawasae5taijn">
-        <w:r>
-          <w:rPr>
-            <w:color w:val="8E1B2C"/>
-            <w:sz w:val="15"/>
-            <w:szCs w:val="15"/>
+          <w:color w:val="B3272A"/>
+          <w:sz w:val="13"/>
+          <w:szCs w:val="13"/>
+        </w:rPr>
+        <w:t xml:space="preserve">[</w:t>
+      </w:r>
+      <w:hyperlink w:history="1" r:id="rIdmlekol3vsbwp5ngfysw0l">
+        <w:r>
+          <w:rPr>
+            <w:color w:val="B3272A"/>
+            <w:sz w:val="13"/>
+            <w:szCs w:val="13"/>
             <w:u w:val="single"/>
           </w:rPr>
           <w:t xml:space="preserve">Tokeniser/technology</w:t>
@@ -2429,9 +2551,9 @@
       </w:hyperlink>
       <w:r>
         <w:rPr>
-          <w:color w:val="8E1B2C"/>
-          <w:sz w:val="15"/>
-          <w:szCs w:val="15"/>
+          <w:color w:val="B3272A"/>
+          <w:sz w:val="13"/>
+          <w:szCs w:val="13"/>
         </w:rPr>
         <w:t xml:space="preserve">]</w:t>
       </w:r>
@@ -2461,18 +2583,18 @@
       </w:r>
       <w:r>
         <w:rPr>
-          <w:color w:val="8E1B2C"/>
-          <w:sz w:val="15"/>
-          <w:szCs w:val="15"/>
-        </w:rPr>
-        <w:t xml:space="preserve">[</w:t>
-      </w:r>
-      <w:hyperlink w:history="1" r:id="rIdmyrdq5tgfn_mcg3jhravo">
-        <w:r>
-          <w:rPr>
-            <w:color w:val="8E1B2C"/>
-            <w:sz w:val="15"/>
-            <w:szCs w:val="15"/>
+          <w:color w:val="B3272A"/>
+          <w:sz w:val="13"/>
+          <w:szCs w:val="13"/>
+        </w:rPr>
+        <w:t xml:space="preserve">[</w:t>
+      </w:r>
+      <w:hyperlink w:history="1" r:id="rIdsvtphrmo-v_zshhb3kmsv">
+        <w:r>
+          <w:rPr>
+            <w:color w:val="B3272A"/>
+            <w:sz w:val="13"/>
+            <w:szCs w:val="13"/>
             <w:u w:val="single"/>
           </w:rPr>
           <w:t xml:space="preserve">Banking Day</w:t>
@@ -2480,9 +2602,9 @@
       </w:hyperlink>
       <w:r>
         <w:rPr>
-          <w:color w:val="8E1B2C"/>
-          <w:sz w:val="15"/>
-          <w:szCs w:val="15"/>
+          <w:color w:val="B3272A"/>
+          <w:sz w:val="13"/>
+          <w:szCs w:val="13"/>
         </w:rPr>
         <w:t xml:space="preserve">]</w:t>
       </w:r>
@@ -2491,18 +2613,18 @@
       </w:r>
       <w:r>
         <w:rPr>
-          <w:color w:val="8E1B2C"/>
-          <w:sz w:val="15"/>
-          <w:szCs w:val="15"/>
-        </w:rPr>
-        <w:t xml:space="preserve">[</w:t>
-      </w:r>
-      <w:hyperlink w:history="1" r:id="rIdywszpwe2japwf_b2kx-1k">
-        <w:r>
-          <w:rPr>
-            <w:color w:val="8E1B2C"/>
-            <w:sz w:val="15"/>
-            <w:szCs w:val="15"/>
+          <w:color w:val="B3272A"/>
+          <w:sz w:val="13"/>
+          <w:szCs w:val="13"/>
+        </w:rPr>
+        <w:t xml:space="preserve">[</w:t>
+      </w:r>
+      <w:hyperlink w:history="1" r:id="rIdlmt2hyizjcmxdb_sypqm9">
+        <w:r>
+          <w:rPr>
+            <w:color w:val="B3272A"/>
+            <w:sz w:val="13"/>
+            <w:szCs w:val="13"/>
             <w:u w:val="single"/>
           </w:rPr>
           <w:t xml:space="preserve">Banking Day</w:t>
@@ -2510,18 +2632,18 @@
       </w:hyperlink>
       <w:r>
         <w:rPr>
-          <w:color w:val="8E1B2C"/>
-          <w:sz w:val="15"/>
-          <w:szCs w:val="15"/>
+          <w:color w:val="B3272A"/>
+          <w:sz w:val="13"/>
+          <w:szCs w:val="13"/>
         </w:rPr>
         <w:t xml:space="preserve"> · </w:t>
       </w:r>
-      <w:hyperlink w:history="1" r:id="rIdtd34w1di3w0h8enlcny60">
-        <w:r>
-          <w:rPr>
-            <w:color w:val="8E1B2C"/>
-            <w:sz w:val="15"/>
-            <w:szCs w:val="15"/>
+      <w:hyperlink w:history="1" r:id="rId9qftqwdsabcepr4qx12pw">
+        <w:r>
+          <w:rPr>
+            <w:color w:val="B3272A"/>
+            <w:sz w:val="13"/>
+            <w:szCs w:val="13"/>
             <w:u w:val="single"/>
           </w:rPr>
           <w:t xml:space="preserve">Tokeniser/technology</w:t>
@@ -2529,9 +2651,9 @@
       </w:hyperlink>
       <w:r>
         <w:rPr>
-          <w:color w:val="8E1B2C"/>
-          <w:sz w:val="15"/>
-          <w:szCs w:val="15"/>
+          <w:color w:val="B3272A"/>
+          <w:sz w:val="13"/>
+          <w:szCs w:val="13"/>
         </w:rPr>
         <w:t xml:space="preserve">]</w:t>
       </w:r>
@@ -2553,18 +2675,18 @@
       </w:r>
       <w:r>
         <w:rPr>
-          <w:color w:val="8E1B2C"/>
-          <w:sz w:val="15"/>
-          <w:szCs w:val="15"/>
-        </w:rPr>
-        <w:t xml:space="preserve">[</w:t>
-      </w:r>
-      <w:hyperlink w:history="1" r:id="rIdvql5rhdgljchbs2r80emr">
-        <w:r>
-          <w:rPr>
-            <w:color w:val="8E1B2C"/>
-            <w:sz w:val="15"/>
-            <w:szCs w:val="15"/>
+          <w:color w:val="B3272A"/>
+          <w:sz w:val="13"/>
+          <w:szCs w:val="13"/>
+        </w:rPr>
+        <w:t xml:space="preserve">[</w:t>
+      </w:r>
+      <w:hyperlink w:history="1" r:id="rIdee1lxewelfwjtlbuduacj">
+        <w:r>
+          <w:rPr>
+            <w:color w:val="B3272A"/>
+            <w:sz w:val="13"/>
+            <w:szCs w:val="13"/>
             <w:u w:val="single"/>
           </w:rPr>
           <w:t xml:space="preserve">Tokeniser</w:t>
@@ -2572,9 +2694,9 @@
       </w:hyperlink>
       <w:r>
         <w:rPr>
-          <w:color w:val="8E1B2C"/>
-          <w:sz w:val="15"/>
-          <w:szCs w:val="15"/>
+          <w:color w:val="B3272A"/>
+          <w:sz w:val="13"/>
+          <w:szCs w:val="13"/>
         </w:rPr>
         <w:t xml:space="preserve">]</w:t>
       </w:r>
@@ -2583,18 +2705,18 @@
       </w:r>
       <w:r>
         <w:rPr>
-          <w:color w:val="8E1B2C"/>
-          <w:sz w:val="15"/>
-          <w:szCs w:val="15"/>
-        </w:rPr>
-        <w:t xml:space="preserve">[</w:t>
-      </w:r>
-      <w:hyperlink w:history="1" r:id="rIdf_vubos7zdea4qm1ja_tb">
-        <w:r>
-          <w:rPr>
-            <w:color w:val="8E1B2C"/>
-            <w:sz w:val="15"/>
-            <w:szCs w:val="15"/>
+          <w:color w:val="B3272A"/>
+          <w:sz w:val="13"/>
+          <w:szCs w:val="13"/>
+        </w:rPr>
+        <w:t xml:space="preserve">[</w:t>
+      </w:r>
+      <w:hyperlink w:history="1" r:id="rId5rpyvjkikto3jr8rj-wux">
+        <w:r>
+          <w:rPr>
+            <w:color w:val="B3272A"/>
+            <w:sz w:val="13"/>
+            <w:szCs w:val="13"/>
             <w:u w:val="single"/>
           </w:rPr>
           <w:t xml:space="preserve">Tokeniser</w:t>
@@ -2602,9 +2724,9 @@
       </w:hyperlink>
       <w:r>
         <w:rPr>
-          <w:color w:val="8E1B2C"/>
-          <w:sz w:val="15"/>
-          <w:szCs w:val="15"/>
+          <w:color w:val="B3272A"/>
+          <w:sz w:val="13"/>
+          <w:szCs w:val="13"/>
         </w:rPr>
         <w:t xml:space="preserve">]</w:t>
       </w:r>
@@ -2626,18 +2748,18 @@
       </w:r>
       <w:r>
         <w:rPr>
-          <w:color w:val="8E1B2C"/>
-          <w:sz w:val="15"/>
-          <w:szCs w:val="15"/>
-        </w:rPr>
-        <w:t xml:space="preserve">[</w:t>
-      </w:r>
-      <w:hyperlink w:history="1" r:id="rIdvqkri0tsvwftes3ssdwq7">
-        <w:r>
-          <w:rPr>
-            <w:color w:val="8E1B2C"/>
-            <w:sz w:val="15"/>
-            <w:szCs w:val="15"/>
+          <w:color w:val="B3272A"/>
+          <w:sz w:val="13"/>
+          <w:szCs w:val="13"/>
+        </w:rPr>
+        <w:t xml:space="preserve">[</w:t>
+      </w:r>
+      <w:hyperlink w:history="1" r:id="rIdyoltipxkavr_1pbdaky_f">
+        <w:r>
+          <w:rPr>
+            <w:color w:val="B3272A"/>
+            <w:sz w:val="13"/>
+            <w:szCs w:val="13"/>
             <w:u w:val="single"/>
           </w:rPr>
           <w:t xml:space="preserve">Tokeniser/settlement</w:t>
@@ -2645,9 +2767,9 @@
       </w:hyperlink>
       <w:r>
         <w:rPr>
-          <w:color w:val="8E1B2C"/>
-          <w:sz w:val="15"/>
-          <w:szCs w:val="15"/>
+          <w:color w:val="B3272A"/>
+          <w:sz w:val="13"/>
+          <w:szCs w:val="13"/>
         </w:rPr>
         <w:t xml:space="preserve">]</w:t>
       </w:r>
@@ -2656,18 +2778,18 @@
       </w:r>
       <w:r>
         <w:rPr>
-          <w:color w:val="8E1B2C"/>
-          <w:sz w:val="15"/>
-          <w:szCs w:val="15"/>
-        </w:rPr>
-        <w:t xml:space="preserve">[</w:t>
-      </w:r>
-      <w:hyperlink w:history="1" r:id="rId33tfvbaij6weokg3vf7q2">
-        <w:r>
-          <w:rPr>
-            <w:color w:val="8E1B2C"/>
-            <w:sz w:val="15"/>
-            <w:szCs w:val="15"/>
+          <w:color w:val="B3272A"/>
+          <w:sz w:val="13"/>
+          <w:szCs w:val="13"/>
+        </w:rPr>
+        <w:t xml:space="preserve">[</w:t>
+      </w:r>
+      <w:hyperlink w:history="1" r:id="rIdvuyu5eyd3xj7jvrogizfn">
+        <w:r>
+          <w:rPr>
+            <w:color w:val="B3272A"/>
+            <w:sz w:val="13"/>
+            <w:szCs w:val="13"/>
             <w:u w:val="single"/>
           </w:rPr>
           <w:t xml:space="preserve">Tokeniser/efficiency</w:t>
@@ -2675,9 +2797,9 @@
       </w:hyperlink>
       <w:r>
         <w:rPr>
-          <w:color w:val="8E1B2C"/>
-          <w:sz w:val="15"/>
-          <w:szCs w:val="15"/>
+          <w:color w:val="B3272A"/>
+          <w:sz w:val="13"/>
+          <w:szCs w:val="13"/>
         </w:rPr>
         <w:t xml:space="preserve">]</w:t>
       </w:r>
@@ -2699,18 +2821,18 @@
       </w:r>
       <w:r>
         <w:rPr>
-          <w:color w:val="8E1B2C"/>
-          <w:sz w:val="15"/>
-          <w:szCs w:val="15"/>
-        </w:rPr>
-        <w:t xml:space="preserve">[</w:t>
-      </w:r>
-      <w:hyperlink w:history="1" r:id="rId5egd1_2muhgt2ig-3x7b2">
-        <w:r>
-          <w:rPr>
-            <w:color w:val="8E1B2C"/>
-            <w:sz w:val="15"/>
-            <w:szCs w:val="15"/>
+          <w:color w:val="B3272A"/>
+          <w:sz w:val="13"/>
+          <w:szCs w:val="13"/>
+        </w:rPr>
+        <w:t xml:space="preserve">[</w:t>
+      </w:r>
+      <w:hyperlink w:history="1" r:id="rIdlhyhcjul9pmnlvfwolvqr">
+        <w:r>
+          <w:rPr>
+            <w:color w:val="B3272A"/>
+            <w:sz w:val="13"/>
+            <w:szCs w:val="13"/>
             <w:u w:val="single"/>
           </w:rPr>
           <w:t xml:space="preserve">Tokeniser</w:t>
@@ -2718,9 +2840,9 @@
       </w:hyperlink>
       <w:r>
         <w:rPr>
-          <w:color w:val="8E1B2C"/>
-          <w:sz w:val="15"/>
-          <w:szCs w:val="15"/>
+          <w:color w:val="B3272A"/>
+          <w:sz w:val="13"/>
+          <w:szCs w:val="13"/>
         </w:rPr>
         <w:t xml:space="preserve">]</w:t>
       </w:r>
@@ -2729,18 +2851,18 @@
       </w:r>
       <w:r>
         <w:rPr>
-          <w:color w:val="8E1B2C"/>
-          <w:sz w:val="15"/>
-          <w:szCs w:val="15"/>
-        </w:rPr>
-        <w:t xml:space="preserve">[</w:t>
-      </w:r>
-      <w:hyperlink w:history="1" r:id="rIdnfhjakzefeeciy7shlj5k">
-        <w:r>
-          <w:rPr>
-            <w:color w:val="8E1B2C"/>
-            <w:sz w:val="15"/>
-            <w:szCs w:val="15"/>
+          <w:color w:val="B3272A"/>
+          <w:sz w:val="13"/>
+          <w:szCs w:val="13"/>
+        </w:rPr>
+        <w:t xml:space="preserve">[</w:t>
+      </w:r>
+      <w:hyperlink w:history="1" r:id="rIdlirqnavkhbl1jtmw4cbtr">
+        <w:r>
+          <w:rPr>
+            <w:color w:val="B3272A"/>
+            <w:sz w:val="13"/>
+            <w:szCs w:val="13"/>
             <w:u w:val="single"/>
           </w:rPr>
           <w:t xml:space="preserve">Tokeniser</w:t>
@@ -2748,9 +2870,9 @@
       </w:hyperlink>
       <w:r>
         <w:rPr>
-          <w:color w:val="8E1B2C"/>
-          <w:sz w:val="15"/>
-          <w:szCs w:val="15"/>
+          <w:color w:val="B3272A"/>
+          <w:sz w:val="13"/>
+          <w:szCs w:val="13"/>
         </w:rPr>
         <w:t xml:space="preserve">]</w:t>
       </w:r>
@@ -2774,9 +2896,9 @@
         <w:rPr>
           <w:i/>
           <w:iCs/>
-          <w:color w:val="5B6470"/>
-          <w:sz w:val="18"/>
-          <w:szCs w:val="18"/>
+          <w:color w:val="394853"/>
+          <w:sz w:val="16"/>
+          <w:szCs w:val="16"/>
         </w:rPr>
         <w:t xml:space="preserve">Each point below states its factual basis, with sources, and then gives the analysis. The analysis is interpretation by this briefing, not a statement by Redbelly or by Christian Westerlind Wigstrom, and it contains no price commentary or investment advice.</w:t>
       </w:r>
@@ -2805,18 +2927,18 @@
       </w:r>
       <w:r>
         <w:rPr>
-          <w:color w:val="8E1B2C"/>
-          <w:sz w:val="15"/>
-          <w:szCs w:val="15"/>
-        </w:rPr>
-        <w:t xml:space="preserve">[</w:t>
-      </w:r>
-      <w:hyperlink w:history="1" r:id="rIdet3i3zzanrdqd7kssa2zg">
-        <w:r>
-          <w:rPr>
-            <w:color w:val="8E1B2C"/>
-            <w:sz w:val="15"/>
-            <w:szCs w:val="15"/>
+          <w:color w:val="B3272A"/>
+          <w:sz w:val="13"/>
+          <w:szCs w:val="13"/>
+        </w:rPr>
+        <w:t xml:space="preserve">[</w:t>
+      </w:r>
+      <w:hyperlink w:history="1" r:id="rId-bd_i7bx95ij1ouxftwa1">
+        <w:r>
+          <w:rPr>
+            <w:color w:val="B3272A"/>
+            <w:sz w:val="13"/>
+            <w:szCs w:val="13"/>
             <w:u w:val="single"/>
           </w:rPr>
           <w:t xml:space="preserve">Tokeniser/settlement</w:t>
@@ -2824,9 +2946,9 @@
       </w:hyperlink>
       <w:r>
         <w:rPr>
-          <w:color w:val="8E1B2C"/>
-          <w:sz w:val="15"/>
-          <w:szCs w:val="15"/>
+          <w:color w:val="B3272A"/>
+          <w:sz w:val="13"/>
+          <w:szCs w:val="13"/>
         </w:rPr>
         <w:t xml:space="preserve">]</w:t>
       </w:r>
@@ -2835,18 +2957,18 @@
       </w:r>
       <w:r>
         <w:rPr>
-          <w:color w:val="8E1B2C"/>
-          <w:sz w:val="15"/>
-          <w:szCs w:val="15"/>
-        </w:rPr>
-        <w:t xml:space="preserve">[</w:t>
-      </w:r>
-      <w:hyperlink w:history="1" r:id="rIddtxpccybgfib8txrnp-eh">
-        <w:r>
-          <w:rPr>
-            <w:color w:val="8E1B2C"/>
-            <w:sz w:val="15"/>
-            <w:szCs w:val="15"/>
+          <w:color w:val="B3272A"/>
+          <w:sz w:val="13"/>
+          <w:szCs w:val="13"/>
+        </w:rPr>
+        <w:t xml:space="preserve">[</w:t>
+      </w:r>
+      <w:hyperlink w:history="1" r:id="rId6yadxwruccohag3ybgm_x">
+        <w:r>
+          <w:rPr>
+            <w:color w:val="B3272A"/>
+            <w:sz w:val="13"/>
+            <w:szCs w:val="13"/>
             <w:u w:val="single"/>
           </w:rPr>
           <w:t xml:space="preserve">Tokeniser/efficiency</w:t>
@@ -2854,9 +2976,9 @@
       </w:hyperlink>
       <w:r>
         <w:rPr>
-          <w:color w:val="8E1B2C"/>
-          <w:sz w:val="15"/>
-          <w:szCs w:val="15"/>
+          <w:color w:val="B3272A"/>
+          <w:sz w:val="13"/>
+          <w:szCs w:val="13"/>
         </w:rPr>
         <w:t xml:space="preserve">]</w:t>
       </w:r>
@@ -2865,18 +2987,18 @@
       </w:r>
       <w:r>
         <w:rPr>
-          <w:color w:val="8E1B2C"/>
-          <w:sz w:val="15"/>
-          <w:szCs w:val="15"/>
-        </w:rPr>
-        <w:t xml:space="preserve">[</w:t>
-      </w:r>
-      <w:hyperlink w:history="1" r:id="rIdyaczv04vcddxc6p93hfru">
-        <w:r>
-          <w:rPr>
-            <w:color w:val="8E1B2C"/>
-            <w:sz w:val="15"/>
-            <w:szCs w:val="15"/>
+          <w:color w:val="B3272A"/>
+          <w:sz w:val="13"/>
+          <w:szCs w:val="13"/>
+        </w:rPr>
+        <w:t xml:space="preserve">[</w:t>
+      </w:r>
+      <w:hyperlink w:history="1" r:id="rIdkpztzecvmuhf_8y0h7uj0">
+        <w:r>
+          <w:rPr>
+            <w:color w:val="B3272A"/>
+            <w:sz w:val="13"/>
+            <w:szCs w:val="13"/>
             <w:u w:val="single"/>
           </w:rPr>
           <w:t xml:space="preserve">Monoova</w:t>
@@ -2884,9 +3006,9 @@
       </w:hyperlink>
       <w:r>
         <w:rPr>
-          <w:color w:val="8E1B2C"/>
-          <w:sz w:val="15"/>
-          <w:szCs w:val="15"/>
+          <w:color w:val="B3272A"/>
+          <w:sz w:val="13"/>
+          <w:szCs w:val="13"/>
         </w:rPr>
         <w:t xml:space="preserve">]</w:t>
       </w:r>
@@ -2895,18 +3017,18 @@
       </w:r>
       <w:r>
         <w:rPr>
-          <w:color w:val="8E1B2C"/>
-          <w:sz w:val="15"/>
-          <w:szCs w:val="15"/>
-        </w:rPr>
-        <w:t xml:space="preserve">[</w:t>
-      </w:r>
-      <w:hyperlink w:history="1" r:id="rIdy9yq8jnpst1f78la2j9a1">
-        <w:r>
-          <w:rPr>
-            <w:color w:val="8E1B2C"/>
-            <w:sz w:val="15"/>
-            <w:szCs w:val="15"/>
+          <w:color w:val="B3272A"/>
+          <w:sz w:val="13"/>
+          <w:szCs w:val="13"/>
+        </w:rPr>
+        <w:t xml:space="preserve">[</w:t>
+      </w:r>
+      <w:hyperlink w:history="1" r:id="rIddxq1jingczsv3mnnnuos8">
+        <w:r>
+          <w:rPr>
+            <w:color w:val="B3272A"/>
+            <w:sz w:val="13"/>
+            <w:szCs w:val="13"/>
             <w:u w:val="single"/>
           </w:rPr>
           <w:t xml:space="preserve">AusPayPlus</w:t>
@@ -2914,9 +3036,9 @@
       </w:hyperlink>
       <w:r>
         <w:rPr>
-          <w:color w:val="8E1B2C"/>
-          <w:sz w:val="15"/>
-          <w:szCs w:val="15"/>
+          <w:color w:val="B3272A"/>
+          <w:sz w:val="13"/>
+          <w:szCs w:val="13"/>
         </w:rPr>
         <w:t xml:space="preserve">]</w:t>
       </w:r>
@@ -2927,9 +3049,9 @@
     <w:p>
       <w:pPr>
         <w:pBdr>
-          <w:left w:val="single" w:color="B7791F" w:sz="18" w:space="8"/>
+          <w:left w:val="single" w:color="EF5350" w:sz="24" w:space="8"/>
         </w:pBdr>
-        <w:shd w:fill="FBF5E6" w:color="auto" w:val="clear"/>
+        <w:shd w:fill="EDF1F4" w:color="auto" w:val="clear"/>
         <w:spacing w:after="120" w:before="40"/>
         <w:ind w:left="170" w:right="113"/>
       </w:pPr>
@@ -2937,10 +3059,10 @@
         <w:rPr>
           <w:b/>
           <w:bCs/>
-          <w:color w:val="7A4E0E"/>
-          <w:spacing w:val="10"/>
-          <w:sz w:val="16"/>
-          <w:szCs w:val="16"/>
+          <w:color w:val="B3272A"/>
+          <w:spacing w:val="15"/>
+          <w:sz w:val="14"/>
+          <w:szCs w:val="14"/>
         </w:rPr>
         <w:t xml:space="preserve">ANALYSIS</w:t>
       </w:r>
@@ -2975,18 +3097,18 @@
       </w:r>
       <w:r>
         <w:rPr>
-          <w:color w:val="8E1B2C"/>
-          <w:sz w:val="15"/>
-          <w:szCs w:val="15"/>
-        </w:rPr>
-        <w:t xml:space="preserve">[</w:t>
-      </w:r>
-      <w:hyperlink w:history="1" r:id="rIdhsvb0ofwwmimlj-qmi5cl">
-        <w:r>
-          <w:rPr>
-            <w:color w:val="8E1B2C"/>
-            <w:sz w:val="15"/>
-            <w:szCs w:val="15"/>
+          <w:color w:val="B3272A"/>
+          <w:sz w:val="13"/>
+          <w:szCs w:val="13"/>
+        </w:rPr>
+        <w:t xml:space="preserve">[</w:t>
+      </w:r>
+      <w:hyperlink w:history="1" r:id="rIdtls266f_ycnjypk3upfsy">
+        <w:r>
+          <w:rPr>
+            <w:color w:val="B3272A"/>
+            <w:sz w:val="13"/>
+            <w:szCs w:val="13"/>
             <w:u w:val="single"/>
           </w:rPr>
           <w:t xml:space="preserve">Redbelly</w:t>
@@ -2994,9 +3116,9 @@
       </w:hyperlink>
       <w:r>
         <w:rPr>
-          <w:color w:val="8E1B2C"/>
-          <w:sz w:val="15"/>
-          <w:szCs w:val="15"/>
+          <w:color w:val="B3272A"/>
+          <w:sz w:val="13"/>
+          <w:szCs w:val="13"/>
         </w:rPr>
         <w:t xml:space="preserve">]</w:t>
       </w:r>
@@ -3005,18 +3127,18 @@
       </w:r>
       <w:r>
         <w:rPr>
-          <w:color w:val="8E1B2C"/>
-          <w:sz w:val="15"/>
-          <w:szCs w:val="15"/>
-        </w:rPr>
-        <w:t xml:space="preserve">[</w:t>
-      </w:r>
-      <w:hyperlink w:history="1" r:id="rIdzx8elz5-xtetdv_u2nejy">
-        <w:r>
-          <w:rPr>
-            <w:color w:val="8E1B2C"/>
-            <w:sz w:val="15"/>
-            <w:szCs w:val="15"/>
+          <w:color w:val="B3272A"/>
+          <w:sz w:val="13"/>
+          <w:szCs w:val="13"/>
+        </w:rPr>
+        <w:t xml:space="preserve">[</w:t>
+      </w:r>
+      <w:hyperlink w:history="1" r:id="rIdsitlm3ibtac7tvrzc7uoj">
+        <w:r>
+          <w:rPr>
+            <w:color w:val="B3272A"/>
+            <w:sz w:val="13"/>
+            <w:szCs w:val="13"/>
             <w:u w:val="single"/>
           </w:rPr>
           <w:t xml:space="preserve">Tokeniser</w:t>
@@ -3024,9 +3146,9 @@
       </w:hyperlink>
       <w:r>
         <w:rPr>
-          <w:color w:val="8E1B2C"/>
-          <w:sz w:val="15"/>
-          <w:szCs w:val="15"/>
+          <w:color w:val="B3272A"/>
+          <w:sz w:val="13"/>
+          <w:szCs w:val="13"/>
         </w:rPr>
         <w:t xml:space="preserve">]</w:t>
       </w:r>
@@ -3035,18 +3157,18 @@
       </w:r>
       <w:r>
         <w:rPr>
-          <w:color w:val="8E1B2C"/>
-          <w:sz w:val="15"/>
-          <w:szCs w:val="15"/>
-        </w:rPr>
-        <w:t xml:space="preserve">[</w:t>
-      </w:r>
-      <w:hyperlink w:history="1" r:id="rIdk-jmqsxpqb73nrurzns1o">
-        <w:r>
-          <w:rPr>
-            <w:color w:val="8E1B2C"/>
-            <w:sz w:val="15"/>
-            <w:szCs w:val="15"/>
+          <w:color w:val="B3272A"/>
+          <w:sz w:val="13"/>
+          <w:szCs w:val="13"/>
+        </w:rPr>
+        <w:t xml:space="preserve">[</w:t>
+      </w:r>
+      <w:hyperlink w:history="1" r:id="rIdct5zf1pxz234duy_ldgow">
+        <w:r>
+          <w:rPr>
+            <w:color w:val="B3272A"/>
+            <w:sz w:val="13"/>
+            <w:szCs w:val="13"/>
             <w:u w:val="single"/>
           </w:rPr>
           <w:t xml:space="preserve">Tokeniser/funds</w:t>
@@ -3054,9 +3176,9 @@
       </w:hyperlink>
       <w:r>
         <w:rPr>
-          <w:color w:val="8E1B2C"/>
-          <w:sz w:val="15"/>
-          <w:szCs w:val="15"/>
+          <w:color w:val="B3272A"/>
+          <w:sz w:val="13"/>
+          <w:szCs w:val="13"/>
         </w:rPr>
         <w:t xml:space="preserve">]</w:t>
       </w:r>
@@ -3067,9 +3189,9 @@
     <w:p>
       <w:pPr>
         <w:pBdr>
-          <w:left w:val="single" w:color="B7791F" w:sz="18" w:space="8"/>
+          <w:left w:val="single" w:color="EF5350" w:sz="24" w:space="8"/>
         </w:pBdr>
-        <w:shd w:fill="FBF5E6" w:color="auto" w:val="clear"/>
+        <w:shd w:fill="EDF1F4" w:color="auto" w:val="clear"/>
         <w:spacing w:after="120" w:before="40"/>
         <w:ind w:left="170" w:right="113"/>
       </w:pPr>
@@ -3077,10 +3199,10 @@
         <w:rPr>
           <w:b/>
           <w:bCs/>
-          <w:color w:val="7A4E0E"/>
-          <w:spacing w:val="10"/>
-          <w:sz w:val="16"/>
-          <w:szCs w:val="16"/>
+          <w:color w:val="B3272A"/>
+          <w:spacing w:val="15"/>
+          <w:sz w:val="14"/>
+          <w:szCs w:val="14"/>
         </w:rPr>
         <w:t xml:space="preserve">ANALYSIS</w:t>
       </w:r>
@@ -3115,18 +3237,18 @@
       </w:r>
       <w:r>
         <w:rPr>
-          <w:color w:val="8E1B2C"/>
-          <w:sz w:val="15"/>
-          <w:szCs w:val="15"/>
-        </w:rPr>
-        <w:t xml:space="preserve">[</w:t>
-      </w:r>
-      <w:hyperlink w:history="1" r:id="rId6vcrrl71oneom3iwfepok">
-        <w:r>
-          <w:rPr>
-            <w:color w:val="8E1B2C"/>
-            <w:sz w:val="15"/>
-            <w:szCs w:val="15"/>
+          <w:color w:val="B3272A"/>
+          <w:sz w:val="13"/>
+          <w:szCs w:val="13"/>
+        </w:rPr>
+        <w:t xml:space="preserve">[</w:t>
+      </w:r>
+      <w:hyperlink w:history="1" r:id="rId6utya4vzkbleleuhlkafu">
+        <w:r>
+          <w:rPr>
+            <w:color w:val="B3272A"/>
+            <w:sz w:val="13"/>
+            <w:szCs w:val="13"/>
             <w:u w:val="single"/>
           </w:rPr>
           <w:t xml:space="preserve">Redbelly</w:t>
@@ -3134,9 +3256,9 @@
       </w:hyperlink>
       <w:r>
         <w:rPr>
-          <w:color w:val="8E1B2C"/>
-          <w:sz w:val="15"/>
-          <w:szCs w:val="15"/>
+          <w:color w:val="B3272A"/>
+          <w:sz w:val="13"/>
+          <w:szCs w:val="13"/>
         </w:rPr>
         <w:t xml:space="preserve">]</w:t>
       </w:r>
@@ -3145,18 +3267,18 @@
       </w:r>
       <w:r>
         <w:rPr>
-          <w:color w:val="8E1B2C"/>
-          <w:sz w:val="15"/>
-          <w:szCs w:val="15"/>
-        </w:rPr>
-        <w:t xml:space="preserve">[</w:t>
-      </w:r>
-      <w:hyperlink w:history="1" r:id="rIdz4bnv7bikgc5yv7fbb-sf">
-        <w:r>
-          <w:rPr>
-            <w:color w:val="8E1B2C"/>
-            <w:sz w:val="15"/>
-            <w:szCs w:val="15"/>
+          <w:color w:val="B3272A"/>
+          <w:sz w:val="13"/>
+          <w:szCs w:val="13"/>
+        </w:rPr>
+        <w:t xml:space="preserve">[</w:t>
+      </w:r>
+      <w:hyperlink w:history="1" r:id="rId2aungr_o8l3caojwndnhl">
+        <w:r>
+          <w:rPr>
+            <w:color w:val="B3272A"/>
+            <w:sz w:val="13"/>
+            <w:szCs w:val="13"/>
             <w:u w:val="single"/>
           </w:rPr>
           <w:t xml:space="preserve">Tokeniser</w:t>
@@ -3164,9 +3286,9 @@
       </w:hyperlink>
       <w:r>
         <w:rPr>
-          <w:color w:val="8E1B2C"/>
-          <w:sz w:val="15"/>
-          <w:szCs w:val="15"/>
+          <w:color w:val="B3272A"/>
+          <w:sz w:val="13"/>
+          <w:szCs w:val="13"/>
         </w:rPr>
         <w:t xml:space="preserve">]</w:t>
       </w:r>
@@ -3175,18 +3297,18 @@
       </w:r>
       <w:r>
         <w:rPr>
-          <w:color w:val="8E1B2C"/>
-          <w:sz w:val="15"/>
-          <w:szCs w:val="15"/>
-        </w:rPr>
-        <w:t xml:space="preserve">[</w:t>
-      </w:r>
-      <w:hyperlink w:history="1" r:id="rIdjwzfnxxyamz14giuq3fns">
-        <w:r>
-          <w:rPr>
-            <w:color w:val="8E1B2C"/>
-            <w:sz w:val="15"/>
-            <w:szCs w:val="15"/>
+          <w:color w:val="B3272A"/>
+          <w:sz w:val="13"/>
+          <w:szCs w:val="13"/>
+        </w:rPr>
+        <w:t xml:space="preserve">[</w:t>
+      </w:r>
+      <w:hyperlink w:history="1" r:id="rIdpnkzfmwi6tp7vvozp9jbp">
+        <w:r>
+          <w:rPr>
+            <w:color w:val="B3272A"/>
+            <w:sz w:val="13"/>
+            <w:szCs w:val="13"/>
             <w:u w:val="single"/>
           </w:rPr>
           <w:t xml:space="preserve">Tokeniser/why-tokenise</w:t>
@@ -3194,9 +3316,9 @@
       </w:hyperlink>
       <w:r>
         <w:rPr>
-          <w:color w:val="8E1B2C"/>
-          <w:sz w:val="15"/>
-          <w:szCs w:val="15"/>
+          <w:color w:val="B3272A"/>
+          <w:sz w:val="13"/>
+          <w:szCs w:val="13"/>
         </w:rPr>
         <w:t xml:space="preserve">]</w:t>
       </w:r>
@@ -3207,9 +3329,9 @@
     <w:p>
       <w:pPr>
         <w:pBdr>
-          <w:left w:val="single" w:color="B7791F" w:sz="18" w:space="8"/>
+          <w:left w:val="single" w:color="EF5350" w:sz="24" w:space="8"/>
         </w:pBdr>
-        <w:shd w:fill="FBF5E6" w:color="auto" w:val="clear"/>
+        <w:shd w:fill="EDF1F4" w:color="auto" w:val="clear"/>
         <w:spacing w:after="120" w:before="40"/>
         <w:ind w:left="170" w:right="113"/>
       </w:pPr>
@@ -3217,10 +3339,10 @@
         <w:rPr>
           <w:b/>
           <w:bCs/>
-          <w:color w:val="7A4E0E"/>
-          <w:spacing w:val="10"/>
-          <w:sz w:val="16"/>
-          <w:szCs w:val="16"/>
+          <w:color w:val="B3272A"/>
+          <w:spacing w:val="15"/>
+          <w:sz w:val="14"/>
+          <w:szCs w:val="14"/>
         </w:rPr>
         <w:t xml:space="preserve">ANALYSIS</w:t>
       </w:r>
@@ -3255,18 +3377,18 @@
       </w:r>
       <w:r>
         <w:rPr>
-          <w:color w:val="8E1B2C"/>
-          <w:sz w:val="15"/>
-          <w:szCs w:val="15"/>
-        </w:rPr>
-        <w:t xml:space="preserve">[</w:t>
-      </w:r>
-      <w:hyperlink w:history="1" r:id="rId1vd63pgz9rezjvyrbrgny">
-        <w:r>
-          <w:rPr>
-            <w:color w:val="8E1B2C"/>
-            <w:sz w:val="15"/>
-            <w:szCs w:val="15"/>
+          <w:color w:val="B3272A"/>
+          <w:sz w:val="13"/>
+          <w:szCs w:val="13"/>
+        </w:rPr>
+        <w:t xml:space="preserve">[</w:t>
+      </w:r>
+      <w:hyperlink w:history="1" r:id="rId5hmj8-bxvliqnw82bdsam">
+        <w:r>
+          <w:rPr>
+            <w:color w:val="B3272A"/>
+            <w:sz w:val="13"/>
+            <w:szCs w:val="13"/>
             <w:u w:val="single"/>
           </w:rPr>
           <w:t xml:space="preserve">Redbelly</w:t>
@@ -3274,18 +3396,18 @@
       </w:hyperlink>
       <w:r>
         <w:rPr>
-          <w:color w:val="8E1B2C"/>
-          <w:sz w:val="15"/>
-          <w:szCs w:val="15"/>
+          <w:color w:val="B3272A"/>
+          <w:sz w:val="13"/>
+          <w:szCs w:val="13"/>
         </w:rPr>
         <w:t xml:space="preserve"> · </w:t>
       </w:r>
-      <w:hyperlink w:history="1" r:id="rIdl22n5_izyjjiprduli9ym">
-        <w:r>
-          <w:rPr>
-            <w:color w:val="8E1B2C"/>
-            <w:sz w:val="15"/>
-            <w:szCs w:val="15"/>
+      <w:hyperlink w:history="1" r:id="rId-crxfm6ktv8gm6s5fsi-_">
+        <w:r>
+          <w:rPr>
+            <w:color w:val="B3272A"/>
+            <w:sz w:val="13"/>
+            <w:szCs w:val="13"/>
             <w:u w:val="single"/>
           </w:rPr>
           <w:t xml:space="preserve">SMB Tech</w:t>
@@ -3293,9 +3415,9 @@
       </w:hyperlink>
       <w:r>
         <w:rPr>
-          <w:color w:val="8E1B2C"/>
-          <w:sz w:val="15"/>
-          <w:szCs w:val="15"/>
+          <w:color w:val="B3272A"/>
+          <w:sz w:val="13"/>
+          <w:szCs w:val="13"/>
         </w:rPr>
         <w:t xml:space="preserve">]</w:t>
       </w:r>
@@ -3304,18 +3426,18 @@
       </w:r>
       <w:r>
         <w:rPr>
-          <w:color w:val="8E1B2C"/>
-          <w:sz w:val="15"/>
-          <w:szCs w:val="15"/>
-        </w:rPr>
-        <w:t xml:space="preserve">[</w:t>
-      </w:r>
-      <w:hyperlink w:history="1" r:id="rIdzgujmdmd5djmu7uhl6k-g">
-        <w:r>
-          <w:rPr>
-            <w:color w:val="8E1B2C"/>
-            <w:sz w:val="15"/>
-            <w:szCs w:val="15"/>
+          <w:color w:val="B3272A"/>
+          <w:sz w:val="13"/>
+          <w:szCs w:val="13"/>
+        </w:rPr>
+        <w:t xml:space="preserve">[</w:t>
+      </w:r>
+      <w:hyperlink w:history="1" r:id="rIdjeaz6hzw3uhdwwwk7xtxb">
+        <w:r>
+          <w:rPr>
+            <w:color w:val="B3272A"/>
+            <w:sz w:val="13"/>
+            <w:szCs w:val="13"/>
             <w:u w:val="single"/>
           </w:rPr>
           <w:t xml:space="preserve">AusPayNet</w:t>
@@ -3323,9 +3445,9 @@
       </w:hyperlink>
       <w:r>
         <w:rPr>
-          <w:color w:val="8E1B2C"/>
-          <w:sz w:val="15"/>
-          <w:szCs w:val="15"/>
+          <w:color w:val="B3272A"/>
+          <w:sz w:val="13"/>
+          <w:szCs w:val="13"/>
         </w:rPr>
         <w:t xml:space="preserve">]</w:t>
       </w:r>
@@ -3336,9 +3458,9 @@
     <w:p>
       <w:pPr>
         <w:pBdr>
-          <w:left w:val="single" w:color="B7791F" w:sz="18" w:space="8"/>
+          <w:left w:val="single" w:color="EF5350" w:sz="24" w:space="8"/>
         </w:pBdr>
-        <w:shd w:fill="FBF5E6" w:color="auto" w:val="clear"/>
+        <w:shd w:fill="EDF1F4" w:color="auto" w:val="clear"/>
         <w:spacing w:after="120" w:before="40"/>
         <w:ind w:left="170" w:right="113"/>
       </w:pPr>
@@ -3346,10 +3468,10 @@
         <w:rPr>
           <w:b/>
           <w:bCs/>
-          <w:color w:val="7A4E0E"/>
-          <w:spacing w:val="10"/>
-          <w:sz w:val="16"/>
-          <w:szCs w:val="16"/>
+          <w:color w:val="B3272A"/>
+          <w:spacing w:val="15"/>
+          <w:sz w:val="14"/>
+          <w:szCs w:val="14"/>
         </w:rPr>
         <w:t xml:space="preserve">ANALYSIS</w:t>
       </w:r>
@@ -3384,18 +3506,18 @@
       </w:r>
       <w:r>
         <w:rPr>
-          <w:color w:val="8E1B2C"/>
-          <w:sz w:val="15"/>
-          <w:szCs w:val="15"/>
-        </w:rPr>
-        <w:t xml:space="preserve">[</w:t>
-      </w:r>
-      <w:hyperlink w:history="1" r:id="rIdeyymxatelychvqbrofrrt">
-        <w:r>
-          <w:rPr>
-            <w:color w:val="8E1B2C"/>
-            <w:sz w:val="15"/>
-            <w:szCs w:val="15"/>
+          <w:color w:val="B3272A"/>
+          <w:sz w:val="13"/>
+          <w:szCs w:val="13"/>
+        </w:rPr>
+        <w:t xml:space="preserve">[</w:t>
+      </w:r>
+      <w:hyperlink w:history="1" r:id="rIdlgoxhdnn0dtnns1lllqyw">
+        <w:r>
+          <w:rPr>
+            <w:color w:val="B3272A"/>
+            <w:sz w:val="13"/>
+            <w:szCs w:val="13"/>
             <w:u w:val="single"/>
           </w:rPr>
           <w:t xml:space="preserve">Redbelly</w:t>
@@ -3403,9 +3525,9 @@
       </w:hyperlink>
       <w:r>
         <w:rPr>
-          <w:color w:val="8E1B2C"/>
-          <w:sz w:val="15"/>
-          <w:szCs w:val="15"/>
+          <w:color w:val="B3272A"/>
+          <w:sz w:val="13"/>
+          <w:szCs w:val="13"/>
         </w:rPr>
         <w:t xml:space="preserve">]</w:t>
       </w:r>
@@ -3414,18 +3536,18 @@
       </w:r>
       <w:r>
         <w:rPr>
-          <w:color w:val="8E1B2C"/>
-          <w:sz w:val="15"/>
-          <w:szCs w:val="15"/>
-        </w:rPr>
-        <w:t xml:space="preserve">[</w:t>
-      </w:r>
-      <w:hyperlink w:history="1" r:id="rId5jeohdm4cbotmz-9li-_h">
-        <w:r>
-          <w:rPr>
-            <w:color w:val="8E1B2C"/>
-            <w:sz w:val="15"/>
-            <w:szCs w:val="15"/>
+          <w:color w:val="B3272A"/>
+          <w:sz w:val="13"/>
+          <w:szCs w:val="13"/>
+        </w:rPr>
+        <w:t xml:space="preserve">[</w:t>
+      </w:r>
+      <w:hyperlink w:history="1" r:id="rIdthszooqp0cmnww7flttsq">
+        <w:r>
+          <w:rPr>
+            <w:color w:val="B3272A"/>
+            <w:sz w:val="13"/>
+            <w:szCs w:val="13"/>
             <w:u w:val="single"/>
           </w:rPr>
           <w:t xml:space="preserve">Redbelly</w:t>
@@ -3433,9 +3555,9 @@
       </w:hyperlink>
       <w:r>
         <w:rPr>
-          <w:color w:val="8E1B2C"/>
-          <w:sz w:val="15"/>
-          <w:szCs w:val="15"/>
+          <w:color w:val="B3272A"/>
+          <w:sz w:val="13"/>
+          <w:szCs w:val="13"/>
         </w:rPr>
         <w:t xml:space="preserve">]</w:t>
       </w:r>
@@ -3446,9 +3568,9 @@
     <w:p>
       <w:pPr>
         <w:pBdr>
-          <w:left w:val="single" w:color="B7791F" w:sz="18" w:space="8"/>
+          <w:left w:val="single" w:color="EF5350" w:sz="24" w:space="8"/>
         </w:pBdr>
-        <w:shd w:fill="FBF5E6" w:color="auto" w:val="clear"/>
+        <w:shd w:fill="EDF1F4" w:color="auto" w:val="clear"/>
         <w:spacing w:after="120" w:before="40"/>
         <w:ind w:left="170" w:right="113"/>
       </w:pPr>
@@ -3456,10 +3578,10 @@
         <w:rPr>
           <w:b/>
           <w:bCs/>
-          <w:color w:val="7A4E0E"/>
-          <w:spacing w:val="10"/>
-          <w:sz w:val="16"/>
-          <w:szCs w:val="16"/>
+          <w:color w:val="B3272A"/>
+          <w:spacing w:val="15"/>
+          <w:sz w:val="14"/>
+          <w:szCs w:val="14"/>
         </w:rPr>
         <w:t xml:space="preserve">ANALYSIS</w:t>
       </w:r>
@@ -3471,18 +3593,18 @@
       </w:r>
       <w:r>
         <w:rPr>
-          <w:color w:val="8E1B2C"/>
-          <w:sz w:val="15"/>
-          <w:szCs w:val="15"/>
-        </w:rPr>
-        <w:t xml:space="preserve">[</w:t>
-      </w:r>
-      <w:hyperlink w:history="1" r:id="rIdxyme-ze20cg_kkorvau_b">
-        <w:r>
-          <w:rPr>
-            <w:color w:val="8E1B2C"/>
-            <w:sz w:val="15"/>
-            <w:szCs w:val="15"/>
+          <w:color w:val="B3272A"/>
+          <w:sz w:val="13"/>
+          <w:szCs w:val="13"/>
+        </w:rPr>
+        <w:t xml:space="preserve">[</w:t>
+      </w:r>
+      <w:hyperlink w:history="1" r:id="rIdjwof1h8anhhtqsqybnv6h">
+        <w:r>
+          <w:rPr>
+            <w:color w:val="B3272A"/>
+            <w:sz w:val="13"/>
+            <w:szCs w:val="13"/>
             <w:u w:val="single"/>
           </w:rPr>
           <w:t xml:space="preserve">Banking Day</w:t>
@@ -3490,9 +3612,9 @@
       </w:hyperlink>
       <w:r>
         <w:rPr>
-          <w:color w:val="8E1B2C"/>
-          <w:sz w:val="15"/>
-          <w:szCs w:val="15"/>
+          <w:color w:val="B3272A"/>
+          <w:sz w:val="13"/>
+          <w:szCs w:val="13"/>
         </w:rPr>
         <w:t xml:space="preserve">]</w:t>
       </w:r>
@@ -3567,26 +3689,27 @@
     </w:pPr>
     <w:r>
       <w:rPr>
-        <w:color w:val="5B6470"/>
-        <w:sz w:val="16"/>
-        <w:szCs w:val="16"/>
+        <w:color w:val="596975"/>
+        <w:sz w:val="14"/>
+        <w:szCs w:val="14"/>
       </w:rPr>
       <w:t xml:space="preserve">Informational only: no price commentary, investment advice or promises of returns.</w:t>
     </w:r>
     <w:r>
       <w:rPr>
-        <w:color w:val="5B6470"/>
-        <w:sz w:val="16"/>
-        <w:szCs w:val="16"/>
+        <w:color w:val="596975"/>
+        <w:sz w:val="14"/>
+        <w:szCs w:val="14"/>
       </w:rPr>
       <w:tab/>
       <w:t xml:space="preserve">Page </w:t>
     </w:r>
     <w:r>
       <w:rPr>
-        <w:color w:val="5B6470"/>
-        <w:sz w:val="16"/>
-        <w:szCs w:val="16"/>
+        <w:rFonts w:ascii="JetBrains Mono" w:cs="JetBrains Mono" w:eastAsia="JetBrains Mono" w:hAnsi="JetBrains Mono"/>
+        <w:color w:val="596975"/>
+        <w:sz w:val="13"/>
+        <w:szCs w:val="13"/>
       </w:rPr>
       <w:fldChar w:fldCharType="begin"/>
       <w:instrText xml:space="preserve">PAGE</w:instrText>
@@ -3595,17 +3718,18 @@
     </w:r>
     <w:r>
       <w:rPr>
-        <w:color w:val="5B6470"/>
-        <w:sz w:val="16"/>
-        <w:szCs w:val="16"/>
+        <w:color w:val="596975"/>
+        <w:sz w:val="14"/>
+        <w:szCs w:val="14"/>
       </w:rPr>
       <w:t xml:space="preserve"> of </w:t>
     </w:r>
     <w:r>
       <w:rPr>
-        <w:color w:val="5B6470"/>
-        <w:sz w:val="16"/>
-        <w:szCs w:val="16"/>
+        <w:rFonts w:ascii="JetBrains Mono" w:cs="JetBrains Mono" w:eastAsia="JetBrains Mono" w:hAnsi="JetBrains Mono"/>
+        <w:color w:val="596975"/>
+        <w:sz w:val="13"/>
+        <w:szCs w:val="13"/>
       </w:rPr>
       <w:fldChar w:fldCharType="begin"/>
       <w:instrText xml:space="preserve">NUMPAGES</w:instrText>
@@ -3627,26 +3751,27 @@
     </w:pPr>
     <w:r>
       <w:rPr>
-        <w:color w:val="5B6470"/>
-        <w:sz w:val="16"/>
-        <w:szCs w:val="16"/>
+        <w:color w:val="596975"/>
+        <w:sz w:val="14"/>
+        <w:szCs w:val="14"/>
       </w:rPr>
       <w:t xml:space="preserve">Informational only: no price commentary, investment advice or promises of returns.</w:t>
     </w:r>
     <w:r>
       <w:rPr>
-        <w:color w:val="5B6470"/>
-        <w:sz w:val="16"/>
-        <w:szCs w:val="16"/>
+        <w:color w:val="596975"/>
+        <w:sz w:val="14"/>
+        <w:szCs w:val="14"/>
       </w:rPr>
       <w:tab/>
       <w:t xml:space="preserve">Page </w:t>
     </w:r>
     <w:r>
       <w:rPr>
-        <w:color w:val="5B6470"/>
-        <w:sz w:val="16"/>
-        <w:szCs w:val="16"/>
+        <w:rFonts w:ascii="JetBrains Mono" w:cs="JetBrains Mono" w:eastAsia="JetBrains Mono" w:hAnsi="JetBrains Mono"/>
+        <w:color w:val="596975"/>
+        <w:sz w:val="13"/>
+        <w:szCs w:val="13"/>
       </w:rPr>
       <w:fldChar w:fldCharType="begin"/>
       <w:instrText xml:space="preserve">PAGE</w:instrText>
@@ -3655,17 +3780,18 @@
     </w:r>
     <w:r>
       <w:rPr>
-        <w:color w:val="5B6470"/>
-        <w:sz w:val="16"/>
-        <w:szCs w:val="16"/>
+        <w:color w:val="596975"/>
+        <w:sz w:val="14"/>
+        <w:szCs w:val="14"/>
       </w:rPr>
       <w:t xml:space="preserve"> of </w:t>
     </w:r>
     <w:r>
       <w:rPr>
-        <w:color w:val="5B6470"/>
-        <w:sz w:val="16"/>
-        <w:szCs w:val="16"/>
+        <w:rFonts w:ascii="JetBrains Mono" w:cs="JetBrains Mono" w:eastAsia="JetBrains Mono" w:hAnsi="JetBrains Mono"/>
+        <w:color w:val="596975"/>
+        <w:sz w:val="13"/>
+        <w:szCs w:val="13"/>
       </w:rPr>
       <w:fldChar w:fldCharType="begin"/>
       <w:instrText xml:space="preserve">NUMPAGES</w:instrText>
@@ -3722,11 +3848,20 @@
     </w:pPr>
     <w:r>
       <w:rPr>
-        <w:color w:val="5B6470"/>
-        <w:sz w:val="16"/>
-        <w:szCs w:val="16"/>
+        <w:color w:val="596975"/>
+        <w:sz w:val="14"/>
+        <w:szCs w:val="14"/>
       </w:rPr>
-      <w:t xml:space="preserve">Redbelly DAO · New CEO briefing · 29 October 2026</w:t>
+      <w:t xml:space="preserve">Redbelly DAO · New CEO briefing · </w:t>
+    </w:r>
+    <w:r>
+      <w:rPr>
+        <w:rFonts w:ascii="JetBrains Mono" w:cs="JetBrains Mono" w:eastAsia="JetBrains Mono" w:hAnsi="JetBrains Mono"/>
+        <w:color w:val="596975"/>
+        <w:sz w:val="13"/>
+        <w:szCs w:val="13"/>
+      </w:rPr>
+      <w:t xml:space="preserve">29 October 2026</w:t>
     </w:r>
   </w:p>
 </w:hdr>
@@ -3856,15 +3991,15 @@
   <w:docDefaults>
     <w:rPrDefault>
       <w:rPr>
-        <w:rFonts w:ascii="Calibri" w:cs="Calibri" w:eastAsia="Calibri" w:hAnsi="Calibri"/>
-        <w:color w:val="1F2328"/>
-        <w:sz w:val="21"/>
-        <w:szCs w:val="21"/>
+        <w:rFonts w:ascii="Be Vietnam Pro" w:cs="Be Vietnam Pro" w:eastAsia="Be Vietnam Pro" w:hAnsi="Be Vietnam Pro"/>
+        <w:color w:val="0F1A22"/>
+        <w:sz w:val="18"/>
+        <w:szCs w:val="18"/>
       </w:rPr>
     </w:rPrDefault>
     <w:pPrDefault>
       <w:pPr>
-        <w:spacing w:after="100" w:line="259"/>
+        <w:spacing w:after="90" w:line="259"/>
       </w:pPr>
     </w:pPrDefault>
   </w:docDefaults>
@@ -4047,18 +4182,19 @@
     <w:pPr>
       <w:keepNext/>
       <w:pBdr>
-        <w:bottom w:val="single" w:color="D5D9DE" w:sz="4" w:space="2"/>
+        <w:bottom w:val="single" w:color="D3DBE1" w:sz="4" w:space="2"/>
       </w:pBdr>
-      <w:spacing w:after="70" w:before="220"/>
+      <w:spacing w:after="80" w:before="240"/>
       <w:outlineLvl w:val="0"/>
     </w:pPr>
     <w:rPr>
-      <w:rFonts w:ascii="Calibri" w:cs="Calibri" w:eastAsia="Calibri" w:hAnsi="Calibri"/>
+      <w:rFonts w:ascii="Be Vietnam Pro" w:cs="Be Vietnam Pro" w:eastAsia="Be Vietnam Pro" w:hAnsi="Be Vietnam Pro"/>
       <w:b/>
       <w:bCs/>
-      <w:color w:val="8E1B2C"/>
-      <w:sz w:val="25"/>
-      <w:szCs w:val="25"/>
+      <w:color w:val="0F1A22"/>
+      <w:spacing w:val="-4"/>
+      <w:sz w:val="24"/>
+      <w:szCs w:val="24"/>
     </w:rPr>
   </w:style>
   <w:style w:type="paragraph" w:styleId="Furniture">
@@ -4069,10 +4205,10 @@
       <w:spacing w:after="0"/>
     </w:pPr>
     <w:rPr>
-      <w:rFonts w:ascii="Calibri" w:cs="Calibri" w:eastAsia="Calibri" w:hAnsi="Calibri"/>
-      <w:color w:val="5B6470"/>
-      <w:sz w:val="16"/>
-      <w:szCs w:val="16"/>
+      <w:rFonts w:ascii="Be Vietnam Pro" w:cs="Be Vietnam Pro" w:eastAsia="Be Vietnam Pro" w:hAnsi="Be Vietnam Pro"/>
+      <w:color w:val="596975"/>
+      <w:sz w:val="14"/>
+      <w:szCs w:val="14"/>
     </w:rPr>
   </w:style>
   <w:style w:type="paragraph" w:styleId="Heading2">
@@ -4086,12 +4222,10 @@
       <w:outlineLvl w:val="1"/>
     </w:pPr>
     <w:rPr>
-      <w:rFonts w:ascii="Calibri" w:cs="Calibri" w:eastAsia="Calibri" w:hAnsi="Calibri"/>
-      <w:b/>
-      <w:bCs/>
-      <w:color w:val="1F2328"/>
-      <w:sz w:val="21"/>
-      <w:szCs w:val="21"/>
+      <w:rFonts w:ascii="Be Vietnam Pro SemiBold" w:cs="Be Vietnam Pro SemiBold" w:eastAsia="Be Vietnam Pro SemiBold" w:hAnsi="Be Vietnam Pro SemiBold"/>
+      <w:color w:val="0F1A22"/>
+      <w:sz w:val="19"/>
+      <w:szCs w:val="19"/>
     </w:rPr>
   </w:style>
 </w:styles>

</xml_diff>

<commit_message>
Add LinkedIn screenshots to the source list and page previews to the README
</commit_message>
<xml_diff>
--- a/01-briefing/new-ceo-briefing.docx
+++ b/01-briefing/new-ceo-briefing.docx
@@ -224,7 +224,7 @@
         </w:rPr>
         <w:t xml:space="preserve">[</w:t>
       </w:r>
-      <w:hyperlink w:history="1" r:id="rIdigrsr_bzxwerikrdmx4uh">
+      <w:hyperlink w:history="1" r:id="rIdmdswwyxqkoq47cworz_nq">
         <w:r>
           <w:rPr>
             <w:color w:val="B3272A"/>
@@ -243,7 +243,7 @@
         </w:rPr>
         <w:t xml:space="preserve"> · </w:t>
       </w:r>
-      <w:hyperlink w:history="1" r:id="rIdkmvnubejfxr3upida_ewf">
+      <w:hyperlink w:history="1" r:id="rIdqp74jhpwd_b8na1cfzzbz">
         <w:r>
           <w:rPr>
             <w:color w:val="B3272A"/>
@@ -262,7 +262,7 @@
         </w:rPr>
         <w:t xml:space="preserve"> · </w:t>
       </w:r>
-      <w:hyperlink w:history="1" r:id="rIdwahhltgn7tbxmum-i5skp">
+      <w:hyperlink w:history="1" r:id="rIdvmrfz7wkr2aaqqegpoybq">
         <w:r>
           <w:rPr>
             <w:color w:val="B3272A"/>
@@ -292,7 +292,7 @@
         </w:rPr>
         <w:t xml:space="preserve">[</w:t>
       </w:r>
-      <w:hyperlink w:history="1" r:id="rId97ucjcvw2vkakdigid0lq">
+      <w:hyperlink w:history="1" r:id="rIdsj1d39_5_lch6trjmqk9h">
         <w:r>
           <w:rPr>
             <w:color w:val="B3272A"/>
@@ -322,7 +322,7 @@
         </w:rPr>
         <w:t xml:space="preserve">[</w:t>
       </w:r>
-      <w:hyperlink w:history="1" r:id="rIdt5wvkobxe9-lbjnhkvtgn">
+      <w:hyperlink w:history="1" r:id="rIdl1xymh-oifo06lpb50p7n">
         <w:r>
           <w:rPr>
             <w:color w:val="B3272A"/>
@@ -341,7 +341,7 @@
         </w:rPr>
         <w:t xml:space="preserve"> · </w:t>
       </w:r>
-      <w:hyperlink w:history="1" r:id="rIdx5y-nzbgj1z3cctvq-a7z">
+      <w:hyperlink w:history="1" r:id="rIdtpemmhhj_t-mrpoft03lk">
         <w:r>
           <w:rPr>
             <w:color w:val="B3272A"/>
@@ -360,7 +360,7 @@
         </w:rPr>
         <w:t xml:space="preserve"> · </w:t>
       </w:r>
-      <w:hyperlink w:history="1" r:id="rIdrtceoycvqyztukrzqjl1o">
+      <w:hyperlink w:history="1" r:id="rId_zznq4khhz2cqvu7zh2jj">
         <w:r>
           <w:rPr>
             <w:color w:val="B3272A"/>
@@ -390,7 +390,7 @@
         </w:rPr>
         <w:t xml:space="preserve">[</w:t>
       </w:r>
-      <w:hyperlink w:history="1" r:id="rIdea_-d4n3ipg2pmryi2y11">
+      <w:hyperlink w:history="1" r:id="rIdgdwxdllavd_xibhfz6c6t">
         <w:r>
           <w:rPr>
             <w:color w:val="B3272A"/>
@@ -409,7 +409,7 @@
         </w:rPr>
         <w:t xml:space="preserve"> · </w:t>
       </w:r>
-      <w:hyperlink w:history="1" r:id="rId_bmbxoy2nbbvje5asmlqf">
+      <w:hyperlink w:history="1" r:id="rIdvdnvcmyfu2wcowrpq8l0z">
         <w:r>
           <w:rPr>
             <w:color w:val="B3272A"/>
@@ -439,7 +439,7 @@
         </w:rPr>
         <w:t xml:space="preserve">[</w:t>
       </w:r>
-      <w:hyperlink w:history="1" r:id="rId9xrpep04364ugpeuujeab">
+      <w:hyperlink w:history="1" r:id="rIdv4q42zaz_s4glv4kubvir">
         <w:r>
           <w:rPr>
             <w:color w:val="B3272A"/>
@@ -496,7 +496,7 @@
         </w:rPr>
         <w:t xml:space="preserve">[</w:t>
       </w:r>
-      <w:hyperlink w:history="1" r:id="rIdgnz4xbdn6twqprdabth4z">
+      <w:hyperlink w:history="1" r:id="rId5gauxe79xy7i1bsp3aybi">
         <w:r>
           <w:rPr>
             <w:color w:val="B3272A"/>
@@ -526,7 +526,7 @@
         </w:rPr>
         <w:t xml:space="preserve">[</w:t>
       </w:r>
-      <w:hyperlink w:history="1" r:id="rIdz_pmyystkgamn_-6smi_w">
+      <w:hyperlink w:history="1" r:id="rIddakzm4c_3tt9e1x298tdx">
         <w:r>
           <w:rPr>
             <w:color w:val="B3272A"/>
@@ -641,7 +641,7 @@
               </w:rPr>
               <w:t xml:space="preserve">[</w:t>
             </w:r>
-            <w:hyperlink w:history="1" r:id="rIdkcfyreoyw0x8wwuhwek-u">
+            <w:hyperlink w:history="1" r:id="rIdzuqc9wkcqg0gynrxui0zs">
               <w:r>
                 <w:rPr>
                   <w:color w:val="B3272A"/>
@@ -660,7 +660,7 @@
               </w:rPr>
               <w:t xml:space="preserve"> · </w:t>
             </w:r>
-            <w:hyperlink w:history="1" r:id="rIdc2t3ylt4ug4tlgokr71cn">
+            <w:hyperlink w:history="1" r:id="rIdiyckyr7ucitsgltjifnli">
               <w:r>
                 <w:rPr>
                   <w:color w:val="B3272A"/>
@@ -757,7 +757,7 @@
               </w:rPr>
               <w:t xml:space="preserve">[</w:t>
             </w:r>
-            <w:hyperlink w:history="1" r:id="rId3dnrguoxxcydarxhv49wm">
+            <w:hyperlink w:history="1" r:id="rId27l6rvzbj1spuasmowbuh">
               <w:r>
                 <w:rPr>
                   <w:color w:val="B3272A"/>
@@ -854,7 +854,7 @@
               </w:rPr>
               <w:t xml:space="preserve">[</w:t>
             </w:r>
-            <w:hyperlink w:history="1" r:id="rIdv-drzpktpllkbdmxq3yby">
+            <w:hyperlink w:history="1" r:id="rId1wuvtzd6nhcqbispbh1b0">
               <w:r>
                 <w:rPr>
                   <w:color w:val="B3272A"/>
@@ -951,7 +951,7 @@
               </w:rPr>
               <w:t xml:space="preserve">[</w:t>
             </w:r>
-            <w:hyperlink w:history="1" r:id="rIdfbbl-an0l9qt2utzafwrw">
+            <w:hyperlink w:history="1" r:id="rIdbpjgpbw7aehgjs8jtmyoh">
               <w:r>
                 <w:rPr>
                   <w:color w:val="B3272A"/>
@@ -1048,7 +1048,7 @@
               </w:rPr>
               <w:t xml:space="preserve">[</w:t>
             </w:r>
-            <w:hyperlink w:history="1" r:id="rIdesguxx6xl1ve4cxsywadp">
+            <w:hyperlink w:history="1" r:id="rIdz-y6y8joeaac4sbf8je37">
               <w:r>
                 <w:rPr>
                   <w:color w:val="B3272A"/>
@@ -1145,7 +1145,7 @@
               </w:rPr>
               <w:t xml:space="preserve">[</w:t>
             </w:r>
-            <w:hyperlink w:history="1" r:id="rIdcxjg3argcvg5zndh56iqs">
+            <w:hyperlink w:history="1" r:id="rIdrtlmprb2wirrmysholrdb">
               <w:r>
                 <w:rPr>
                   <w:color w:val="B3272A"/>
@@ -1242,7 +1242,7 @@
               </w:rPr>
               <w:t xml:space="preserve">[</w:t>
             </w:r>
-            <w:hyperlink w:history="1" r:id="rIdkdnsxamprwisxrlbmttml">
+            <w:hyperlink w:history="1" r:id="rIdubmgnjbg5kcbdxddlokae">
               <w:r>
                 <w:rPr>
                   <w:color w:val="B3272A"/>
@@ -1308,7 +1308,7 @@
         </w:rPr>
         <w:t xml:space="preserve">[</w:t>
       </w:r>
-      <w:hyperlink w:history="1" r:id="rIdlkop83gohwgwwqxaclmzj">
+      <w:hyperlink w:history="1" r:id="rIdzombjp9xjxolmkttcylxf">
         <w:r>
           <w:rPr>
             <w:color w:val="B3272A"/>
@@ -1351,7 +1351,7 @@
         </w:rPr>
         <w:t xml:space="preserve">[</w:t>
       </w:r>
-      <w:hyperlink w:history="1" r:id="rIdgwuvll_bby7b4m9i7yi34">
+      <w:hyperlink w:history="1" r:id="rIdwajolq6elokj-c-0hyniz">
         <w:r>
           <w:rPr>
             <w:color w:val="B3272A"/>
@@ -1381,7 +1381,7 @@
         </w:rPr>
         <w:t xml:space="preserve">[</w:t>
       </w:r>
-      <w:hyperlink w:history="1" r:id="rId9hcsuymuxiic5i5ywcfme">
+      <w:hyperlink w:history="1" r:id="rIdbvpphjk-dfa7eoo6j8jek">
         <w:r>
           <w:rPr>
             <w:color w:val="B3272A"/>
@@ -1411,7 +1411,7 @@
         </w:rPr>
         <w:t xml:space="preserve">[</w:t>
       </w:r>
-      <w:hyperlink w:history="1" r:id="rIdkpo5yygpmpdjnp9u_5so8">
+      <w:hyperlink w:history="1" r:id="rIdp9saxltfqztoak4srcuom">
         <w:r>
           <w:rPr>
             <w:color w:val="B3272A"/>
@@ -1454,7 +1454,7 @@
         </w:rPr>
         <w:t xml:space="preserve">[</w:t>
       </w:r>
-      <w:hyperlink w:history="1" r:id="rIdhqcwjj9deurdbunopdyu_">
+      <w:hyperlink w:history="1" r:id="rIddw7-f4dratbxzmz5ezuuk">
         <w:r>
           <w:rPr>
             <w:color w:val="B3272A"/>
@@ -1497,7 +1497,7 @@
         </w:rPr>
         <w:t xml:space="preserve">[</w:t>
       </w:r>
-      <w:hyperlink w:history="1" r:id="rIdrdndz2snlkeay_wjzufhw">
+      <w:hyperlink w:history="1" r:id="rIdguomlwusc5t4dmxstdfpx">
         <w:r>
           <w:rPr>
             <w:color w:val="B3272A"/>
@@ -1527,7 +1527,7 @@
         </w:rPr>
         <w:t xml:space="preserve">[</w:t>
       </w:r>
-      <w:hyperlink w:history="1" r:id="rId0j5gxwzmix6srwt0w1otd">
+      <w:hyperlink w:history="1" r:id="rIdsyluu9fikb5texb-ditvx">
         <w:r>
           <w:rPr>
             <w:color w:val="B3272A"/>
@@ -1578,7 +1578,7 @@
         </w:rPr>
         <w:t xml:space="preserve">[</w:t>
       </w:r>
-      <w:hyperlink w:history="1" r:id="rId--jpjgwo1dfoa7gggnfg-">
+      <w:hyperlink w:history="1" r:id="rIdvuhgla8abhzrtmkcaffgs">
         <w:r>
           <w:rPr>
             <w:color w:val="B3272A"/>
@@ -1597,7 +1597,7 @@
         </w:rPr>
         <w:t xml:space="preserve"> · </w:t>
       </w:r>
-      <w:hyperlink w:history="1" r:id="rIdubvklkn-4d6xsdsvn3hfv">
+      <w:hyperlink w:history="1" r:id="rIdtlss7mdmtqrhpgqgezrtk">
         <w:r>
           <w:rPr>
             <w:color w:val="B3272A"/>
@@ -1627,7 +1627,7 @@
         </w:rPr>
         <w:t xml:space="preserve">[</w:t>
       </w:r>
-      <w:hyperlink w:history="1" r:id="rIdju2tmqbceav11l_3l46dw">
+      <w:hyperlink w:history="1" r:id="rIdb3u668qwk8ubiermwvh9r">
         <w:r>
           <w:rPr>
             <w:color w:val="B3272A"/>
@@ -1657,7 +1657,7 @@
         </w:rPr>
         <w:t xml:space="preserve">[</w:t>
       </w:r>
-      <w:hyperlink w:history="1" r:id="rIde5lxidbxbweyb_usyzjhz">
+      <w:hyperlink w:history="1" r:id="rId-ovfosj6ufp7htnlklzok">
         <w:r>
           <w:rPr>
             <w:color w:val="B3272A"/>
@@ -1676,7 +1676,7 @@
         </w:rPr>
         <w:t xml:space="preserve"> · </w:t>
       </w:r>
-      <w:hyperlink w:history="1" r:id="rIdwz0anjbj_nlf2is1vlasj">
+      <w:hyperlink w:history="1" r:id="rIdifepu3wwz-fppivvrcpno">
         <w:r>
           <w:rPr>
             <w:color w:val="B3272A"/>
@@ -1719,7 +1719,7 @@
         </w:rPr>
         <w:t xml:space="preserve">[</w:t>
       </w:r>
-      <w:hyperlink w:history="1" r:id="rIdxyd25sk_xlaxyix94jc0f">
+      <w:hyperlink w:history="1" r:id="rIdzzmbgypjfc4lkdejtkgq8">
         <w:r>
           <w:rPr>
             <w:color w:val="B3272A"/>
@@ -1770,7 +1770,7 @@
         </w:rPr>
         <w:t xml:space="preserve">[</w:t>
       </w:r>
-      <w:hyperlink w:history="1" r:id="rIdh-n8eplkdrvdhwk4kxluv">
+      <w:hyperlink w:history="1" r:id="rIdhthdymxbydmmj5xleeeny">
         <w:r>
           <w:rPr>
             <w:color w:val="B3272A"/>
@@ -1789,7 +1789,7 @@
         </w:rPr>
         <w:t xml:space="preserve"> · </w:t>
       </w:r>
-      <w:hyperlink w:history="1" r:id="rIduvsndmplkec6y3qnmspk1">
+      <w:hyperlink w:history="1" r:id="rId9rogsze5ldws9mvshii6v">
         <w:r>
           <w:rPr>
             <w:color w:val="B3272A"/>
@@ -1808,7 +1808,7 @@
         </w:rPr>
         <w:t xml:space="preserve"> · </w:t>
       </w:r>
-      <w:hyperlink w:history="1" r:id="rIdepijhtrwfdbp40cjpobe0">
+      <w:hyperlink w:history="1" r:id="rId80aow4nbxvtg-n3904hgs">
         <w:r>
           <w:rPr>
             <w:color w:val="B3272A"/>
@@ -1828,17 +1828,17 @@
         <w:t xml:space="preserve">]</w:t>
       </w:r>
       <w:r>
-        <w:t xml:space="preserve">; his profile lists Oxford University for 2008 to 2012 </w:t>
-      </w:r>
-      <w:r>
-        <w:rPr>
-          <w:color w:val="B3272A"/>
-          <w:sz w:val="13"/>
-          <w:szCs w:val="13"/>
-        </w:rPr>
-        <w:t xml:space="preserve">[</w:t>
-      </w:r>
-      <w:hyperlink w:history="1" r:id="rId9daqlgr7inonrw6crugpm">
+        <w:t xml:space="preserve">; his profile dates the doctorate 2008 to 2012 </w:t>
+      </w:r>
+      <w:r>
+        <w:rPr>
+          <w:color w:val="B3272A"/>
+          <w:sz w:val="13"/>
+          <w:szCs w:val="13"/>
+        </w:rPr>
+        <w:t xml:space="preserve">[</w:t>
+      </w:r>
+      <w:hyperlink w:history="1" r:id="rIdffy3ippgkh0g3fapniyoe">
         <w:r>
           <w:rPr>
             <w:color w:val="B3272A"/>
@@ -1878,7 +1878,7 @@
         </w:rPr>
         <w:t xml:space="preserve">[</w:t>
       </w:r>
-      <w:hyperlink w:history="1" r:id="rId7osr2cprbjxzq9rlt9mt7">
+      <w:hyperlink w:history="1" r:id="rIdltc4ynanxsbxotja1sdvm">
         <w:r>
           <w:rPr>
             <w:color w:val="B3272A"/>
@@ -1921,7 +1921,7 @@
         </w:rPr>
         <w:t xml:space="preserve">[</w:t>
       </w:r>
-      <w:hyperlink w:history="1" r:id="rIdleytreyv5ifaohsbck5y_">
+      <w:hyperlink w:history="1" r:id="rIdkuw0jy4i3ssg1sibd1-xg">
         <w:r>
           <w:rPr>
             <w:color w:val="B3272A"/>
@@ -1940,7 +1940,7 @@
         </w:rPr>
         <w:t xml:space="preserve"> · </w:t>
       </w:r>
-      <w:hyperlink w:history="1" r:id="rIdfxlhv9dasyzy66bukijaj">
+      <w:hyperlink w:history="1" r:id="rIdgnud9wfst1ahf-paijz7n">
         <w:r>
           <w:rPr>
             <w:color w:val="B3272A"/>
@@ -1983,7 +1983,7 @@
         </w:rPr>
         <w:t xml:space="preserve">[</w:t>
       </w:r>
-      <w:hyperlink w:history="1" r:id="rIdjvpwneqnxczqw3q4cp7a6">
+      <w:hyperlink w:history="1" r:id="rIdjlyw9lqsadk1zujhvsusj">
         <w:r>
           <w:rPr>
             <w:color w:val="B3272A"/>
@@ -2013,7 +2013,7 @@
         </w:rPr>
         <w:t xml:space="preserve">[</w:t>
       </w:r>
-      <w:hyperlink w:history="1" r:id="rIdvdfdqaelib9sjh7a41v56">
+      <w:hyperlink w:history="1" r:id="rIdjrrn9j3yrxgqol9fisvrw">
         <w:r>
           <w:rPr>
             <w:color w:val="B3272A"/>
@@ -2043,7 +2043,7 @@
         </w:rPr>
         <w:t xml:space="preserve">[</w:t>
       </w:r>
-      <w:hyperlink w:history="1" r:id="rIdwe0ghu4bz1kcc6wsia3hz">
+      <w:hyperlink w:history="1" r:id="rId8fkkyoouahx5d00qwce96">
         <w:r>
           <w:rPr>
             <w:color w:val="B3272A"/>
@@ -2073,7 +2073,7 @@
         </w:rPr>
         <w:t xml:space="preserve">[</w:t>
       </w:r>
-      <w:hyperlink w:history="1" r:id="rId1aqpzeu2senhy8kqvs7pm">
+      <w:hyperlink w:history="1" r:id="rId_l2naoc7d3_k0jyt6wys9">
         <w:r>
           <w:rPr>
             <w:color w:val="B3272A"/>
@@ -2132,7 +2132,7 @@
         </w:rPr>
         <w:t xml:space="preserve">[</w:t>
       </w:r>
-      <w:hyperlink w:history="1" r:id="rIdqjxskoeauw_udb2bkcf5q">
+      <w:hyperlink w:history="1" r:id="rIdllax19lijcfytutdl3mb8">
         <w:r>
           <w:rPr>
             <w:color w:val="B3272A"/>
@@ -2162,7 +2162,7 @@
         </w:rPr>
         <w:t xml:space="preserve">[</w:t>
       </w:r>
-      <w:hyperlink w:history="1" r:id="rIdfe-ztp7ylz6maddsm-i5b">
+      <w:hyperlink w:history="1" r:id="rIdejfsgwav0azusc0haio6d">
         <w:r>
           <w:rPr>
             <w:color w:val="B3272A"/>
@@ -2192,7 +2192,7 @@
         </w:rPr>
         <w:t xml:space="preserve">[</w:t>
       </w:r>
-      <w:hyperlink w:history="1" r:id="rIdeinpt8qvrao_vxvpe53lj">
+      <w:hyperlink w:history="1" r:id="rIdnybdzksd_ownuqjavfiri">
         <w:r>
           <w:rPr>
             <w:color w:val="B3272A"/>
@@ -2235,7 +2235,7 @@
         </w:rPr>
         <w:t xml:space="preserve">[</w:t>
       </w:r>
-      <w:hyperlink w:history="1" r:id="rIdjlbyooafz6qpwrgb3wd3o">
+      <w:hyperlink w:history="1" r:id="rIdij4bbbveee6apyvosjai4">
         <w:r>
           <w:rPr>
             <w:color w:val="B3272A"/>
@@ -2265,7 +2265,7 @@
         </w:rPr>
         <w:t xml:space="preserve">[</w:t>
       </w:r>
-      <w:hyperlink w:history="1" r:id="rIdwk4wa2razf1kb8qttioww">
+      <w:hyperlink w:history="1" r:id="rIdqgtfg5qtki8a571tee0ae">
         <w:r>
           <w:rPr>
             <w:color w:val="B3272A"/>
@@ -2308,7 +2308,7 @@
         </w:rPr>
         <w:t xml:space="preserve">[</w:t>
       </w:r>
-      <w:hyperlink w:history="1" r:id="rIdswpvus3yrms_rfu79hynu">
+      <w:hyperlink w:history="1" r:id="rIdcnd0q3jde_ttvgggi7oj_">
         <w:r>
           <w:rPr>
             <w:color w:val="B3272A"/>
@@ -2338,7 +2338,7 @@
         </w:rPr>
         <w:t xml:space="preserve">[</w:t>
       </w:r>
-      <w:hyperlink w:history="1" r:id="rIdgfpw8vh9e1xd5haob_ldl">
+      <w:hyperlink w:history="1" r:id="rIdpx3pjam5yldz3zrlrterf">
         <w:r>
           <w:rPr>
             <w:color w:val="B3272A"/>
@@ -2357,7 +2357,7 @@
         </w:rPr>
         <w:t xml:space="preserve"> · </w:t>
       </w:r>
-      <w:hyperlink w:history="1" r:id="rIdf93jxfcwmj48oa5cbdnur">
+      <w:hyperlink w:history="1" r:id="rIde4c28vwewwoxuciwc2dzo">
         <w:r>
           <w:rPr>
             <w:color w:val="B3272A"/>
@@ -2405,7 +2405,7 @@
         </w:rPr>
         <w:t xml:space="preserve">[</w:t>
       </w:r>
-      <w:hyperlink w:history="1" r:id="rIdhr8ykeh1ewg3nnwueyqti">
+      <w:hyperlink w:history="1" r:id="rIds4dgk9ltvilapotum43ha">
         <w:r>
           <w:rPr>
             <w:color w:val="B3272A"/>
@@ -2435,7 +2435,7 @@
         </w:rPr>
         <w:t xml:space="preserve">[</w:t>
       </w:r>
-      <w:hyperlink w:history="1" r:id="rId3-qly-22gcfsyfimdqcqv">
+      <w:hyperlink w:history="1" r:id="rId4jdpub8t3uzbio7s6apmx">
         <w:r>
           <w:rPr>
             <w:color w:val="B3272A"/>
@@ -2478,7 +2478,7 @@
         </w:rPr>
         <w:t xml:space="preserve">[</w:t>
       </w:r>
-      <w:hyperlink w:history="1" r:id="rId_xcmcyyxot_23gayxxgvf">
+      <w:hyperlink w:history="1" r:id="rId8z4s0pwy1t51ok_nkxede">
         <w:r>
           <w:rPr>
             <w:color w:val="B3272A"/>
@@ -2508,7 +2508,7 @@
         </w:rPr>
         <w:t xml:space="preserve">[</w:t>
       </w:r>
-      <w:hyperlink w:history="1" r:id="rIdx7afic2wnhwkw15aycwtu">
+      <w:hyperlink w:history="1" r:id="rIdzi0jsjeednufp9nip13_a">
         <w:r>
           <w:rPr>
             <w:color w:val="B3272A"/>
@@ -2538,7 +2538,7 @@
         </w:rPr>
         <w:t xml:space="preserve">[</w:t>
       </w:r>
-      <w:hyperlink w:history="1" r:id="rIdmlekol3vsbwp5ngfysw0l">
+      <w:hyperlink w:history="1" r:id="rIdzowegeekrdqouiywgsanj">
         <w:r>
           <w:rPr>
             <w:color w:val="B3272A"/>
@@ -2589,7 +2589,7 @@
         </w:rPr>
         <w:t xml:space="preserve">[</w:t>
       </w:r>
-      <w:hyperlink w:history="1" r:id="rIdsvtphrmo-v_zshhb3kmsv">
+      <w:hyperlink w:history="1" r:id="rIdiy65occ29hdkj7xby0546">
         <w:r>
           <w:rPr>
             <w:color w:val="B3272A"/>
@@ -2619,7 +2619,7 @@
         </w:rPr>
         <w:t xml:space="preserve">[</w:t>
       </w:r>
-      <w:hyperlink w:history="1" r:id="rIdlmt2hyizjcmxdb_sypqm9">
+      <w:hyperlink w:history="1" r:id="rIdkas9iv_xtqss3gesilvp0">
         <w:r>
           <w:rPr>
             <w:color w:val="B3272A"/>
@@ -2638,7 +2638,7 @@
         </w:rPr>
         <w:t xml:space="preserve"> · </w:t>
       </w:r>
-      <w:hyperlink w:history="1" r:id="rId9qftqwdsabcepr4qx12pw">
+      <w:hyperlink w:history="1" r:id="rId46ksxw3yrtjchtqaryj6-">
         <w:r>
           <w:rPr>
             <w:color w:val="B3272A"/>
@@ -2681,7 +2681,7 @@
         </w:rPr>
         <w:t xml:space="preserve">[</w:t>
       </w:r>
-      <w:hyperlink w:history="1" r:id="rIdee1lxewelfwjtlbuduacj">
+      <w:hyperlink w:history="1" r:id="rId15cubeckq5jjfyhvgoo7t">
         <w:r>
           <w:rPr>
             <w:color w:val="B3272A"/>
@@ -2711,7 +2711,7 @@
         </w:rPr>
         <w:t xml:space="preserve">[</w:t>
       </w:r>
-      <w:hyperlink w:history="1" r:id="rId5rpyvjkikto3jr8rj-wux">
+      <w:hyperlink w:history="1" r:id="rIdqgpiz18atopzl9kwbnh9y">
         <w:r>
           <w:rPr>
             <w:color w:val="B3272A"/>
@@ -2754,7 +2754,7 @@
         </w:rPr>
         <w:t xml:space="preserve">[</w:t>
       </w:r>
-      <w:hyperlink w:history="1" r:id="rIdyoltipxkavr_1pbdaky_f">
+      <w:hyperlink w:history="1" r:id="rId7smjmnwga33asjh_k544c">
         <w:r>
           <w:rPr>
             <w:color w:val="B3272A"/>
@@ -2784,7 +2784,7 @@
         </w:rPr>
         <w:t xml:space="preserve">[</w:t>
       </w:r>
-      <w:hyperlink w:history="1" r:id="rIdvuyu5eyd3xj7jvrogizfn">
+      <w:hyperlink w:history="1" r:id="rId4ngxopk5vnwjvvcbo2j5-">
         <w:r>
           <w:rPr>
             <w:color w:val="B3272A"/>
@@ -2827,7 +2827,7 @@
         </w:rPr>
         <w:t xml:space="preserve">[</w:t>
       </w:r>
-      <w:hyperlink w:history="1" r:id="rIdlhyhcjul9pmnlvfwolvqr">
+      <w:hyperlink w:history="1" r:id="rIdiulmdtjnh6bgpgg-_tddv">
         <w:r>
           <w:rPr>
             <w:color w:val="B3272A"/>
@@ -2857,7 +2857,7 @@
         </w:rPr>
         <w:t xml:space="preserve">[</w:t>
       </w:r>
-      <w:hyperlink w:history="1" r:id="rIdlirqnavkhbl1jtmw4cbtr">
+      <w:hyperlink w:history="1" r:id="rIdcspfxnqibnsg4dmcv5ars">
         <w:r>
           <w:rPr>
             <w:color w:val="B3272A"/>
@@ -2933,7 +2933,7 @@
         </w:rPr>
         <w:t xml:space="preserve">[</w:t>
       </w:r>
-      <w:hyperlink w:history="1" r:id="rId-bd_i7bx95ij1ouxftwa1">
+      <w:hyperlink w:history="1" r:id="rIddqqccgded_wxgdlxo3r3e">
         <w:r>
           <w:rPr>
             <w:color w:val="B3272A"/>
@@ -2963,7 +2963,7 @@
         </w:rPr>
         <w:t xml:space="preserve">[</w:t>
       </w:r>
-      <w:hyperlink w:history="1" r:id="rId6yadxwruccohag3ybgm_x">
+      <w:hyperlink w:history="1" r:id="rIdg3wrrlj-jt7ljpje1x6_e">
         <w:r>
           <w:rPr>
             <w:color w:val="B3272A"/>
@@ -2993,7 +2993,7 @@
         </w:rPr>
         <w:t xml:space="preserve">[</w:t>
       </w:r>
-      <w:hyperlink w:history="1" r:id="rIdkpztzecvmuhf_8y0h7uj0">
+      <w:hyperlink w:history="1" r:id="rIdan1mjnnsm7lsr_cdk2tna">
         <w:r>
           <w:rPr>
             <w:color w:val="B3272A"/>
@@ -3023,7 +3023,7 @@
         </w:rPr>
         <w:t xml:space="preserve">[</w:t>
       </w:r>
-      <w:hyperlink w:history="1" r:id="rIddxq1jingczsv3mnnnuos8">
+      <w:hyperlink w:history="1" r:id="rIdwzmbjrg2obola8k_nltja">
         <w:r>
           <w:rPr>
             <w:color w:val="B3272A"/>
@@ -3103,7 +3103,7 @@
         </w:rPr>
         <w:t xml:space="preserve">[</w:t>
       </w:r>
-      <w:hyperlink w:history="1" r:id="rIdtls266f_ycnjypk3upfsy">
+      <w:hyperlink w:history="1" r:id="rIdrk5lmn_xotta8hvhjjwvg">
         <w:r>
           <w:rPr>
             <w:color w:val="B3272A"/>
@@ -3133,7 +3133,7 @@
         </w:rPr>
         <w:t xml:space="preserve">[</w:t>
       </w:r>
-      <w:hyperlink w:history="1" r:id="rIdsitlm3ibtac7tvrzc7uoj">
+      <w:hyperlink w:history="1" r:id="rIdpvgsiqvh0wrhwcqtv06ye">
         <w:r>
           <w:rPr>
             <w:color w:val="B3272A"/>
@@ -3163,7 +3163,7 @@
         </w:rPr>
         <w:t xml:space="preserve">[</w:t>
       </w:r>
-      <w:hyperlink w:history="1" r:id="rIdct5zf1pxz234duy_ldgow">
+      <w:hyperlink w:history="1" r:id="rIdb_tbmkrx9t82wap9iyyki">
         <w:r>
           <w:rPr>
             <w:color w:val="B3272A"/>
@@ -3243,7 +3243,7 @@
         </w:rPr>
         <w:t xml:space="preserve">[</w:t>
       </w:r>
-      <w:hyperlink w:history="1" r:id="rId6utya4vzkbleleuhlkafu">
+      <w:hyperlink w:history="1" r:id="rId4zgl1naqx5y5zj3fghgw5">
         <w:r>
           <w:rPr>
             <w:color w:val="B3272A"/>
@@ -3273,7 +3273,7 @@
         </w:rPr>
         <w:t xml:space="preserve">[</w:t>
       </w:r>
-      <w:hyperlink w:history="1" r:id="rId2aungr_o8l3caojwndnhl">
+      <w:hyperlink w:history="1" r:id="rIdve-r0h7bwci0qpswx7enq">
         <w:r>
           <w:rPr>
             <w:color w:val="B3272A"/>
@@ -3303,7 +3303,7 @@
         </w:rPr>
         <w:t xml:space="preserve">[</w:t>
       </w:r>
-      <w:hyperlink w:history="1" r:id="rIdpnkzfmwi6tp7vvozp9jbp">
+      <w:hyperlink w:history="1" r:id="rIdohcgkktvfpfadlezwbu-9">
         <w:r>
           <w:rPr>
             <w:color w:val="B3272A"/>
@@ -3383,7 +3383,7 @@
         </w:rPr>
         <w:t xml:space="preserve">[</w:t>
       </w:r>
-      <w:hyperlink w:history="1" r:id="rId5hmj8-bxvliqnw82bdsam">
+      <w:hyperlink w:history="1" r:id="rIdewyvmawb2z0n9awjeenoa">
         <w:r>
           <w:rPr>
             <w:color w:val="B3272A"/>
@@ -3402,7 +3402,7 @@
         </w:rPr>
         <w:t xml:space="preserve"> · </w:t>
       </w:r>
-      <w:hyperlink w:history="1" r:id="rId-crxfm6ktv8gm6s5fsi-_">
+      <w:hyperlink w:history="1" r:id="rIdi_hpwnigsunf1do3ep1j-">
         <w:r>
           <w:rPr>
             <w:color w:val="B3272A"/>
@@ -3432,7 +3432,7 @@
         </w:rPr>
         <w:t xml:space="preserve">[</w:t>
       </w:r>
-      <w:hyperlink w:history="1" r:id="rIdjeaz6hzw3uhdwwwk7xtxb">
+      <w:hyperlink w:history="1" r:id="rId17djhzkbfpsl0spktn3lr">
         <w:r>
           <w:rPr>
             <w:color w:val="B3272A"/>
@@ -3512,7 +3512,7 @@
         </w:rPr>
         <w:t xml:space="preserve">[</w:t>
       </w:r>
-      <w:hyperlink w:history="1" r:id="rIdlgoxhdnn0dtnns1lllqyw">
+      <w:hyperlink w:history="1" r:id="rIdk7w79vqtq2kcsae2wnjak">
         <w:r>
           <w:rPr>
             <w:color w:val="B3272A"/>
@@ -3542,7 +3542,7 @@
         </w:rPr>
         <w:t xml:space="preserve">[</w:t>
       </w:r>
-      <w:hyperlink w:history="1" r:id="rIdthszooqp0cmnww7flttsq">
+      <w:hyperlink w:history="1" r:id="rIdwjsj3k7lyxeblvvhf9vcp">
         <w:r>
           <w:rPr>
             <w:color w:val="B3272A"/>
@@ -3599,7 +3599,7 @@
         </w:rPr>
         <w:t xml:space="preserve">[</w:t>
       </w:r>
-      <w:hyperlink w:history="1" r:id="rIdjwof1h8anhhtqsqybnv6h">
+      <w:hyperlink w:history="1" r:id="rIdqcyvfyitckphonpjhtz06">
         <w:r>
           <w:rPr>
             <w:color w:val="B3272A"/>

</xml_diff>